<commit_message>
Remove SK 별첨1 (충전요금) appendix page
Delete the [별첨1. SK일렉링크 충전요금] heading + rate table + NOTE and the
trailing spacer paragraphs that positioned it, so no blank page is left.
SK now renders 6 pages (계약서 → 별지5호 → 직인동의서 → 개인정보 → 별지7호).
Inline [별첨1] reference in the contract body is kept. Verified: valid docx,
별지5호/7호 span-consistent, SDT/BAS/계약기간 anchors intact.

Co-Authored-By: Claude Opus 4.8 (1M context) <noreply@anthropic.com>
</commit_message>
<xml_diff>
--- a/public/sk/template.docx
+++ b/public/sk/template.docx
@@ -3707,1602 +3707,6 @@
         </w:tc>
       </w:tr>
     </w:tbl>
-    <w:p>
-      <w:pPr>
-        <w:widowControl/>
-        <w:wordWrap/>
-        <w:autoSpaceDE/>
-        <w:autoSpaceDN/>
-        <w:spacing w:after="0"/>
-        <w:rPr>
-          <w:rFonts w:ascii="맑은 고딕" w:eastAsia="맑은 고딕" w:hAnsi="맑은 고딕" w:cs="굴림"/>
-          <w:color w:val="000000"/>
-          <w:kern w:val="0"/>
-          <w:szCs w:val="22"/>
-          <w14:ligatures w14:val="none"/>
-        </w:rPr>
-      </w:pPr>
-      <w:r>
-        <w:rPr>
-          <w:rFonts w:ascii="맑은 고딕" w:eastAsia="맑은 고딕" w:hAnsi="맑은 고딕" w:cs="굴림" w:hint="eastAsia"/>
-          <w:color w:val="000000"/>
-          <w:kern w:val="0"/>
-          <w:szCs w:val="22"/>
-          <w14:ligatures w14:val="none"/>
-        </w:rPr>
-        <w:t> </w:t>
-      </w:r>
-    </w:p>
-    <w:p>
-      <w:pPr>
-        <w:widowControl/>
-        <w:wordWrap/>
-        <w:autoSpaceDE/>
-        <w:autoSpaceDN/>
-        <w:spacing w:after="0"/>
-        <w:rPr>
-          <w:rFonts w:ascii="맑은 고딕" w:eastAsia="맑은 고딕" w:hAnsi="맑은 고딕" w:cs="굴림"/>
-          <w:color w:val="000000"/>
-          <w:kern w:val="0"/>
-          <w:szCs w:val="22"/>
-          <w14:ligatures w14:val="none"/>
-        </w:rPr>
-      </w:pPr>
-      <w:r>
-        <w:rPr>
-          <w:rFonts w:ascii="맑은 고딕" w:eastAsia="맑은 고딕" w:hAnsi="맑은 고딕" w:cs="굴림" w:hint="eastAsia"/>
-          <w:color w:val="000000"/>
-          <w:kern w:val="0"/>
-          <w:szCs w:val="22"/>
-          <w14:ligatures w14:val="none"/>
-        </w:rPr>
-        <w:t> </w:t>
-      </w:r>
-    </w:p>
-    <w:p>
-      <w:pPr>
-        <w:widowControl/>
-        <w:wordWrap/>
-        <w:autoSpaceDE/>
-        <w:autoSpaceDN/>
-        <w:spacing w:after="0"/>
-        <w:rPr>
-          <w:rFonts w:ascii="맑은 고딕" w:eastAsia="맑은 고딕" w:hAnsi="맑은 고딕" w:cs="굴림"/>
-          <w:color w:val="000000"/>
-          <w:kern w:val="0"/>
-          <w:szCs w:val="22"/>
-          <w14:ligatures w14:val="none"/>
-        </w:rPr>
-      </w:pPr>
-      <w:r>
-        <w:rPr>
-          <w:rFonts w:ascii="맑은 고딕" w:eastAsia="맑은 고딕" w:hAnsi="맑은 고딕" w:cs="굴림" w:hint="eastAsia"/>
-          <w:color w:val="000000"/>
-          <w:kern w:val="0"/>
-          <w:szCs w:val="22"/>
-          <w14:ligatures w14:val="none"/>
-        </w:rPr>
-        <w:t> </w:t>
-      </w:r>
-    </w:p>
-    <w:p>
-      <w:pPr>
-        <w:widowControl/>
-        <w:wordWrap/>
-        <w:autoSpaceDE/>
-        <w:autoSpaceDN/>
-        <w:spacing w:after="0"/>
-        <w:rPr>
-          <w:rFonts w:ascii="맑은 고딕" w:eastAsia="맑은 고딕" w:hAnsi="맑은 고딕" w:cs="굴림"/>
-          <w:color w:val="000000"/>
-          <w:kern w:val="0"/>
-          <w:szCs w:val="22"/>
-          <w14:ligatures w14:val="none"/>
-        </w:rPr>
-      </w:pPr>
-      <w:r>
-        <w:rPr>
-          <w:rFonts w:ascii="맑은 고딕" w:eastAsia="맑은 고딕" w:hAnsi="맑은 고딕" w:cs="굴림" w:hint="eastAsia"/>
-          <w:color w:val="000000"/>
-          <w:kern w:val="0"/>
-          <w:szCs w:val="22"/>
-          <w14:ligatures w14:val="none"/>
-        </w:rPr>
-        <w:t> </w:t>
-      </w:r>
-    </w:p>
-    <w:p>
-      <w:pPr>
-        <w:widowControl/>
-        <w:wordWrap/>
-        <w:autoSpaceDE/>
-        <w:autoSpaceDN/>
-        <w:spacing w:after="0"/>
-        <w:rPr>
-          <w:rFonts w:ascii="맑은 고딕" w:eastAsia="맑은 고딕" w:hAnsi="맑은 고딕" w:cs="굴림"/>
-          <w:color w:val="000000"/>
-          <w:kern w:val="0"/>
-          <w:szCs w:val="22"/>
-          <w14:ligatures w14:val="none"/>
-        </w:rPr>
-      </w:pPr>
-      <w:r>
-        <w:rPr>
-          <w:rFonts w:ascii="맑은 고딕" w:eastAsia="맑은 고딕" w:hAnsi="맑은 고딕" w:cs="굴림" w:hint="eastAsia"/>
-          <w:color w:val="000000"/>
-          <w:kern w:val="0"/>
-          <w:szCs w:val="22"/>
-          <w14:ligatures w14:val="none"/>
-        </w:rPr>
-        <w:t> </w:t>
-      </w:r>
-    </w:p>
-    <w:p>
-      <w:pPr>
-        <w:widowControl/>
-        <w:wordWrap/>
-        <w:autoSpaceDE/>
-        <w:autoSpaceDN/>
-        <w:spacing w:after="0"/>
-        <w:rPr>
-          <w:rFonts w:ascii="맑은 고딕" w:eastAsia="맑은 고딕" w:hAnsi="맑은 고딕" w:cs="굴림"/>
-          <w:color w:val="000000"/>
-          <w:kern w:val="0"/>
-          <w:szCs w:val="22"/>
-          <w14:ligatures w14:val="none"/>
-        </w:rPr>
-      </w:pPr>
-      <w:r>
-        <w:rPr>
-          <w:rFonts w:ascii="맑은 고딕" w:eastAsia="맑은 고딕" w:hAnsi="맑은 고딕" w:cs="굴림" w:hint="eastAsia"/>
-          <w:color w:val="000000"/>
-          <w:kern w:val="0"/>
-          <w:szCs w:val="22"/>
-          <w14:ligatures w14:val="none"/>
-        </w:rPr>
-        <w:t> </w:t>
-      </w:r>
-    </w:p>
-    <w:p>
-      <w:pPr>
-        <w:widowControl/>
-        <w:wordWrap/>
-        <w:autoSpaceDE/>
-        <w:autoSpaceDN/>
-        <w:spacing w:after="0"/>
-        <w:rPr>
-          <w:rFonts w:ascii="맑은 고딕" w:eastAsia="맑은 고딕" w:hAnsi="맑은 고딕" w:cs="굴림"/>
-          <w:color w:val="000000"/>
-          <w:kern w:val="0"/>
-          <w:szCs w:val="22"/>
-          <w14:ligatures w14:val="none"/>
-        </w:rPr>
-      </w:pPr>
-      <w:r>
-        <w:rPr>
-          <w:rFonts w:ascii="맑은 고딕" w:eastAsia="맑은 고딕" w:hAnsi="맑은 고딕" w:cs="굴림" w:hint="eastAsia"/>
-          <w:color w:val="000000"/>
-          <w:kern w:val="0"/>
-          <w:szCs w:val="22"/>
-          <w14:ligatures w14:val="none"/>
-        </w:rPr>
-        <w:t> </w:t>
-      </w:r>
-    </w:p>
-    <w:p>
-      <w:pPr>
-        <w:widowControl/>
-        <w:wordWrap/>
-        <w:autoSpaceDE/>
-        <w:autoSpaceDN/>
-        <w:spacing w:after="0"/>
-        <w:rPr>
-          <w:rFonts w:ascii="맑은 고딕" w:eastAsia="맑은 고딕" w:hAnsi="맑은 고딕" w:cs="굴림"/>
-          <w:color w:val="000000"/>
-          <w:kern w:val="0"/>
-          <w:szCs w:val="22"/>
-          <w14:ligatures w14:val="none"/>
-        </w:rPr>
-      </w:pPr>
-      <w:r>
-        <w:rPr>
-          <w:rFonts w:ascii="맑은 고딕" w:eastAsia="맑은 고딕" w:hAnsi="맑은 고딕" w:cs="굴림" w:hint="eastAsia"/>
-          <w:color w:val="000000"/>
-          <w:kern w:val="0"/>
-          <w:szCs w:val="22"/>
-          <w14:ligatures w14:val="none"/>
-        </w:rPr>
-        <w:t> </w:t>
-      </w:r>
-    </w:p>
-    <w:p>
-      <w:pPr>
-        <w:widowControl/>
-        <w:wordWrap/>
-        <w:autoSpaceDE/>
-        <w:autoSpaceDN/>
-        <w:spacing w:after="0"/>
-        <w:rPr>
-          <w:rFonts w:ascii="맑은 고딕" w:eastAsia="맑은 고딕" w:hAnsi="맑은 고딕" w:cs="굴림"/>
-          <w:color w:val="000000"/>
-          <w:kern w:val="0"/>
-          <w:szCs w:val="22"/>
-          <w14:ligatures w14:val="none"/>
-        </w:rPr>
-      </w:pPr>
-      <w:r>
-        <w:rPr>
-          <w:rFonts w:ascii="맑은 고딕" w:eastAsia="맑은 고딕" w:hAnsi="맑은 고딕" w:cs="굴림" w:hint="eastAsia"/>
-          <w:color w:val="000000"/>
-          <w:kern w:val="0"/>
-          <w:szCs w:val="22"/>
-          <w14:ligatures w14:val="none"/>
-        </w:rPr>
-        <w:t> </w:t>
-      </w:r>
-    </w:p>
-    <w:p>
-      <w:pPr>
-        <w:widowControl/>
-        <w:wordWrap/>
-        <w:autoSpaceDE/>
-        <w:autoSpaceDN/>
-        <w:spacing w:after="0"/>
-        <w:rPr>
-          <w:rFonts w:ascii="맑은 고딕" w:eastAsia="맑은 고딕" w:hAnsi="맑은 고딕" w:cs="굴림"/>
-          <w:color w:val="000000"/>
-          <w:kern w:val="0"/>
-          <w:szCs w:val="22"/>
-          <w14:ligatures w14:val="none"/>
-        </w:rPr>
-      </w:pPr>
-      <w:r>
-        <w:rPr>
-          <w:rFonts w:ascii="맑은 고딕" w:eastAsia="맑은 고딕" w:hAnsi="맑은 고딕" w:cs="굴림" w:hint="eastAsia"/>
-          <w:color w:val="000000"/>
-          <w:kern w:val="0"/>
-          <w:szCs w:val="22"/>
-          <w14:ligatures w14:val="none"/>
-        </w:rPr>
-        <w:t> </w:t>
-      </w:r>
-    </w:p>
-    <w:p>
-      <w:pPr>
-        <w:widowControl/>
-        <w:wordWrap/>
-        <w:autoSpaceDE/>
-        <w:autoSpaceDN/>
-        <w:spacing w:after="0"/>
-        <w:rPr>
-          <w:rFonts w:ascii="맑은 고딕" w:eastAsia="맑은 고딕" w:hAnsi="맑은 고딕" w:cs="굴림"/>
-          <w:color w:val="000000"/>
-          <w:kern w:val="0"/>
-          <w:szCs w:val="22"/>
-          <w14:ligatures w14:val="none"/>
-        </w:rPr>
-      </w:pPr>
-      <w:r>
-        <w:rPr>
-          <w:rFonts w:ascii="맑은 고딕" w:eastAsia="맑은 고딕" w:hAnsi="맑은 고딕" w:cs="굴림" w:hint="eastAsia"/>
-          <w:color w:val="000000"/>
-          <w:kern w:val="0"/>
-          <w:szCs w:val="22"/>
-          <w14:ligatures w14:val="none"/>
-        </w:rPr>
-        <w:t> </w:t>
-      </w:r>
-    </w:p>
-    <w:p>
-      <w:pPr>
-        <w:widowControl/>
-        <w:wordWrap/>
-        <w:autoSpaceDE/>
-        <w:autoSpaceDN/>
-        <w:spacing w:after="0"/>
-        <w:rPr>
-          <w:rFonts w:ascii="맑은 고딕" w:eastAsia="맑은 고딕" w:hAnsi="맑은 고딕" w:cs="굴림"/>
-          <w:color w:val="000000"/>
-          <w:kern w:val="0"/>
-          <w:szCs w:val="22"/>
-          <w14:ligatures w14:val="none"/>
-        </w:rPr>
-      </w:pPr>
-      <w:r>
-        <w:rPr>
-          <w:rFonts w:ascii="맑은 고딕" w:eastAsia="맑은 고딕" w:hAnsi="맑은 고딕" w:cs="굴림" w:hint="eastAsia"/>
-          <w:color w:val="000000"/>
-          <w:kern w:val="0"/>
-          <w:szCs w:val="22"/>
-          <w14:ligatures w14:val="none"/>
-        </w:rPr>
-        <w:t> </w:t>
-      </w:r>
-    </w:p>
-    <w:p>
-      <w:pPr>
-        <w:widowControl/>
-        <w:wordWrap/>
-        <w:autoSpaceDE/>
-        <w:autoSpaceDN/>
-        <w:spacing w:after="0"/>
-        <w:rPr>
-          <w:rFonts w:ascii="맑은 고딕" w:eastAsia="맑은 고딕" w:hAnsi="맑은 고딕" w:cs="굴림"/>
-          <w:color w:val="000000"/>
-          <w:kern w:val="0"/>
-          <w:szCs w:val="22"/>
-          <w14:ligatures w14:val="none"/>
-        </w:rPr>
-      </w:pPr>
-      <w:r>
-        <w:rPr>
-          <w:rFonts w:ascii="맑은 고딕" w:eastAsia="맑은 고딕" w:hAnsi="맑은 고딕" w:cs="굴림" w:hint="eastAsia"/>
-          <w:color w:val="000000"/>
-          <w:kern w:val="0"/>
-          <w:szCs w:val="22"/>
-          <w14:ligatures w14:val="none"/>
-        </w:rPr>
-        <w:t> </w:t>
-      </w:r>
-    </w:p>
-    <w:p>
-      <w:pPr>
-        <w:widowControl/>
-        <w:wordWrap/>
-        <w:autoSpaceDE/>
-        <w:autoSpaceDN/>
-        <w:spacing w:after="0"/>
-        <w:rPr>
-          <w:rFonts w:ascii="맑은 고딕" w:eastAsia="맑은 고딕" w:hAnsi="맑은 고딕" w:cs="굴림"/>
-          <w:color w:val="000000"/>
-          <w:kern w:val="0"/>
-          <w:szCs w:val="22"/>
-          <w14:ligatures w14:val="none"/>
-        </w:rPr>
-      </w:pPr>
-      <w:r>
-        <w:rPr>
-          <w:rFonts w:ascii="맑은 고딕" w:eastAsia="맑은 고딕" w:hAnsi="맑은 고딕" w:cs="굴림" w:hint="eastAsia"/>
-          <w:color w:val="000000"/>
-          <w:kern w:val="0"/>
-          <w:szCs w:val="22"/>
-          <w14:ligatures w14:val="none"/>
-        </w:rPr>
-        <w:t> </w:t>
-      </w:r>
-    </w:p>
-    <w:p>
-      <w:pPr>
-        <w:widowControl/>
-        <w:wordWrap/>
-        <w:autoSpaceDE/>
-        <w:autoSpaceDN/>
-        <w:spacing w:after="0"/>
-        <w:rPr>
-          <w:rFonts w:ascii="맑은 고딕" w:eastAsia="맑은 고딕" w:hAnsi="맑은 고딕" w:cs="굴림"/>
-          <w:color w:val="000000"/>
-          <w:kern w:val="0"/>
-          <w:szCs w:val="22"/>
-          <w14:ligatures w14:val="none"/>
-        </w:rPr>
-      </w:pPr>
-      <w:r>
-        <w:rPr>
-          <w:rFonts w:ascii="맑은 고딕" w:eastAsia="맑은 고딕" w:hAnsi="맑은 고딕" w:cs="굴림" w:hint="eastAsia"/>
-          <w:color w:val="000000"/>
-          <w:kern w:val="0"/>
-          <w:szCs w:val="22"/>
-          <w14:ligatures w14:val="none"/>
-        </w:rPr>
-        <w:t> </w:t>
-      </w:r>
-    </w:p>
-    <w:p>
-      <w:pPr>
-        <w:widowControl/>
-        <w:wordWrap/>
-        <w:autoSpaceDE/>
-        <w:autoSpaceDN/>
-        <w:spacing w:after="0"/>
-        <w:rPr>
-          <w:rFonts w:ascii="맑은 고딕" w:eastAsia="맑은 고딕" w:hAnsi="맑은 고딕" w:cs="굴림"/>
-          <w:color w:val="000000"/>
-          <w:kern w:val="0"/>
-          <w:szCs w:val="22"/>
-          <w14:ligatures w14:val="none"/>
-        </w:rPr>
-      </w:pPr>
-      <w:r>
-        <w:rPr>
-          <w:rFonts w:ascii="맑은 고딕" w:eastAsia="맑은 고딕" w:hAnsi="맑은 고딕" w:cs="굴림" w:hint="eastAsia"/>
-          <w:color w:val="000000"/>
-          <w:kern w:val="0"/>
-          <w:szCs w:val="22"/>
-          <w14:ligatures w14:val="none"/>
-        </w:rPr>
-        <w:t> </w:t>
-      </w:r>
-    </w:p>
-    <w:p>
-      <w:pPr>
-        <w:widowControl/>
-        <w:wordWrap/>
-        <w:autoSpaceDE/>
-        <w:autoSpaceDN/>
-        <w:spacing w:after="0"/>
-        <w:rPr>
-          <w:rFonts w:ascii="맑은 고딕" w:eastAsia="맑은 고딕" w:hAnsi="맑은 고딕" w:cs="굴림"/>
-          <w:color w:val="000000"/>
-          <w:kern w:val="0"/>
-          <w:szCs w:val="22"/>
-          <w14:ligatures w14:val="none"/>
-        </w:rPr>
-      </w:pPr>
-      <w:r>
-        <w:rPr>
-          <w:rFonts w:ascii="맑은 고딕" w:eastAsia="맑은 고딕" w:hAnsi="맑은 고딕" w:cs="굴림" w:hint="eastAsia"/>
-          <w:color w:val="000000"/>
-          <w:kern w:val="0"/>
-          <w:szCs w:val="22"/>
-          <w14:ligatures w14:val="none"/>
-        </w:rPr>
-        <w:t> </w:t>
-      </w:r>
-    </w:p>
-    <w:p>
-      <w:pPr>
-        <w:widowControl/>
-        <w:wordWrap/>
-        <w:autoSpaceDE/>
-        <w:autoSpaceDN/>
-        <w:spacing w:after="0"/>
-        <w:rPr>
-          <w:rFonts w:ascii="맑은 고딕" w:eastAsia="맑은 고딕" w:hAnsi="맑은 고딕" w:cs="굴림"/>
-          <w:color w:val="000000"/>
-          <w:kern w:val="0"/>
-          <w:szCs w:val="22"/>
-          <w14:ligatures w14:val="none"/>
-        </w:rPr>
-      </w:pPr>
-      <w:r>
-        <w:rPr>
-          <w:rFonts w:ascii="맑은 고딕" w:eastAsia="맑은 고딕" w:hAnsi="맑은 고딕" w:cs="굴림" w:hint="eastAsia"/>
-          <w:color w:val="000000"/>
-          <w:kern w:val="0"/>
-          <w:szCs w:val="22"/>
-          <w14:ligatures w14:val="none"/>
-        </w:rPr>
-        <w:t> </w:t>
-      </w:r>
-    </w:p>
-    <w:p>
-      <w:pPr>
-        <w:widowControl/>
-        <w:wordWrap/>
-        <w:autoSpaceDE/>
-        <w:autoSpaceDN/>
-        <w:spacing w:after="0"/>
-        <w:rPr>
-          <w:rFonts w:ascii="맑은 고딕" w:eastAsia="맑은 고딕" w:hAnsi="맑은 고딕" w:cs="굴림"/>
-          <w:color w:val="000000"/>
-          <w:kern w:val="0"/>
-          <w:szCs w:val="22"/>
-          <w14:ligatures w14:val="none"/>
-        </w:rPr>
-      </w:pPr>
-      <w:r>
-        <w:rPr>
-          <w:rFonts w:ascii="맑은 고딕" w:eastAsia="맑은 고딕" w:hAnsi="맑은 고딕" w:cs="굴림" w:hint="eastAsia"/>
-          <w:color w:val="000000"/>
-          <w:kern w:val="0"/>
-          <w:szCs w:val="22"/>
-          <w14:ligatures w14:val="none"/>
-        </w:rPr>
-        <w:t> </w:t>
-      </w:r>
-    </w:p>
-    <w:p>
-      <w:pPr>
-        <w:widowControl/>
-        <w:wordWrap/>
-        <w:autoSpaceDE/>
-        <w:autoSpaceDN/>
-        <w:spacing w:after="0"/>
-        <w:rPr>
-          <w:rFonts w:ascii="맑은 고딕" w:eastAsia="맑은 고딕" w:hAnsi="맑은 고딕" w:cs="굴림"/>
-          <w:color w:val="000000"/>
-          <w:kern w:val="0"/>
-          <w:szCs w:val="22"/>
-          <w14:ligatures w14:val="none"/>
-        </w:rPr>
-      </w:pPr>
-      <w:r>
-        <w:rPr>
-          <w:rFonts w:ascii="맑은 고딕" w:eastAsia="맑은 고딕" w:hAnsi="맑은 고딕" w:cs="굴림" w:hint="eastAsia"/>
-          <w:color w:val="000000"/>
-          <w:kern w:val="0"/>
-          <w:szCs w:val="22"/>
-          <w14:ligatures w14:val="none"/>
-        </w:rPr>
-        <w:lastRenderedPageBreak/>
-        <w:t> </w:t>
-      </w:r>
-      <w:r>
-        <w:rPr>
-          <w:rFonts w:ascii="맑은 고딕" w:eastAsia="맑은 고딕" w:hAnsi="맑은 고딕" w:cs="굴림" w:hint="eastAsia"/>
-          <w:b/>
-          <w:bCs/>
-          <w:color w:val="000000"/>
-          <w:kern w:val="0"/>
-          <w:sz w:val="17"/>
-          <w:szCs w:val="17"/>
-          <w14:ligatures w14:val="none"/>
-        </w:rPr>
-        <w:t>별첨1. SK일렉링크 충전요금]</w:t>
-      </w:r>
-    </w:p>
-    <w:tbl>
-      <w:tblPr>
-        <w:tblW w:w="0" w:type="auto"/>
-        <w:tblCellMar>
-          <w:left w:w="0" w:type="dxa"/>
-          <w:right w:w="0" w:type="dxa"/>
-        </w:tblCellMar>
-        <w:tblLook w:val="04A0" w:firstRow="1" w:lastRow="0" w:firstColumn="1" w:lastColumn="0" w:noHBand="0" w:noVBand="1"/>
-      </w:tblPr>
-      <w:tblGrid>
-        <w:gridCol w:w="1110"/>
-        <w:gridCol w:w="1485"/>
-        <w:gridCol w:w="2040"/>
-        <w:gridCol w:w="1860"/>
-        <w:gridCol w:w="1665"/>
-      </w:tblGrid>
-      <w:tr>
-        <w:trPr>
-          <w:trHeight w:val="270"/>
-        </w:trPr>
-        <w:tc>
-          <w:tcPr>
-            <w:tcW w:w="1110" w:type="dxa"/>
-            <w:vMerge w:val="restart"/>
-            <w:tcBorders>
-              <w:top w:val="single" w:sz="2" w:space="0" w:color="000000"/>
-              <w:left w:val="single" w:sz="2" w:space="0" w:color="000000"/>
-              <w:bottom w:val="single" w:sz="2" w:space="0" w:color="000000"/>
-              <w:right w:val="single" w:sz="2" w:space="0" w:color="000000"/>
-            </w:tcBorders>
-            <w:shd w:val="clear" w:color="auto" w:fill="FAE2D5"/>
-            <w:tcMar>
-              <w:top w:w="0" w:type="dxa"/>
-              <w:left w:w="105" w:type="dxa"/>
-              <w:bottom w:w="0" w:type="dxa"/>
-              <w:right w:w="105" w:type="dxa"/>
-            </w:tcMar>
-            <w:vAlign w:val="center"/>
-            <w:hideMark/>
-          </w:tcPr>
-          <w:p>
-            <w:pPr>
-              <w:widowControl/>
-              <w:wordWrap/>
-              <w:autoSpaceDE/>
-              <w:autoSpaceDN/>
-              <w:spacing w:after="0"/>
-              <w:jc w:val="center"/>
-              <w:rPr>
-                <w:rFonts w:ascii="맑은 고딕" w:eastAsia="맑은 고딕" w:hAnsi="맑은 고딕" w:cs="굴림"/>
-                <w:color w:val="000000"/>
-                <w:kern w:val="0"/>
-                <w:szCs w:val="22"/>
-                <w14:ligatures w14:val="none"/>
-              </w:rPr>
-            </w:pPr>
-            <w:r>
-              <w:rPr>
-                <w:rFonts w:ascii="맑은 고딕" w:eastAsia="맑은 고딕" w:hAnsi="맑은 고딕" w:cs="굴림" w:hint="eastAsia"/>
-                <w:b/>
-                <w:bCs/>
-                <w:color w:val="000000"/>
-                <w:kern w:val="0"/>
-                <w:sz w:val="16"/>
-                <w:szCs w:val="16"/>
-                <w14:ligatures w14:val="none"/>
-              </w:rPr>
-              <w:t>구분</w:t>
-            </w:r>
-          </w:p>
-        </w:tc>
-        <w:tc>
-          <w:tcPr>
-            <w:tcW w:w="1485" w:type="dxa"/>
-            <w:vMerge w:val="restart"/>
-            <w:tcBorders>
-              <w:top w:val="single" w:sz="2" w:space="0" w:color="000000"/>
-              <w:left w:val="single" w:sz="2" w:space="0" w:color="000000"/>
-              <w:bottom w:val="single" w:sz="2" w:space="0" w:color="000000"/>
-              <w:right w:val="single" w:sz="2" w:space="0" w:color="000000"/>
-            </w:tcBorders>
-            <w:shd w:val="clear" w:color="auto" w:fill="FAE2D5"/>
-            <w:tcMar>
-              <w:top w:w="0" w:type="dxa"/>
-              <w:left w:w="105" w:type="dxa"/>
-              <w:bottom w:w="0" w:type="dxa"/>
-              <w:right w:w="105" w:type="dxa"/>
-            </w:tcMar>
-            <w:vAlign w:val="center"/>
-            <w:hideMark/>
-          </w:tcPr>
-          <w:p>
-            <w:pPr>
-              <w:widowControl/>
-              <w:wordWrap/>
-              <w:autoSpaceDE/>
-              <w:autoSpaceDN/>
-              <w:spacing w:after="0"/>
-              <w:jc w:val="center"/>
-              <w:rPr>
-                <w:rFonts w:ascii="맑은 고딕" w:eastAsia="맑은 고딕" w:hAnsi="맑은 고딕" w:cs="굴림"/>
-                <w:color w:val="000000"/>
-                <w:kern w:val="0"/>
-                <w:szCs w:val="22"/>
-                <w14:ligatures w14:val="none"/>
-              </w:rPr>
-            </w:pPr>
-            <w:r>
-              <w:rPr>
-                <w:rFonts w:ascii="맑은 고딕" w:eastAsia="맑은 고딕" w:hAnsi="맑은 고딕" w:cs="굴림" w:hint="eastAsia"/>
-                <w:b/>
-                <w:bCs/>
-                <w:color w:val="000000"/>
-                <w:kern w:val="0"/>
-                <w:sz w:val="16"/>
-                <w:szCs w:val="16"/>
-                <w14:ligatures w14:val="none"/>
-              </w:rPr>
-              <w:t>계약기간</w:t>
-            </w:r>
-          </w:p>
-        </w:tc>
-        <w:tc>
-          <w:tcPr>
-            <w:tcW w:w="2040" w:type="dxa"/>
-            <w:vMerge w:val="restart"/>
-            <w:tcBorders>
-              <w:top w:val="single" w:sz="2" w:space="0" w:color="000000"/>
-              <w:left w:val="single" w:sz="2" w:space="0" w:color="000000"/>
-              <w:bottom w:val="single" w:sz="2" w:space="0" w:color="000000"/>
-              <w:right w:val="single" w:sz="2" w:space="0" w:color="000000"/>
-            </w:tcBorders>
-            <w:shd w:val="clear" w:color="auto" w:fill="FAE2D5"/>
-            <w:tcMar>
-              <w:top w:w="0" w:type="dxa"/>
-              <w:left w:w="105" w:type="dxa"/>
-              <w:bottom w:w="0" w:type="dxa"/>
-              <w:right w:w="105" w:type="dxa"/>
-            </w:tcMar>
-            <w:vAlign w:val="center"/>
-            <w:hideMark/>
-          </w:tcPr>
-          <w:p>
-            <w:pPr>
-              <w:widowControl/>
-              <w:wordWrap/>
-              <w:autoSpaceDE/>
-              <w:autoSpaceDN/>
-              <w:spacing w:after="0"/>
-              <w:jc w:val="center"/>
-              <w:rPr>
-                <w:rFonts w:ascii="맑은 고딕" w:eastAsia="맑은 고딕" w:hAnsi="맑은 고딕" w:cs="굴림"/>
-                <w:color w:val="000000"/>
-                <w:kern w:val="0"/>
-                <w:szCs w:val="22"/>
-                <w14:ligatures w14:val="none"/>
-              </w:rPr>
-            </w:pPr>
-            <w:r>
-              <w:rPr>
-                <w:rFonts w:ascii="맑은 고딕" w:eastAsia="맑은 고딕" w:hAnsi="맑은 고딕" w:cs="굴림" w:hint="eastAsia"/>
-                <w:b/>
-                <w:bCs/>
-                <w:color w:val="000000"/>
-                <w:kern w:val="0"/>
-                <w:sz w:val="16"/>
-                <w:szCs w:val="16"/>
-                <w14:ligatures w14:val="none"/>
-              </w:rPr>
-              <w:t>충전단가</w:t>
-            </w:r>
-          </w:p>
-        </w:tc>
-        <w:tc>
-          <w:tcPr>
-            <w:tcW w:w="3525" w:type="dxa"/>
-            <w:gridSpan w:val="2"/>
-            <w:tcBorders>
-              <w:top w:val="single" w:sz="2" w:space="0" w:color="000000"/>
-              <w:left w:val="single" w:sz="2" w:space="0" w:color="000000"/>
-              <w:bottom w:val="single" w:sz="2" w:space="0" w:color="000000"/>
-              <w:right w:val="single" w:sz="2" w:space="0" w:color="000000"/>
-            </w:tcBorders>
-            <w:shd w:val="clear" w:color="auto" w:fill="FAE2D5"/>
-            <w:tcMar>
-              <w:top w:w="0" w:type="dxa"/>
-              <w:left w:w="105" w:type="dxa"/>
-              <w:bottom w:w="0" w:type="dxa"/>
-              <w:right w:w="105" w:type="dxa"/>
-            </w:tcMar>
-            <w:vAlign w:val="center"/>
-            <w:hideMark/>
-          </w:tcPr>
-          <w:p>
-            <w:pPr>
-              <w:widowControl/>
-              <w:wordWrap/>
-              <w:autoSpaceDE/>
-              <w:autoSpaceDN/>
-              <w:spacing w:after="0"/>
-              <w:jc w:val="center"/>
-              <w:rPr>
-                <w:rFonts w:ascii="맑은 고딕" w:eastAsia="맑은 고딕" w:hAnsi="맑은 고딕" w:cs="굴림"/>
-                <w:color w:val="000000"/>
-                <w:kern w:val="0"/>
-                <w:szCs w:val="22"/>
-                <w14:ligatures w14:val="none"/>
-              </w:rPr>
-            </w:pPr>
-            <w:r>
-              <w:rPr>
-                <w:rFonts w:ascii="맑은 고딕" w:eastAsia="맑은 고딕" w:hAnsi="맑은 고딕" w:cs="굴림" w:hint="eastAsia"/>
-                <w:b/>
-                <w:bCs/>
-                <w:color w:val="000000"/>
-                <w:kern w:val="0"/>
-                <w:sz w:val="16"/>
-                <w:szCs w:val="16"/>
-                <w14:ligatures w14:val="none"/>
-              </w:rPr>
-              <w:t>프로모션(충전혜택)</w:t>
-            </w:r>
-          </w:p>
-        </w:tc>
-      </w:tr>
-      <w:tr>
-        <w:trPr>
-          <w:trHeight w:val="210"/>
-        </w:trPr>
-        <w:tc>
-          <w:tcPr>
-            <w:tcW w:w="0" w:type="auto"/>
-            <w:vMerge/>
-            <w:tcBorders>
-              <w:top w:val="single" w:sz="2" w:space="0" w:color="000000"/>
-              <w:left w:val="single" w:sz="2" w:space="0" w:color="000000"/>
-              <w:bottom w:val="single" w:sz="2" w:space="0" w:color="000000"/>
-              <w:right w:val="single" w:sz="2" w:space="0" w:color="000000"/>
-            </w:tcBorders>
-            <w:vAlign w:val="center"/>
-            <w:hideMark/>
-          </w:tcPr>
-          <w:p>
-            <w:pPr>
-              <w:widowControl/>
-              <w:wordWrap/>
-              <w:autoSpaceDE/>
-              <w:autoSpaceDN/>
-              <w:spacing w:after="0"/>
-              <w:rPr>
-                <w:rFonts w:ascii="맑은 고딕" w:eastAsia="맑은 고딕" w:hAnsi="맑은 고딕" w:cs="굴림"/>
-                <w:color w:val="000000"/>
-                <w:kern w:val="0"/>
-                <w:szCs w:val="22"/>
-                <w14:ligatures w14:val="none"/>
-              </w:rPr>
-            </w:pPr>
-          </w:p>
-        </w:tc>
-        <w:tc>
-          <w:tcPr>
-            <w:tcW w:w="0" w:type="auto"/>
-            <w:vMerge/>
-            <w:tcBorders>
-              <w:top w:val="single" w:sz="2" w:space="0" w:color="000000"/>
-              <w:left w:val="single" w:sz="2" w:space="0" w:color="000000"/>
-              <w:bottom w:val="single" w:sz="2" w:space="0" w:color="000000"/>
-              <w:right w:val="single" w:sz="2" w:space="0" w:color="000000"/>
-            </w:tcBorders>
-            <w:vAlign w:val="center"/>
-            <w:hideMark/>
-          </w:tcPr>
-          <w:p>
-            <w:pPr>
-              <w:widowControl/>
-              <w:wordWrap/>
-              <w:autoSpaceDE/>
-              <w:autoSpaceDN/>
-              <w:spacing w:after="0"/>
-              <w:rPr>
-                <w:rFonts w:ascii="맑은 고딕" w:eastAsia="맑은 고딕" w:hAnsi="맑은 고딕" w:cs="굴림"/>
-                <w:color w:val="000000"/>
-                <w:kern w:val="0"/>
-                <w:szCs w:val="22"/>
-                <w14:ligatures w14:val="none"/>
-              </w:rPr>
-            </w:pPr>
-          </w:p>
-        </w:tc>
-        <w:tc>
-          <w:tcPr>
-            <w:tcW w:w="0" w:type="auto"/>
-            <w:vMerge/>
-            <w:tcBorders>
-              <w:top w:val="single" w:sz="2" w:space="0" w:color="000000"/>
-              <w:left w:val="single" w:sz="2" w:space="0" w:color="000000"/>
-              <w:bottom w:val="single" w:sz="2" w:space="0" w:color="000000"/>
-              <w:right w:val="single" w:sz="2" w:space="0" w:color="000000"/>
-            </w:tcBorders>
-            <w:vAlign w:val="center"/>
-            <w:hideMark/>
-          </w:tcPr>
-          <w:p>
-            <w:pPr>
-              <w:widowControl/>
-              <w:wordWrap/>
-              <w:autoSpaceDE/>
-              <w:autoSpaceDN/>
-              <w:spacing w:after="0"/>
-              <w:rPr>
-                <w:rFonts w:ascii="맑은 고딕" w:eastAsia="맑은 고딕" w:hAnsi="맑은 고딕" w:cs="굴림"/>
-                <w:color w:val="000000"/>
-                <w:kern w:val="0"/>
-                <w:szCs w:val="22"/>
-                <w14:ligatures w14:val="none"/>
-              </w:rPr>
-            </w:pPr>
-          </w:p>
-        </w:tc>
-        <w:tc>
-          <w:tcPr>
-            <w:tcW w:w="1860" w:type="dxa"/>
-            <w:tcBorders>
-              <w:top w:val="single" w:sz="2" w:space="0" w:color="000000"/>
-              <w:left w:val="single" w:sz="2" w:space="0" w:color="000000"/>
-              <w:bottom w:val="single" w:sz="2" w:space="0" w:color="000000"/>
-              <w:right w:val="single" w:sz="2" w:space="0" w:color="000000"/>
-            </w:tcBorders>
-            <w:shd w:val="clear" w:color="auto" w:fill="FAE2D5"/>
-            <w:tcMar>
-              <w:top w:w="0" w:type="dxa"/>
-              <w:left w:w="105" w:type="dxa"/>
-              <w:bottom w:w="0" w:type="dxa"/>
-              <w:right w:w="105" w:type="dxa"/>
-            </w:tcMar>
-            <w:vAlign w:val="center"/>
-            <w:hideMark/>
-          </w:tcPr>
-          <w:p>
-            <w:pPr>
-              <w:widowControl/>
-              <w:wordWrap/>
-              <w:autoSpaceDE/>
-              <w:autoSpaceDN/>
-              <w:spacing w:after="0"/>
-              <w:jc w:val="center"/>
-              <w:rPr>
-                <w:rFonts w:ascii="맑은 고딕" w:eastAsia="맑은 고딕" w:hAnsi="맑은 고딕" w:cs="굴림"/>
-                <w:color w:val="000000"/>
-                <w:kern w:val="0"/>
-                <w:szCs w:val="22"/>
-                <w14:ligatures w14:val="none"/>
-              </w:rPr>
-            </w:pPr>
-            <w:r>
-              <w:rPr>
-                <w:rFonts w:ascii="맑은 고딕" w:eastAsia="맑은 고딕" w:hAnsi="맑은 고딕" w:cs="굴림" w:hint="eastAsia"/>
-                <w:b/>
-                <w:bCs/>
-                <w:color w:val="000000"/>
-                <w:kern w:val="0"/>
-                <w:sz w:val="16"/>
-                <w:szCs w:val="16"/>
-                <w14:ligatures w14:val="none"/>
-              </w:rPr>
-              <w:t>기간</w:t>
-            </w:r>
-          </w:p>
-        </w:tc>
-        <w:tc>
-          <w:tcPr>
-            <w:tcW w:w="1665" w:type="dxa"/>
-            <w:tcBorders>
-              <w:top w:val="single" w:sz="2" w:space="0" w:color="000000"/>
-              <w:left w:val="single" w:sz="2" w:space="0" w:color="000000"/>
-              <w:bottom w:val="single" w:sz="2" w:space="0" w:color="000000"/>
-              <w:right w:val="single" w:sz="2" w:space="0" w:color="000000"/>
-            </w:tcBorders>
-            <w:shd w:val="clear" w:color="auto" w:fill="FAE2D5"/>
-            <w:tcMar>
-              <w:top w:w="0" w:type="dxa"/>
-              <w:left w:w="105" w:type="dxa"/>
-              <w:bottom w:w="0" w:type="dxa"/>
-              <w:right w:w="105" w:type="dxa"/>
-            </w:tcMar>
-            <w:vAlign w:val="center"/>
-            <w:hideMark/>
-          </w:tcPr>
-          <w:p>
-            <w:pPr>
-              <w:widowControl/>
-              <w:wordWrap/>
-              <w:autoSpaceDE/>
-              <w:autoSpaceDN/>
-              <w:spacing w:after="0"/>
-              <w:jc w:val="center"/>
-              <w:rPr>
-                <w:rFonts w:ascii="맑은 고딕" w:eastAsia="맑은 고딕" w:hAnsi="맑은 고딕" w:cs="굴림"/>
-                <w:color w:val="000000"/>
-                <w:kern w:val="0"/>
-                <w:szCs w:val="22"/>
-                <w14:ligatures w14:val="none"/>
-              </w:rPr>
-            </w:pPr>
-            <w:r>
-              <w:rPr>
-                <w:rFonts w:ascii="맑은 고딕" w:eastAsia="맑은 고딕" w:hAnsi="맑은 고딕" w:cs="굴림" w:hint="eastAsia"/>
-                <w:b/>
-                <w:bCs/>
-                <w:color w:val="000000"/>
-                <w:kern w:val="0"/>
-                <w:sz w:val="16"/>
-                <w:szCs w:val="16"/>
-                <w14:ligatures w14:val="none"/>
-              </w:rPr>
-              <w:t>요금</w:t>
-            </w:r>
-          </w:p>
-        </w:tc>
-      </w:tr>
-      <w:tr>
-        <w:trPr>
-          <w:trHeight w:val="270"/>
-        </w:trPr>
-        <w:tc>
-          <w:tcPr>
-            <w:tcW w:w="1110" w:type="dxa"/>
-            <w:vMerge w:val="restart"/>
-            <w:tcBorders>
-              <w:top w:val="single" w:sz="2" w:space="0" w:color="000000"/>
-              <w:left w:val="single" w:sz="2" w:space="0" w:color="000000"/>
-              <w:bottom w:val="single" w:sz="2" w:space="0" w:color="000000"/>
-              <w:right w:val="single" w:sz="2" w:space="0" w:color="000000"/>
-            </w:tcBorders>
-            <w:tcMar>
-              <w:top w:w="0" w:type="dxa"/>
-              <w:left w:w="105" w:type="dxa"/>
-              <w:bottom w:w="0" w:type="dxa"/>
-              <w:right w:w="105" w:type="dxa"/>
-            </w:tcMar>
-            <w:vAlign w:val="center"/>
-            <w:hideMark/>
-          </w:tcPr>
-          <w:p>
-            <w:pPr>
-              <w:widowControl/>
-              <w:wordWrap/>
-              <w:autoSpaceDE/>
-              <w:autoSpaceDN/>
-              <w:spacing w:after="0"/>
-              <w:jc w:val="center"/>
-              <w:rPr>
-                <w:rFonts w:ascii="맑은 고딕" w:eastAsia="맑은 고딕" w:hAnsi="맑은 고딕" w:cs="굴림"/>
-                <w:color w:val="000000"/>
-                <w:kern w:val="0"/>
-                <w:szCs w:val="22"/>
-                <w14:ligatures w14:val="none"/>
-              </w:rPr>
-            </w:pPr>
-            <w:r>
-              <w:rPr>
-                <w:rFonts w:ascii="맑은 고딕" w:eastAsia="맑은 고딕" w:hAnsi="맑은 고딕" w:cs="굴림" w:hint="eastAsia"/>
-                <w:color w:val="000000"/>
-                <w:kern w:val="0"/>
-                <w:sz w:val="16"/>
-                <w:szCs w:val="16"/>
-                <w14:ligatures w14:val="none"/>
-              </w:rPr>
-              <w:t>공동주택</w:t>
-            </w:r>
-          </w:p>
-        </w:tc>
-        <w:tc>
-          <w:tcPr>
-            <w:tcW w:w="1485" w:type="dxa"/>
-            <w:tcBorders>
-              <w:top w:val="single" w:sz="2" w:space="0" w:color="000000"/>
-              <w:left w:val="single" w:sz="2" w:space="0" w:color="000000"/>
-              <w:bottom w:val="single" w:sz="2" w:space="0" w:color="000000"/>
-              <w:right w:val="single" w:sz="2" w:space="0" w:color="000000"/>
-            </w:tcBorders>
-            <w:tcMar>
-              <w:top w:w="0" w:type="dxa"/>
-              <w:left w:w="105" w:type="dxa"/>
-              <w:bottom w:w="0" w:type="dxa"/>
-              <w:right w:w="105" w:type="dxa"/>
-            </w:tcMar>
-            <w:vAlign w:val="center"/>
-            <w:hideMark/>
-          </w:tcPr>
-          <w:p>
-            <w:pPr>
-              <w:widowControl/>
-              <w:wordWrap/>
-              <w:autoSpaceDE/>
-              <w:autoSpaceDN/>
-              <w:spacing w:after="0"/>
-              <w:jc w:val="center"/>
-              <w:rPr>
-                <w:rFonts w:ascii="맑은 고딕" w:eastAsia="맑은 고딕" w:hAnsi="맑은 고딕" w:cs="굴림"/>
-                <w:color w:val="000000"/>
-                <w:kern w:val="0"/>
-                <w:szCs w:val="22"/>
-                <w14:ligatures w14:val="none"/>
-              </w:rPr>
-            </w:pPr>
-            <w:r>
-              <w:rPr>
-                <w:rFonts w:ascii="맑은 고딕" w:eastAsia="맑은 고딕" w:hAnsi="맑은 고딕" w:cs="굴림" w:hint="eastAsia"/>
-                <w:color w:val="000000"/>
-                <w:kern w:val="0"/>
-                <w:sz w:val="16"/>
-                <w:szCs w:val="16"/>
-                <w14:ligatures w14:val="none"/>
-              </w:rPr>
-              <w:t>7년</w:t>
-            </w:r>
-          </w:p>
-        </w:tc>
-        <w:tc>
-          <w:tcPr>
-            <w:tcW w:w="2040" w:type="dxa"/>
-            <w:vMerge w:val="restart"/>
-            <w:tcBorders>
-              <w:top w:val="single" w:sz="2" w:space="0" w:color="000000"/>
-              <w:left w:val="single" w:sz="2" w:space="0" w:color="000000"/>
-              <w:bottom w:val="single" w:sz="2" w:space="0" w:color="000000"/>
-              <w:right w:val="single" w:sz="2" w:space="0" w:color="000000"/>
-            </w:tcBorders>
-            <w:tcMar>
-              <w:top w:w="0" w:type="dxa"/>
-              <w:left w:w="105" w:type="dxa"/>
-              <w:bottom w:w="0" w:type="dxa"/>
-              <w:right w:w="105" w:type="dxa"/>
-            </w:tcMar>
-            <w:vAlign w:val="center"/>
-            <w:hideMark/>
-          </w:tcPr>
-          <w:p>
-            <w:pPr>
-              <w:widowControl/>
-              <w:wordWrap/>
-              <w:autoSpaceDE/>
-              <w:autoSpaceDN/>
-              <w:spacing w:after="0"/>
-              <w:jc w:val="center"/>
-              <w:rPr>
-                <w:rFonts w:ascii="맑은 고딕" w:eastAsia="맑은 고딕" w:hAnsi="맑은 고딕" w:cs="굴림"/>
-                <w:color w:val="000000"/>
-                <w:kern w:val="0"/>
-                <w:szCs w:val="22"/>
-                <w14:ligatures w14:val="none"/>
-              </w:rPr>
-            </w:pPr>
-            <w:r>
-              <w:rPr>
-                <w:rFonts w:ascii="맑은 고딕" w:eastAsia="맑은 고딕" w:hAnsi="맑은 고딕" w:cs="굴림" w:hint="eastAsia"/>
-                <w:color w:val="000000"/>
-                <w:kern w:val="0"/>
-                <w:sz w:val="16"/>
-                <w:szCs w:val="16"/>
-                <w14:ligatures w14:val="none"/>
-              </w:rPr>
-              <w:t>SK일렉링크</w:t>
-            </w:r>
-          </w:p>
-          <w:p>
-            <w:pPr>
-              <w:widowControl/>
-              <w:wordWrap/>
-              <w:autoSpaceDE/>
-              <w:autoSpaceDN/>
-              <w:spacing w:after="0"/>
-              <w:jc w:val="center"/>
-              <w:rPr>
-                <w:rFonts w:ascii="맑은 고딕" w:eastAsia="맑은 고딕" w:hAnsi="맑은 고딕" w:cs="굴림"/>
-                <w:color w:val="000000"/>
-                <w:kern w:val="0"/>
-                <w:szCs w:val="22"/>
-                <w14:ligatures w14:val="none"/>
-              </w:rPr>
-            </w:pPr>
-            <w:r>
-              <w:rPr>
-                <w:rFonts w:ascii="맑은 고딕" w:eastAsia="맑은 고딕" w:hAnsi="맑은 고딕" w:cs="굴림" w:hint="eastAsia"/>
-                <w:color w:val="000000"/>
-                <w:kern w:val="0"/>
-                <w:sz w:val="16"/>
-                <w:szCs w:val="16"/>
-                <w14:ligatures w14:val="none"/>
-              </w:rPr>
-              <w:t>표준단가</w:t>
-            </w:r>
-          </w:p>
-        </w:tc>
-        <w:tc>
-          <w:tcPr>
-            <w:tcW w:w="1860" w:type="dxa"/>
-            <w:tcBorders>
-              <w:top w:val="single" w:sz="2" w:space="0" w:color="000000"/>
-              <w:left w:val="single" w:sz="2" w:space="0" w:color="000000"/>
-              <w:bottom w:val="single" w:sz="2" w:space="0" w:color="000000"/>
-              <w:right w:val="single" w:sz="2" w:space="0" w:color="000000"/>
-            </w:tcBorders>
-            <w:tcMar>
-              <w:top w:w="0" w:type="dxa"/>
-              <w:left w:w="105" w:type="dxa"/>
-              <w:bottom w:w="0" w:type="dxa"/>
-              <w:right w:w="105" w:type="dxa"/>
-            </w:tcMar>
-            <w:vAlign w:val="center"/>
-            <w:hideMark/>
-          </w:tcPr>
-          <w:p>
-            <w:pPr>
-              <w:widowControl/>
-              <w:wordWrap/>
-              <w:autoSpaceDE/>
-              <w:autoSpaceDN/>
-              <w:spacing w:after="0"/>
-              <w:jc w:val="center"/>
-              <w:rPr>
-                <w:rFonts w:ascii="맑은 고딕" w:eastAsia="맑은 고딕" w:hAnsi="맑은 고딕" w:cs="굴림"/>
-                <w:color w:val="000000"/>
-                <w:kern w:val="0"/>
-                <w:szCs w:val="22"/>
-                <w14:ligatures w14:val="none"/>
-              </w:rPr>
-            </w:pPr>
-            <w:r>
-              <w:rPr>
-                <w:rFonts w:ascii="맑은 고딕" w:eastAsia="맑은 고딕" w:hAnsi="맑은 고딕" w:cs="굴림" w:hint="eastAsia"/>
-                <w:color w:val="000000"/>
-                <w:kern w:val="0"/>
-                <w:sz w:val="16"/>
-                <w:szCs w:val="16"/>
-                <w14:ligatures w14:val="none"/>
-              </w:rPr>
-              <w:t>6개월</w:t>
-            </w:r>
-          </w:p>
-        </w:tc>
-        <w:tc>
-          <w:tcPr>
-            <w:tcW w:w="1665" w:type="dxa"/>
-            <w:tcBorders>
-              <w:top w:val="single" w:sz="2" w:space="0" w:color="000000"/>
-              <w:left w:val="single" w:sz="2" w:space="0" w:color="000000"/>
-              <w:bottom w:val="single" w:sz="2" w:space="0" w:color="000000"/>
-              <w:right w:val="single" w:sz="2" w:space="0" w:color="000000"/>
-            </w:tcBorders>
-            <w:tcMar>
-              <w:top w:w="0" w:type="dxa"/>
-              <w:left w:w="105" w:type="dxa"/>
-              <w:bottom w:w="0" w:type="dxa"/>
-              <w:right w:w="105" w:type="dxa"/>
-            </w:tcMar>
-            <w:vAlign w:val="center"/>
-            <w:hideMark/>
-          </w:tcPr>
-          <w:p>
-            <w:pPr>
-              <w:widowControl/>
-              <w:wordWrap/>
-              <w:autoSpaceDE/>
-              <w:autoSpaceDN/>
-              <w:spacing w:after="0"/>
-              <w:jc w:val="center"/>
-              <w:rPr>
-                <w:rFonts w:ascii="맑은 고딕" w:eastAsia="맑은 고딕" w:hAnsi="맑은 고딕" w:cs="굴림"/>
-                <w:color w:val="000000"/>
-                <w:kern w:val="0"/>
-                <w:szCs w:val="22"/>
-                <w14:ligatures w14:val="none"/>
-              </w:rPr>
-            </w:pPr>
-            <w:r>
-              <w:rPr>
-                <w:rFonts w:ascii="맑은 고딕" w:eastAsia="맑은 고딕" w:hAnsi="맑은 고딕" w:cs="굴림" w:hint="eastAsia"/>
-                <w:color w:val="000000"/>
-                <w:kern w:val="0"/>
-                <w:sz w:val="16"/>
-                <w:szCs w:val="16"/>
-                <w14:ligatures w14:val="none"/>
-              </w:rPr>
-              <w:t>150원</w:t>
-            </w:r>
-          </w:p>
-        </w:tc>
-      </w:tr>
-      <w:tr>
-        <w:trPr>
-          <w:trHeight w:val="495"/>
-        </w:trPr>
-        <w:tc>
-          <w:tcPr>
-            <w:tcW w:w="0" w:type="auto"/>
-            <w:vMerge/>
-            <w:tcBorders>
-              <w:top w:val="single" w:sz="2" w:space="0" w:color="000000"/>
-              <w:left w:val="single" w:sz="2" w:space="0" w:color="000000"/>
-              <w:bottom w:val="single" w:sz="2" w:space="0" w:color="000000"/>
-              <w:right w:val="single" w:sz="2" w:space="0" w:color="000000"/>
-            </w:tcBorders>
-            <w:vAlign w:val="center"/>
-            <w:hideMark/>
-          </w:tcPr>
-          <w:p>
-            <w:pPr>
-              <w:widowControl/>
-              <w:wordWrap/>
-              <w:autoSpaceDE/>
-              <w:autoSpaceDN/>
-              <w:spacing w:after="0"/>
-              <w:rPr>
-                <w:rFonts w:ascii="맑은 고딕" w:eastAsia="맑은 고딕" w:hAnsi="맑은 고딕" w:cs="굴림"/>
-                <w:color w:val="000000"/>
-                <w:kern w:val="0"/>
-                <w:szCs w:val="22"/>
-                <w14:ligatures w14:val="none"/>
-              </w:rPr>
-            </w:pPr>
-          </w:p>
-        </w:tc>
-        <w:tc>
-          <w:tcPr>
-            <w:tcW w:w="1485" w:type="dxa"/>
-            <w:tcBorders>
-              <w:top w:val="single" w:sz="2" w:space="0" w:color="000000"/>
-              <w:left w:val="single" w:sz="2" w:space="0" w:color="000000"/>
-              <w:bottom w:val="single" w:sz="2" w:space="0" w:color="000000"/>
-              <w:right w:val="single" w:sz="2" w:space="0" w:color="000000"/>
-            </w:tcBorders>
-            <w:tcMar>
-              <w:top w:w="0" w:type="dxa"/>
-              <w:left w:w="105" w:type="dxa"/>
-              <w:bottom w:w="0" w:type="dxa"/>
-              <w:right w:w="105" w:type="dxa"/>
-            </w:tcMar>
-            <w:vAlign w:val="center"/>
-            <w:hideMark/>
-          </w:tcPr>
-          <w:p>
-            <w:pPr>
-              <w:widowControl/>
-              <w:wordWrap/>
-              <w:autoSpaceDE/>
-              <w:autoSpaceDN/>
-              <w:spacing w:after="0"/>
-              <w:jc w:val="center"/>
-              <w:rPr>
-                <w:rFonts w:ascii="맑은 고딕" w:eastAsia="맑은 고딕" w:hAnsi="맑은 고딕" w:cs="굴림"/>
-                <w:color w:val="000000"/>
-                <w:kern w:val="0"/>
-                <w:szCs w:val="22"/>
-                <w14:ligatures w14:val="none"/>
-              </w:rPr>
-            </w:pPr>
-            <w:r>
-              <w:rPr>
-                <w:rFonts w:ascii="맑은 고딕" w:eastAsia="맑은 고딕" w:hAnsi="맑은 고딕" w:cs="굴림" w:hint="eastAsia"/>
-                <w:color w:val="000000"/>
-                <w:kern w:val="0"/>
-                <w:sz w:val="16"/>
-                <w:szCs w:val="16"/>
-                <w14:ligatures w14:val="none"/>
-              </w:rPr>
-              <w:t>10년</w:t>
-            </w:r>
-          </w:p>
-        </w:tc>
-        <w:tc>
-          <w:tcPr>
-            <w:tcW w:w="0" w:type="auto"/>
-            <w:vMerge/>
-            <w:tcBorders>
-              <w:top w:val="single" w:sz="2" w:space="0" w:color="000000"/>
-              <w:left w:val="single" w:sz="2" w:space="0" w:color="000000"/>
-              <w:bottom w:val="single" w:sz="2" w:space="0" w:color="000000"/>
-              <w:right w:val="single" w:sz="2" w:space="0" w:color="000000"/>
-            </w:tcBorders>
-            <w:vAlign w:val="center"/>
-            <w:hideMark/>
-          </w:tcPr>
-          <w:p>
-            <w:pPr>
-              <w:widowControl/>
-              <w:wordWrap/>
-              <w:autoSpaceDE/>
-              <w:autoSpaceDN/>
-              <w:spacing w:after="0"/>
-              <w:rPr>
-                <w:rFonts w:ascii="맑은 고딕" w:eastAsia="맑은 고딕" w:hAnsi="맑은 고딕" w:cs="굴림"/>
-                <w:color w:val="000000"/>
-                <w:kern w:val="0"/>
-                <w:szCs w:val="22"/>
-                <w14:ligatures w14:val="none"/>
-              </w:rPr>
-            </w:pPr>
-          </w:p>
-        </w:tc>
-        <w:tc>
-          <w:tcPr>
-            <w:tcW w:w="1860" w:type="dxa"/>
-            <w:tcBorders>
-              <w:top w:val="single" w:sz="2" w:space="0" w:color="000000"/>
-              <w:left w:val="single" w:sz="2" w:space="0" w:color="000000"/>
-              <w:bottom w:val="single" w:sz="2" w:space="0" w:color="000000"/>
-              <w:right w:val="single" w:sz="2" w:space="0" w:color="000000"/>
-            </w:tcBorders>
-            <w:tcMar>
-              <w:top w:w="0" w:type="dxa"/>
-              <w:left w:w="105" w:type="dxa"/>
-              <w:bottom w:w="0" w:type="dxa"/>
-              <w:right w:w="105" w:type="dxa"/>
-            </w:tcMar>
-            <w:vAlign w:val="center"/>
-            <w:hideMark/>
-          </w:tcPr>
-          <w:p>
-            <w:pPr>
-              <w:widowControl/>
-              <w:wordWrap/>
-              <w:autoSpaceDE/>
-              <w:autoSpaceDN/>
-              <w:spacing w:after="0"/>
-              <w:jc w:val="center"/>
-              <w:rPr>
-                <w:rFonts w:ascii="맑은 고딕" w:eastAsia="맑은 고딕" w:hAnsi="맑은 고딕" w:cs="굴림"/>
-                <w:color w:val="000000"/>
-                <w:kern w:val="0"/>
-                <w:szCs w:val="22"/>
-                <w14:ligatures w14:val="none"/>
-              </w:rPr>
-            </w:pPr>
-            <w:r>
-              <w:rPr>
-                <w:rFonts w:ascii="맑은 고딕" w:eastAsia="맑은 고딕" w:hAnsi="맑은 고딕" w:cs="굴림" w:hint="eastAsia"/>
-                <w:color w:val="000000"/>
-                <w:kern w:val="0"/>
-                <w:sz w:val="16"/>
-                <w:szCs w:val="16"/>
-                <w14:ligatures w14:val="none"/>
-              </w:rPr>
-              <w:t>첫6개월</w:t>
-            </w:r>
-          </w:p>
-          <w:p>
-            <w:pPr>
-              <w:widowControl/>
-              <w:wordWrap/>
-              <w:autoSpaceDE/>
-              <w:autoSpaceDN/>
-              <w:spacing w:after="0"/>
-              <w:jc w:val="center"/>
-              <w:rPr>
-                <w:rFonts w:ascii="맑은 고딕" w:eastAsia="맑은 고딕" w:hAnsi="맑은 고딕" w:cs="굴림"/>
-                <w:color w:val="000000"/>
-                <w:kern w:val="0"/>
-                <w:szCs w:val="22"/>
-                <w14:ligatures w14:val="none"/>
-              </w:rPr>
-            </w:pPr>
-            <w:r>
-              <w:rPr>
-                <w:rFonts w:ascii="맑은 고딕" w:eastAsia="맑은 고딕" w:hAnsi="맑은 고딕" w:cs="굴림" w:hint="eastAsia"/>
-                <w:color w:val="000000"/>
-                <w:kern w:val="0"/>
-                <w:sz w:val="16"/>
-                <w:szCs w:val="16"/>
-                <w14:ligatures w14:val="none"/>
-              </w:rPr>
-              <w:t>다음6개월</w:t>
-            </w:r>
-          </w:p>
-        </w:tc>
-        <w:tc>
-          <w:tcPr>
-            <w:tcW w:w="1665" w:type="dxa"/>
-            <w:tcBorders>
-              <w:top w:val="single" w:sz="2" w:space="0" w:color="000000"/>
-              <w:left w:val="single" w:sz="2" w:space="0" w:color="000000"/>
-              <w:bottom w:val="single" w:sz="2" w:space="0" w:color="000000"/>
-              <w:right w:val="single" w:sz="2" w:space="0" w:color="000000"/>
-            </w:tcBorders>
-            <w:tcMar>
-              <w:top w:w="0" w:type="dxa"/>
-              <w:left w:w="105" w:type="dxa"/>
-              <w:bottom w:w="0" w:type="dxa"/>
-              <w:right w:w="105" w:type="dxa"/>
-            </w:tcMar>
-            <w:vAlign w:val="center"/>
-            <w:hideMark/>
-          </w:tcPr>
-          <w:p>
-            <w:pPr>
-              <w:widowControl/>
-              <w:wordWrap/>
-              <w:autoSpaceDE/>
-              <w:autoSpaceDN/>
-              <w:spacing w:after="0"/>
-              <w:jc w:val="center"/>
-              <w:rPr>
-                <w:rFonts w:ascii="맑은 고딕" w:eastAsia="맑은 고딕" w:hAnsi="맑은 고딕" w:cs="굴림"/>
-                <w:color w:val="000000"/>
-                <w:kern w:val="0"/>
-                <w:szCs w:val="22"/>
-                <w14:ligatures w14:val="none"/>
-              </w:rPr>
-            </w:pPr>
-            <w:r>
-              <w:rPr>
-                <w:rFonts w:ascii="맑은 고딕" w:eastAsia="맑은 고딕" w:hAnsi="맑은 고딕" w:cs="굴림" w:hint="eastAsia"/>
-                <w:color w:val="000000"/>
-                <w:kern w:val="0"/>
-                <w:sz w:val="16"/>
-                <w:szCs w:val="16"/>
-                <w14:ligatures w14:val="none"/>
-              </w:rPr>
-              <w:t>150원</w:t>
-            </w:r>
-          </w:p>
-          <w:p>
-            <w:pPr>
-              <w:widowControl/>
-              <w:wordWrap/>
-              <w:autoSpaceDE/>
-              <w:autoSpaceDN/>
-              <w:spacing w:after="0"/>
-              <w:jc w:val="center"/>
-              <w:rPr>
-                <w:rFonts w:ascii="맑은 고딕" w:eastAsia="맑은 고딕" w:hAnsi="맑은 고딕" w:cs="굴림"/>
-                <w:color w:val="000000"/>
-                <w:kern w:val="0"/>
-                <w:szCs w:val="22"/>
-                <w14:ligatures w14:val="none"/>
-              </w:rPr>
-            </w:pPr>
-            <w:r>
-              <w:rPr>
-                <w:rFonts w:ascii="맑은 고딕" w:eastAsia="맑은 고딕" w:hAnsi="맑은 고딕" w:cs="굴림" w:hint="eastAsia"/>
-                <w:color w:val="000000"/>
-                <w:kern w:val="0"/>
-                <w:sz w:val="16"/>
-                <w:szCs w:val="16"/>
-                <w14:ligatures w14:val="none"/>
-              </w:rPr>
-              <w:t>250원</w:t>
-            </w:r>
-          </w:p>
-        </w:tc>
-      </w:tr>
-    </w:tbl>
-    <w:p>
-      <w:pPr>
-        <w:widowControl/>
-        <w:wordWrap/>
-        <w:autoSpaceDE/>
-        <w:autoSpaceDN/>
-        <w:spacing w:after="0" w:line="408" w:lineRule="auto"/>
-        <w:rPr>
-          <w:rFonts w:ascii="맑은 고딕" w:eastAsia="맑은 고딕" w:hAnsi="맑은 고딕" w:cs="굴림"/>
-          <w:color w:val="000000"/>
-          <w:kern w:val="0"/>
-          <w:szCs w:val="22"/>
-          <w14:ligatures w14:val="none"/>
-        </w:rPr>
-      </w:pPr>
-      <w:r>
-        <w:rPr>
-          <w:rFonts w:ascii="맑은 고딕" w:eastAsia="맑은 고딕" w:hAnsi="맑은 고딕" w:cs="굴림" w:hint="eastAsia"/>
-          <w:b/>
-          <w:bCs/>
-          <w:color w:val="000000"/>
-          <w:kern w:val="0"/>
-          <w:sz w:val="16"/>
-          <w:szCs w:val="16"/>
-          <w14:ligatures w14:val="none"/>
-        </w:rPr>
-        <w:t>[NOTE]</w:t>
-      </w:r>
-    </w:p>
-    <w:p>
-      <w:pPr>
-        <w:widowControl/>
-        <w:wordWrap/>
-        <w:autoSpaceDE/>
-        <w:autoSpaceDN/>
-        <w:spacing w:after="0" w:line="408" w:lineRule="auto"/>
-        <w:rPr>
-          <w:rFonts w:ascii="맑은 고딕" w:eastAsia="맑은 고딕" w:hAnsi="맑은 고딕" w:cs="굴림"/>
-          <w:color w:val="000000"/>
-          <w:kern w:val="0"/>
-          <w:szCs w:val="22"/>
-          <w14:ligatures w14:val="none"/>
-        </w:rPr>
-      </w:pPr>
-      <w:r>
-        <w:rPr>
-          <w:rFonts w:ascii="맑은 고딕" w:eastAsia="맑은 고딕" w:hAnsi="맑은 고딕" w:cs="굴림" w:hint="eastAsia"/>
-          <w:color w:val="000000"/>
-          <w:kern w:val="0"/>
-          <w:sz w:val="16"/>
-          <w:szCs w:val="16"/>
-          <w14:ligatures w14:val="none"/>
-        </w:rPr>
-        <w:t>1) 프로모션 충전 요금은 서비스 시작일에 적용(SK일렉링크 회원 기준)</w:t>
-      </w:r>
-    </w:p>
-    <w:p>
-      <w:pPr>
-        <w:widowControl/>
-        <w:wordWrap/>
-        <w:autoSpaceDE/>
-        <w:autoSpaceDN/>
-        <w:spacing w:after="0" w:line="408" w:lineRule="auto"/>
-        <w:rPr>
-          <w:rFonts w:ascii="맑은 고딕" w:eastAsia="맑은 고딕" w:hAnsi="맑은 고딕" w:cs="굴림"/>
-          <w:color w:val="000000"/>
-          <w:kern w:val="0"/>
-          <w:szCs w:val="22"/>
-          <w14:ligatures w14:val="none"/>
-        </w:rPr>
-      </w:pPr>
-      <w:r>
-        <w:rPr>
-          <w:rFonts w:ascii="맑은 고딕" w:eastAsia="맑은 고딕" w:hAnsi="맑은 고딕" w:cs="굴림" w:hint="eastAsia"/>
-          <w:color w:val="000000"/>
-          <w:kern w:val="0"/>
-          <w:sz w:val="16"/>
-          <w:szCs w:val="16"/>
-          <w14:ligatures w14:val="none"/>
-        </w:rPr>
-        <w:t>2) 프로모션 종료 후 충전단가는SK일렉링크 표준단가 적용</w:t>
-      </w:r>
-    </w:p>
-    <w:p>
-      <w:pPr>
-        <w:widowControl/>
-        <w:wordWrap/>
-        <w:autoSpaceDE/>
-        <w:autoSpaceDN/>
-        <w:spacing w:after="0" w:line="408" w:lineRule="auto"/>
-        <w:rPr>
-          <w:rFonts w:ascii="맑은 고딕" w:eastAsia="맑은 고딕" w:hAnsi="맑은 고딕" w:cs="굴림"/>
-          <w:color w:val="000000"/>
-          <w:kern w:val="0"/>
-          <w:szCs w:val="22"/>
-          <w14:ligatures w14:val="none"/>
-        </w:rPr>
-      </w:pPr>
-      <w:r>
-        <w:rPr>
-          <w:rFonts w:ascii="맑은 고딕" w:eastAsia="맑은 고딕" w:hAnsi="맑은 고딕" w:cs="굴림" w:hint="eastAsia"/>
-          <w:kern w:val="0"/>
-          <w:sz w:val="16"/>
-          <w:szCs w:val="16"/>
-          <w14:ligatures w14:val="none"/>
-        </w:rPr>
-        <w:t>3) 표준 충전단가는 한전 단가 인상/환경부 충전요금 인상/물가인상에 따라 변동</w:t>
-      </w:r>
-    </w:p>
     <w:p>
       <w:pPr>
         <w:widowControl/>

</xml_diff>

<commit_message>
Restore SK 별첨1 (충전요금) appendix per user edit
User re-added the 별첨1 충전요금 appendix to the SK template. Verified against
the content-based 직인동의서 fill (649b300): renders 7 pages with no blank page,
직인동의서 3/3 + header 6 + 별지5호/7호 SDT all fill, BAS/계약기간 anchors intact.

Co-Authored-By: Claude Opus 4.8 (1M context) <noreply@anthropic.com>
</commit_message>
<xml_diff>
--- a/public/sk/template.docx
+++ b/public/sk/template.docx
@@ -30,7 +30,35 @@
           <w:szCs w:val="30"/>
           <w14:ligatures w14:val="none"/>
         </w:rPr>
-        <w:t>전기차 공용 완속 충전기 설치, 운영 계약서</w:t>
+        <w:t xml:space="preserve">전기차 공용 </w:t>
+      </w:r>
+      <w:proofErr w:type="spellStart"/>
+      <w:r>
+        <w:rPr>
+          <w:rFonts w:ascii="맑은 고딕" w:eastAsia="맑은 고딕" w:hAnsi="맑은 고딕" w:cs="굴림" w:hint="eastAsia"/>
+          <w:b/>
+          <w:bCs/>
+          <w:color w:val="000000"/>
+          <w:kern w:val="0"/>
+          <w:sz w:val="30"/>
+          <w:szCs w:val="30"/>
+          <w14:ligatures w14:val="none"/>
+        </w:rPr>
+        <w:t>완속</w:t>
+      </w:r>
+      <w:proofErr w:type="spellEnd"/>
+      <w:r>
+        <w:rPr>
+          <w:rFonts w:ascii="맑은 고딕" w:eastAsia="맑은 고딕" w:hAnsi="맑은 고딕" w:cs="굴림" w:hint="eastAsia"/>
+          <w:b/>
+          <w:bCs/>
+          <w:color w:val="000000"/>
+          <w:kern w:val="0"/>
+          <w:sz w:val="30"/>
+          <w:szCs w:val="30"/>
+          <w14:ligatures w14:val="none"/>
+        </w:rPr>
+        <w:t xml:space="preserve"> 충전기 설치, 운영 계약서</w:t>
       </w:r>
     </w:p>
     <w:p>
@@ -906,7 +934,31 @@
                 <w:szCs w:val="17"/>
                 <w14:ligatures w14:val="none"/>
               </w:rPr>
-              <w:t>SK일렉링크 주식회사</w:t>
+              <w:t>SK</w:t>
+            </w:r>
+            <w:proofErr w:type="spellStart"/>
+            <w:r>
+              <w:rPr>
+                <w:rFonts w:ascii="맑은 고딕" w:eastAsia="맑은 고딕" w:hAnsi="맑은 고딕" w:cs="굴림" w:hint="eastAsia"/>
+                <w:color w:val="000000"/>
+                <w:kern w:val="0"/>
+                <w:sz w:val="17"/>
+                <w:szCs w:val="17"/>
+                <w14:ligatures w14:val="none"/>
+              </w:rPr>
+              <w:t>일렉링크</w:t>
+            </w:r>
+            <w:proofErr w:type="spellEnd"/>
+            <w:r>
+              <w:rPr>
+                <w:rFonts w:ascii="맑은 고딕" w:eastAsia="맑은 고딕" w:hAnsi="맑은 고딕" w:cs="굴림" w:hint="eastAsia"/>
+                <w:color w:val="000000"/>
+                <w:kern w:val="0"/>
+                <w:sz w:val="17"/>
+                <w:szCs w:val="17"/>
+                <w14:ligatures w14:val="none"/>
+              </w:rPr>
+              <w:t xml:space="preserve"> 주식회사</w:t>
             </w:r>
           </w:p>
         </w:tc>
@@ -1219,7 +1271,31 @@
                 <w:szCs w:val="17"/>
                 <w14:ligatures w14:val="none"/>
               </w:rPr>
-              <w:t>서울시 강남구 언주로 135길 15</w:t>
+              <w:t xml:space="preserve">서울시 강남구 </w:t>
+            </w:r>
+            <w:proofErr w:type="spellStart"/>
+            <w:r>
+              <w:rPr>
+                <w:rFonts w:ascii="맑은 고딕" w:eastAsia="맑은 고딕" w:hAnsi="맑은 고딕" w:cs="굴림" w:hint="eastAsia"/>
+                <w:color w:val="000000"/>
+                <w:kern w:val="0"/>
+                <w:sz w:val="17"/>
+                <w:szCs w:val="17"/>
+                <w14:ligatures w14:val="none"/>
+              </w:rPr>
+              <w:t>언주로</w:t>
+            </w:r>
+            <w:proofErr w:type="spellEnd"/>
+            <w:r>
+              <w:rPr>
+                <w:rFonts w:ascii="맑은 고딕" w:eastAsia="맑은 고딕" w:hAnsi="맑은 고딕" w:cs="굴림" w:hint="eastAsia"/>
+                <w:color w:val="000000"/>
+                <w:kern w:val="0"/>
+                <w:sz w:val="17"/>
+                <w:szCs w:val="17"/>
+                <w14:ligatures w14:val="none"/>
+              </w:rPr>
+              <w:t xml:space="preserve"> 135길 15</w:t>
             </w:r>
           </w:p>
         </w:tc>
@@ -1467,7 +1543,31 @@
                 <w:szCs w:val="17"/>
                 <w14:ligatures w14:val="none"/>
               </w:rPr>
-              <w:t>□ BAS1007.D1.1(스마트완속충전기),</w:t>
+              <w:t>□ BAS1007.D1.1(</w:t>
+            </w:r>
+            <w:proofErr w:type="spellStart"/>
+            <w:r>
+              <w:rPr>
+                <w:rFonts w:ascii="맑은 고딕" w:eastAsia="맑은 고딕" w:hAnsi="맑은 고딕" w:cs="굴림" w:hint="eastAsia"/>
+                <w:color w:val="000000"/>
+                <w:kern w:val="0"/>
+                <w:sz w:val="17"/>
+                <w:szCs w:val="17"/>
+                <w14:ligatures w14:val="none"/>
+              </w:rPr>
+              <w:t>스마트완속충전기</w:t>
+            </w:r>
+            <w:proofErr w:type="spellEnd"/>
+            <w:r>
+              <w:rPr>
+                <w:rFonts w:ascii="맑은 고딕" w:eastAsia="맑은 고딕" w:hAnsi="맑은 고딕" w:cs="굴림" w:hint="eastAsia"/>
+                <w:color w:val="000000"/>
+                <w:kern w:val="0"/>
+                <w:sz w:val="17"/>
+                <w:szCs w:val="17"/>
+                <w14:ligatures w14:val="none"/>
+              </w:rPr>
+              <w:t>),</w:t>
             </w:r>
           </w:p>
           <w:p>
@@ -1495,7 +1595,31 @@
                 <w:szCs w:val="17"/>
                 <w14:ligatures w14:val="none"/>
               </w:rPr>
-              <w:t>□ CEC-2333HR1(스마트완속충전기)</w:t>
+              <w:t>□ CEC-2333HR1(</w:t>
+            </w:r>
+            <w:proofErr w:type="spellStart"/>
+            <w:r>
+              <w:rPr>
+                <w:rFonts w:ascii="맑은 고딕" w:eastAsia="맑은 고딕" w:hAnsi="맑은 고딕" w:cs="굴림" w:hint="eastAsia"/>
+                <w:color w:val="000000"/>
+                <w:kern w:val="0"/>
+                <w:sz w:val="17"/>
+                <w:szCs w:val="17"/>
+                <w14:ligatures w14:val="none"/>
+              </w:rPr>
+              <w:t>스마트완속충전기</w:t>
+            </w:r>
+            <w:proofErr w:type="spellEnd"/>
+            <w:r>
+              <w:rPr>
+                <w:rFonts w:ascii="맑은 고딕" w:eastAsia="맑은 고딕" w:hAnsi="맑은 고딕" w:cs="굴림" w:hint="eastAsia"/>
+                <w:color w:val="000000"/>
+                <w:kern w:val="0"/>
+                <w:sz w:val="17"/>
+                <w:szCs w:val="17"/>
+                <w14:ligatures w14:val="none"/>
+              </w:rPr>
+              <w:t>)</w:t>
             </w:r>
           </w:p>
         </w:tc>
@@ -1687,7 +1811,31 @@
                 <w:szCs w:val="17"/>
                 <w14:ligatures w14:val="none"/>
               </w:rPr>
-              <w:t>[별첨1] ‘SK일렉링크 충전요금’ 참고</w:t>
+              <w:t>[별첨1] ‘SK</w:t>
+            </w:r>
+            <w:proofErr w:type="spellStart"/>
+            <w:r>
+              <w:rPr>
+                <w:rFonts w:ascii="맑은 고딕" w:eastAsia="맑은 고딕" w:hAnsi="맑은 고딕" w:cs="굴림" w:hint="eastAsia"/>
+                <w:color w:val="000000"/>
+                <w:kern w:val="0"/>
+                <w:sz w:val="17"/>
+                <w:szCs w:val="17"/>
+                <w14:ligatures w14:val="none"/>
+              </w:rPr>
+              <w:t>일렉링크</w:t>
+            </w:r>
+            <w:proofErr w:type="spellEnd"/>
+            <w:r>
+              <w:rPr>
+                <w:rFonts w:ascii="맑은 고딕" w:eastAsia="맑은 고딕" w:hAnsi="맑은 고딕" w:cs="굴림" w:hint="eastAsia"/>
+                <w:color w:val="000000"/>
+                <w:kern w:val="0"/>
+                <w:sz w:val="17"/>
+                <w:szCs w:val="17"/>
+                <w14:ligatures w14:val="none"/>
+              </w:rPr>
+              <w:t xml:space="preserve"> 충전요금’ 참고</w:t>
             </w:r>
           </w:p>
         </w:tc>
@@ -1844,8 +1992,45 @@
                 <w:szCs w:val="14"/>
                 <w14:ligatures w14:val="none"/>
               </w:rPr>
-              <w:t>   전기 인입공사 및 한전 전기사용 신청 등에 협조하여야 하며, 서비스제공자에게 위탁한 충전 시설이 설치된 주차면을 전기차 전용면으</w:t>
-            </w:r>
+              <w:t xml:space="preserve">   전기 </w:t>
+            </w:r>
+            <w:proofErr w:type="spellStart"/>
+            <w:r>
+              <w:rPr>
+                <w:rFonts w:ascii="맑은 고딕" w:eastAsia="맑은 고딕" w:hAnsi="맑은 고딕" w:cs="굴림" w:hint="eastAsia"/>
+                <w:color w:val="000000"/>
+                <w:kern w:val="0"/>
+                <w:sz w:val="14"/>
+                <w:szCs w:val="14"/>
+                <w14:ligatures w14:val="none"/>
+              </w:rPr>
+              <w:t>인입공사</w:t>
+            </w:r>
+            <w:proofErr w:type="spellEnd"/>
+            <w:r>
+              <w:rPr>
+                <w:rFonts w:ascii="맑은 고딕" w:eastAsia="맑은 고딕" w:hAnsi="맑은 고딕" w:cs="굴림" w:hint="eastAsia"/>
+                <w:color w:val="000000"/>
+                <w:kern w:val="0"/>
+                <w:sz w:val="14"/>
+                <w:szCs w:val="14"/>
+                <w14:ligatures w14:val="none"/>
+              </w:rPr>
+              <w:t xml:space="preserve"> 및 한전 전기사용 신청 등에 협조하여야 하며, 서비스제공자에게 위탁한 충전 시설이 설치된 주차면을 전기차 </w:t>
+            </w:r>
+            <w:proofErr w:type="spellStart"/>
+            <w:r>
+              <w:rPr>
+                <w:rFonts w:ascii="맑은 고딕" w:eastAsia="맑은 고딕" w:hAnsi="맑은 고딕" w:cs="굴림" w:hint="eastAsia"/>
+                <w:color w:val="000000"/>
+                <w:kern w:val="0"/>
+                <w:sz w:val="14"/>
+                <w:szCs w:val="14"/>
+                <w14:ligatures w14:val="none"/>
+              </w:rPr>
+              <w:t>전용면으</w:t>
+            </w:r>
+            <w:proofErr w:type="spellEnd"/>
           </w:p>
           <w:p>
             <w:pPr>
@@ -1871,7 +2056,31 @@
                 <w:szCs w:val="14"/>
                 <w14:ligatures w14:val="none"/>
               </w:rPr>
-              <w:t>   로 무상 제공•운영하여야 한다.</w:t>
+              <w:t xml:space="preserve">   로 무상 </w:t>
+            </w:r>
+            <w:proofErr w:type="spellStart"/>
+            <w:r>
+              <w:rPr>
+                <w:rFonts w:ascii="맑은 고딕" w:eastAsia="맑은 고딕" w:hAnsi="맑은 고딕" w:cs="굴림" w:hint="eastAsia"/>
+                <w:color w:val="000000"/>
+                <w:kern w:val="0"/>
+                <w:sz w:val="14"/>
+                <w:szCs w:val="14"/>
+                <w14:ligatures w14:val="none"/>
+              </w:rPr>
+              <w:t>제공•운영하여야</w:t>
+            </w:r>
+            <w:proofErr w:type="spellEnd"/>
+            <w:r>
+              <w:rPr>
+                <w:rFonts w:ascii="맑은 고딕" w:eastAsia="맑은 고딕" w:hAnsi="맑은 고딕" w:cs="굴림" w:hint="eastAsia"/>
+                <w:color w:val="000000"/>
+                <w:kern w:val="0"/>
+                <w:sz w:val="14"/>
+                <w:szCs w:val="14"/>
+                <w14:ligatures w14:val="none"/>
+              </w:rPr>
+              <w:t xml:space="preserve"> 한다.</w:t>
             </w:r>
           </w:p>
           <w:p>
@@ -2095,7 +2304,31 @@
                 <w:szCs w:val="14"/>
                 <w14:ligatures w14:val="none"/>
               </w:rPr>
-              <w:t>   지, 차단기 복구 등의 간단조치는 협조하며, 서비스제공자가 충전기 유지보수를 위해 서비스이용자에게 요구하는 경우, 설치 장소로의 진입을 허용하고 충전기의 멸실 및 훼손이 발생한 경우 즉시 서비스제공자에게 통지하여야 한다.</w:t>
+              <w:t xml:space="preserve">   지, 차단기 복구 등의 간단조치는 협조하며, 서비스제공자가 충전기 유지보수를 위해 서비스이용자에게 요구하는 경우, 설치 장소로의 진입을 허용하고 충전기의 </w:t>
+            </w:r>
+            <w:proofErr w:type="spellStart"/>
+            <w:r>
+              <w:rPr>
+                <w:rFonts w:ascii="맑은 고딕" w:eastAsia="맑은 고딕" w:hAnsi="맑은 고딕" w:cs="굴림" w:hint="eastAsia"/>
+                <w:color w:val="000000"/>
+                <w:kern w:val="0"/>
+                <w:sz w:val="14"/>
+                <w:szCs w:val="14"/>
+                <w14:ligatures w14:val="none"/>
+              </w:rPr>
+              <w:t>멸실</w:t>
+            </w:r>
+            <w:proofErr w:type="spellEnd"/>
+            <w:r>
+              <w:rPr>
+                <w:rFonts w:ascii="맑은 고딕" w:eastAsia="맑은 고딕" w:hAnsi="맑은 고딕" w:cs="굴림" w:hint="eastAsia"/>
+                <w:color w:val="000000"/>
+                <w:kern w:val="0"/>
+                <w:sz w:val="14"/>
+                <w:szCs w:val="14"/>
+                <w14:ligatures w14:val="none"/>
+              </w:rPr>
+              <w:t xml:space="preserve"> 및 훼손이 발생한 경우 즉시 서비스제공자에게 통지하여야 한다.</w:t>
             </w:r>
           </w:p>
           <w:p>
@@ -2235,8 +2468,21 @@
                 <w:szCs w:val="14"/>
                 <w14:ligatures w14:val="none"/>
               </w:rPr>
-              <w:t>⑥ 충전요금은 한국 전력의 전기요금, 환경부 충전요금 인상 또는 사업자의 사정에 따라 사업자가 변동할 수 있으며, 서비스제공자는 홈페</w:t>
-            </w:r>
+              <w:t xml:space="preserve">⑥ 충전요금은 한국 전력의 전기요금, 환경부 충전요금 인상 또는 사업자의 사정에 따라 사업자가 변동할 수 있으며, 서비스제공자는 </w:t>
+            </w:r>
+            <w:proofErr w:type="spellStart"/>
+            <w:r>
+              <w:rPr>
+                <w:rFonts w:ascii="맑은 고딕" w:eastAsia="맑은 고딕" w:hAnsi="맑은 고딕" w:cs="굴림" w:hint="eastAsia"/>
+                <w:color w:val="000000"/>
+                <w:kern w:val="0"/>
+                <w:sz w:val="14"/>
+                <w:szCs w:val="14"/>
+                <w14:ligatures w14:val="none"/>
+              </w:rPr>
+              <w:t>홈페</w:t>
+            </w:r>
+            <w:proofErr w:type="spellEnd"/>
           </w:p>
           <w:p>
             <w:pPr>
@@ -2263,7 +2509,31 @@
                 <w:szCs w:val="14"/>
                 <w14:ligatures w14:val="none"/>
               </w:rPr>
-              <w:t>   이지 및 모바일 앱(APP)에 미리 고지하여 알린다.</w:t>
+              <w:t>   이지 및 모바일 앱(APP)</w:t>
+            </w:r>
+            <w:proofErr w:type="spellStart"/>
+            <w:r>
+              <w:rPr>
+                <w:rFonts w:ascii="맑은 고딕" w:eastAsia="맑은 고딕" w:hAnsi="맑은 고딕" w:cs="굴림" w:hint="eastAsia"/>
+                <w:color w:val="000000"/>
+                <w:kern w:val="0"/>
+                <w:sz w:val="14"/>
+                <w:szCs w:val="14"/>
+                <w14:ligatures w14:val="none"/>
+              </w:rPr>
+              <w:t>에</w:t>
+            </w:r>
+            <w:proofErr w:type="spellEnd"/>
+            <w:r>
+              <w:rPr>
+                <w:rFonts w:ascii="맑은 고딕" w:eastAsia="맑은 고딕" w:hAnsi="맑은 고딕" w:cs="굴림" w:hint="eastAsia"/>
+                <w:color w:val="000000"/>
+                <w:kern w:val="0"/>
+                <w:sz w:val="14"/>
+                <w:szCs w:val="14"/>
+                <w14:ligatures w14:val="none"/>
+              </w:rPr>
+              <w:t xml:space="preserve"> 미리 고지하여 알린다.</w:t>
             </w:r>
           </w:p>
           <w:p>
@@ -2375,7 +2645,31 @@
                 <w:szCs w:val="14"/>
                 <w14:ligatures w14:val="none"/>
               </w:rPr>
-              <w:t xml:space="preserve">⑨ 본 계약에 의해 설치된 시설물(주차면 글씨/도색 포함)에 변동, 변경 필요 시 사전에 서비스이용자와 서비스제공자가 상호 협의하여야 </w:t>
+              <w:t>⑨ 본 계약에 의해 설치된 시설물(주차면 글씨/도색 포함)</w:t>
+            </w:r>
+            <w:proofErr w:type="spellStart"/>
+            <w:r>
+              <w:rPr>
+                <w:rFonts w:ascii="맑은 고딕" w:eastAsia="맑은 고딕" w:hAnsi="맑은 고딕" w:cs="굴림" w:hint="eastAsia"/>
+                <w:color w:val="000000"/>
+                <w:kern w:val="0"/>
+                <w:sz w:val="14"/>
+                <w:szCs w:val="14"/>
+                <w14:ligatures w14:val="none"/>
+              </w:rPr>
+              <w:t>에</w:t>
+            </w:r>
+            <w:proofErr w:type="spellEnd"/>
+            <w:r>
+              <w:rPr>
+                <w:rFonts w:ascii="맑은 고딕" w:eastAsia="맑은 고딕" w:hAnsi="맑은 고딕" w:cs="굴림" w:hint="eastAsia"/>
+                <w:color w:val="000000"/>
+                <w:kern w:val="0"/>
+                <w:sz w:val="14"/>
+                <w:szCs w:val="14"/>
+                <w14:ligatures w14:val="none"/>
+              </w:rPr>
+              <w:t xml:space="preserve"> 변동, 변경 필요 시 사전에 서비스이용자와 서비스제공자가 상호 협의하여야 </w:t>
             </w:r>
           </w:p>
           <w:p>
@@ -2459,7 +2753,55 @@
                 <w:szCs w:val="14"/>
                 <w14:ligatures w14:val="none"/>
               </w:rPr>
-              <w:t>   시설 운영불가에 따른 운영손실비(완속충전기 기당 1일/1만원)를 서비스제공자에게 납부한다.</w:t>
+              <w:t>   시설 운영불가에 따른 운영손실비(</w:t>
+            </w:r>
+            <w:proofErr w:type="spellStart"/>
+            <w:r>
+              <w:rPr>
+                <w:rFonts w:ascii="맑은 고딕" w:eastAsia="맑은 고딕" w:hAnsi="맑은 고딕" w:cs="굴림" w:hint="eastAsia"/>
+                <w:color w:val="000000"/>
+                <w:kern w:val="0"/>
+                <w:sz w:val="14"/>
+                <w:szCs w:val="14"/>
+                <w14:ligatures w14:val="none"/>
+              </w:rPr>
+              <w:t>완속충전기</w:t>
+            </w:r>
+            <w:proofErr w:type="spellEnd"/>
+            <w:r>
+              <w:rPr>
+                <w:rFonts w:ascii="맑은 고딕" w:eastAsia="맑은 고딕" w:hAnsi="맑은 고딕" w:cs="굴림" w:hint="eastAsia"/>
+                <w:color w:val="000000"/>
+                <w:kern w:val="0"/>
+                <w:sz w:val="14"/>
+                <w:szCs w:val="14"/>
+                <w14:ligatures w14:val="none"/>
+              </w:rPr>
+              <w:t xml:space="preserve"> 기당 1일/1만원)</w:t>
+            </w:r>
+            <w:proofErr w:type="spellStart"/>
+            <w:r>
+              <w:rPr>
+                <w:rFonts w:ascii="맑은 고딕" w:eastAsia="맑은 고딕" w:hAnsi="맑은 고딕" w:cs="굴림" w:hint="eastAsia"/>
+                <w:color w:val="000000"/>
+                <w:kern w:val="0"/>
+                <w:sz w:val="14"/>
+                <w:szCs w:val="14"/>
+                <w14:ligatures w14:val="none"/>
+              </w:rPr>
+              <w:t>를</w:t>
+            </w:r>
+            <w:proofErr w:type="spellEnd"/>
+            <w:r>
+              <w:rPr>
+                <w:rFonts w:ascii="맑은 고딕" w:eastAsia="맑은 고딕" w:hAnsi="맑은 고딕" w:cs="굴림" w:hint="eastAsia"/>
+                <w:color w:val="000000"/>
+                <w:kern w:val="0"/>
+                <w:sz w:val="14"/>
+                <w:szCs w:val="14"/>
+                <w14:ligatures w14:val="none"/>
+              </w:rPr>
+              <w:t xml:space="preserve"> 서비스제공자에게 납부한다.</w:t>
             </w:r>
           </w:p>
           <w:p>
@@ -2487,7 +2829,79 @@
                 <w:szCs w:val="14"/>
                 <w14:ligatures w14:val="none"/>
               </w:rPr>
-              <w:t>⑩ 서비스이용자는‘공동주택관리법 제35조5항’에 의거하여 충전기 설치공사를 완료했을 때 시장·군수·구청장의 사용검사 필증을 발급받아야</w:t>
+              <w:t xml:space="preserve">⑩ </w:t>
+            </w:r>
+            <w:proofErr w:type="spellStart"/>
+            <w:r>
+              <w:rPr>
+                <w:rFonts w:ascii="맑은 고딕" w:eastAsia="맑은 고딕" w:hAnsi="맑은 고딕" w:cs="굴림" w:hint="eastAsia"/>
+                <w:color w:val="000000"/>
+                <w:kern w:val="0"/>
+                <w:sz w:val="14"/>
+                <w:szCs w:val="14"/>
+                <w14:ligatures w14:val="none"/>
+              </w:rPr>
+              <w:t>서비스이용자는‘공동주택관리법</w:t>
+            </w:r>
+            <w:proofErr w:type="spellEnd"/>
+            <w:r>
+              <w:rPr>
+                <w:rFonts w:ascii="맑은 고딕" w:eastAsia="맑은 고딕" w:hAnsi="맑은 고딕" w:cs="굴림" w:hint="eastAsia"/>
+                <w:color w:val="000000"/>
+                <w:kern w:val="0"/>
+                <w:sz w:val="14"/>
+                <w:szCs w:val="14"/>
+                <w14:ligatures w14:val="none"/>
+              </w:rPr>
+              <w:t xml:space="preserve"> 제35조5항’에 의거하여 충전기 설치공사를 완료했을 때 </w:t>
+            </w:r>
+            <w:proofErr w:type="spellStart"/>
+            <w:r>
+              <w:rPr>
+                <w:rFonts w:ascii="맑은 고딕" w:eastAsia="맑은 고딕" w:hAnsi="맑은 고딕" w:cs="굴림" w:hint="eastAsia"/>
+                <w:color w:val="000000"/>
+                <w:kern w:val="0"/>
+                <w:sz w:val="14"/>
+                <w:szCs w:val="14"/>
+                <w14:ligatures w14:val="none"/>
+              </w:rPr>
+              <w:t>시장·군수·구청장의</w:t>
+            </w:r>
+            <w:proofErr w:type="spellEnd"/>
+            <w:r>
+              <w:rPr>
+                <w:rFonts w:ascii="맑은 고딕" w:eastAsia="맑은 고딕" w:hAnsi="맑은 고딕" w:cs="굴림" w:hint="eastAsia"/>
+                <w:color w:val="000000"/>
+                <w:kern w:val="0"/>
+                <w:sz w:val="14"/>
+                <w:szCs w:val="14"/>
+                <w14:ligatures w14:val="none"/>
+              </w:rPr>
+              <w:t xml:space="preserve"> 사용검사 </w:t>
+            </w:r>
+            <w:proofErr w:type="spellStart"/>
+            <w:r>
+              <w:rPr>
+                <w:rFonts w:ascii="맑은 고딕" w:eastAsia="맑은 고딕" w:hAnsi="맑은 고딕" w:cs="굴림" w:hint="eastAsia"/>
+                <w:color w:val="000000"/>
+                <w:kern w:val="0"/>
+                <w:sz w:val="14"/>
+                <w:szCs w:val="14"/>
+                <w14:ligatures w14:val="none"/>
+              </w:rPr>
+              <w:t>필증을</w:t>
+            </w:r>
+            <w:proofErr w:type="spellEnd"/>
+            <w:r>
+              <w:rPr>
+                <w:rFonts w:ascii="맑은 고딕" w:eastAsia="맑은 고딕" w:hAnsi="맑은 고딕" w:cs="굴림" w:hint="eastAsia"/>
+                <w:color w:val="000000"/>
+                <w:kern w:val="0"/>
+                <w:sz w:val="14"/>
+                <w:szCs w:val="14"/>
+                <w14:ligatures w14:val="none"/>
+              </w:rPr>
+              <w:t xml:space="preserve"> 발급받아야</w:t>
             </w:r>
           </w:p>
           <w:p>
@@ -2543,7 +2957,55 @@
                 <w:szCs w:val="14"/>
                 <w14:ligatures w14:val="none"/>
               </w:rPr>
-              <w:t>⑪ 서비스이용자는 『환경친화적 자동차의 개발 및 보급 촉진에 관한 법률』에 따라 “충전소”운영을 방해하는 행위를 할 수 없다. 운영 중인</w:t>
+              <w:t xml:space="preserve">⑪ 서비스이용자는 『환경친화적 자동차의 개발 및 보급 촉진에 관한 </w:t>
+            </w:r>
+            <w:proofErr w:type="spellStart"/>
+            <w:r>
+              <w:rPr>
+                <w:rFonts w:ascii="맑은 고딕" w:eastAsia="맑은 고딕" w:hAnsi="맑은 고딕" w:cs="굴림" w:hint="eastAsia"/>
+                <w:color w:val="000000"/>
+                <w:kern w:val="0"/>
+                <w:sz w:val="14"/>
+                <w:szCs w:val="14"/>
+                <w14:ligatures w14:val="none"/>
+              </w:rPr>
+              <w:t>법률』에</w:t>
+            </w:r>
+            <w:proofErr w:type="spellEnd"/>
+            <w:r>
+              <w:rPr>
+                <w:rFonts w:ascii="맑은 고딕" w:eastAsia="맑은 고딕" w:hAnsi="맑은 고딕" w:cs="굴림" w:hint="eastAsia"/>
+                <w:color w:val="000000"/>
+                <w:kern w:val="0"/>
+                <w:sz w:val="14"/>
+                <w:szCs w:val="14"/>
+                <w14:ligatures w14:val="none"/>
+              </w:rPr>
+              <w:t xml:space="preserve"> 따라 “</w:t>
+            </w:r>
+            <w:proofErr w:type="spellStart"/>
+            <w:r>
+              <w:rPr>
+                <w:rFonts w:ascii="맑은 고딕" w:eastAsia="맑은 고딕" w:hAnsi="맑은 고딕" w:cs="굴림" w:hint="eastAsia"/>
+                <w:color w:val="000000"/>
+                <w:kern w:val="0"/>
+                <w:sz w:val="14"/>
+                <w:szCs w:val="14"/>
+                <w14:ligatures w14:val="none"/>
+              </w:rPr>
+              <w:t>충전소”운영을</w:t>
+            </w:r>
+            <w:proofErr w:type="spellEnd"/>
+            <w:r>
+              <w:rPr>
+                <w:rFonts w:ascii="맑은 고딕" w:eastAsia="맑은 고딕" w:hAnsi="맑은 고딕" w:cs="굴림" w:hint="eastAsia"/>
+                <w:color w:val="000000"/>
+                <w:kern w:val="0"/>
+                <w:sz w:val="14"/>
+                <w:szCs w:val="14"/>
+                <w14:ligatures w14:val="none"/>
+              </w:rPr>
+              <w:t xml:space="preserve"> 방해하는 행위를 할 수 없다. 운영 중인</w:t>
             </w:r>
           </w:p>
           <w:p>
@@ -2599,7 +3061,31 @@
                 <w:szCs w:val="14"/>
                 <w14:ligatures w14:val="none"/>
               </w:rPr>
-              <w:t>   에 따른 환경부 및 관할 지자체의 공공기관에 해당 사실을 민원 공유를 진행한다.</w:t>
+              <w:t>   </w:t>
+            </w:r>
+            <w:proofErr w:type="spellStart"/>
+            <w:r>
+              <w:rPr>
+                <w:rFonts w:ascii="맑은 고딕" w:eastAsia="맑은 고딕" w:hAnsi="맑은 고딕" w:cs="굴림" w:hint="eastAsia"/>
+                <w:color w:val="000000"/>
+                <w:kern w:val="0"/>
+                <w:sz w:val="14"/>
+                <w:szCs w:val="14"/>
+                <w14:ligatures w14:val="none"/>
+              </w:rPr>
+              <w:t>에</w:t>
+            </w:r>
+            <w:proofErr w:type="spellEnd"/>
+            <w:r>
+              <w:rPr>
+                <w:rFonts w:ascii="맑은 고딕" w:eastAsia="맑은 고딕" w:hAnsi="맑은 고딕" w:cs="굴림" w:hint="eastAsia"/>
+                <w:color w:val="000000"/>
+                <w:kern w:val="0"/>
+                <w:sz w:val="14"/>
+                <w:szCs w:val="14"/>
+                <w14:ligatures w14:val="none"/>
+              </w:rPr>
+              <w:t xml:space="preserve"> 따른 환경부 및 관할 지자체의 공공기관에 해당 사실을 민원 공유를 진행한다.</w:t>
             </w:r>
           </w:p>
           <w:p>
@@ -2683,8 +3169,23 @@
                 <w:szCs w:val="15"/>
                 <w14:ligatures w14:val="none"/>
               </w:rPr>
-              <w:t>제2조 계약의 해제•해지</w:t>
-            </w:r>
+              <w:t xml:space="preserve">제2조 계약의 </w:t>
+            </w:r>
+            <w:proofErr w:type="spellStart"/>
+            <w:r>
+              <w:rPr>
+                <w:rFonts w:ascii="맑은 고딕" w:eastAsia="맑은 고딕" w:hAnsi="맑은 고딕" w:cs="굴림" w:hint="eastAsia"/>
+                <w:b/>
+                <w:bCs/>
+                <w:color w:val="000000"/>
+                <w:kern w:val="0"/>
+                <w:sz w:val="15"/>
+                <w:szCs w:val="15"/>
+                <w14:ligatures w14:val="none"/>
+              </w:rPr>
+              <w:t>해제•해지</w:t>
+            </w:r>
+            <w:proofErr w:type="spellEnd"/>
           </w:p>
           <w:p>
             <w:pPr>
@@ -2711,7 +3212,55 @@
                 <w:szCs w:val="14"/>
                 <w14:ligatures w14:val="none"/>
               </w:rPr>
-              <w:t>① 설치된 충전기는 준공일(설치완료확인서기준)로부터 계약기간 동안 의무로 사용하여야 하며 중도 해제•해지 경우 보조금 환수 및 위약</w:t>
+              <w:t>① 설치된 충전기는 준공일(</w:t>
+            </w:r>
+            <w:proofErr w:type="spellStart"/>
+            <w:r>
+              <w:rPr>
+                <w:rFonts w:ascii="맑은 고딕" w:eastAsia="맑은 고딕" w:hAnsi="맑은 고딕" w:cs="굴림" w:hint="eastAsia"/>
+                <w:color w:val="000000"/>
+                <w:kern w:val="0"/>
+                <w:sz w:val="14"/>
+                <w:szCs w:val="14"/>
+                <w14:ligatures w14:val="none"/>
+              </w:rPr>
+              <w:t>설치완료확인서기준</w:t>
+            </w:r>
+            <w:proofErr w:type="spellEnd"/>
+            <w:r>
+              <w:rPr>
+                <w:rFonts w:ascii="맑은 고딕" w:eastAsia="맑은 고딕" w:hAnsi="맑은 고딕" w:cs="굴림" w:hint="eastAsia"/>
+                <w:color w:val="000000"/>
+                <w:kern w:val="0"/>
+                <w:sz w:val="14"/>
+                <w:szCs w:val="14"/>
+                <w14:ligatures w14:val="none"/>
+              </w:rPr>
+              <w:t xml:space="preserve">)로부터 계약기간 동안 의무로 사용하여야 하며 중도 </w:t>
+            </w:r>
+            <w:proofErr w:type="spellStart"/>
+            <w:r>
+              <w:rPr>
+                <w:rFonts w:ascii="맑은 고딕" w:eastAsia="맑은 고딕" w:hAnsi="맑은 고딕" w:cs="굴림" w:hint="eastAsia"/>
+                <w:color w:val="000000"/>
+                <w:kern w:val="0"/>
+                <w:sz w:val="14"/>
+                <w:szCs w:val="14"/>
+                <w14:ligatures w14:val="none"/>
+              </w:rPr>
+              <w:t>해제•해지</w:t>
+            </w:r>
+            <w:proofErr w:type="spellEnd"/>
+            <w:r>
+              <w:rPr>
+                <w:rFonts w:ascii="맑은 고딕" w:eastAsia="맑은 고딕" w:hAnsi="맑은 고딕" w:cs="굴림" w:hint="eastAsia"/>
+                <w:color w:val="000000"/>
+                <w:kern w:val="0"/>
+                <w:sz w:val="14"/>
+                <w:szCs w:val="14"/>
+                <w14:ligatures w14:val="none"/>
+              </w:rPr>
+              <w:t xml:space="preserve"> 경우 보조금 환수 및 위약</w:t>
             </w:r>
           </w:p>
           <w:p>
@@ -2879,7 +3428,79 @@
                 <w:szCs w:val="14"/>
                 <w14:ligatures w14:val="none"/>
               </w:rPr>
-              <w:t>③ 서비스이용자의 책임있는 사유(제2항의 각호)로 본 계약이 해제•해지될 경우 계약 해제•해지일로부터1개월 이내 각 전기차 충전시설에</w:t>
+              <w:t xml:space="preserve">③ 서비스이용자의 </w:t>
+            </w:r>
+            <w:proofErr w:type="spellStart"/>
+            <w:r>
+              <w:rPr>
+                <w:rFonts w:ascii="맑은 고딕" w:eastAsia="맑은 고딕" w:hAnsi="맑은 고딕" w:cs="굴림" w:hint="eastAsia"/>
+                <w:color w:val="000000"/>
+                <w:kern w:val="0"/>
+                <w:sz w:val="14"/>
+                <w:szCs w:val="14"/>
+                <w14:ligatures w14:val="none"/>
+              </w:rPr>
+              <w:t>책임있는</w:t>
+            </w:r>
+            <w:proofErr w:type="spellEnd"/>
+            <w:r>
+              <w:rPr>
+                <w:rFonts w:ascii="맑은 고딕" w:eastAsia="맑은 고딕" w:hAnsi="맑은 고딕" w:cs="굴림" w:hint="eastAsia"/>
+                <w:color w:val="000000"/>
+                <w:kern w:val="0"/>
+                <w:sz w:val="14"/>
+                <w:szCs w:val="14"/>
+                <w14:ligatures w14:val="none"/>
+              </w:rPr>
+              <w:t xml:space="preserve"> 사유(제2항의 각호)로 본 계약이 </w:t>
+            </w:r>
+            <w:proofErr w:type="spellStart"/>
+            <w:r>
+              <w:rPr>
+                <w:rFonts w:ascii="맑은 고딕" w:eastAsia="맑은 고딕" w:hAnsi="맑은 고딕" w:cs="굴림" w:hint="eastAsia"/>
+                <w:color w:val="000000"/>
+                <w:kern w:val="0"/>
+                <w:sz w:val="14"/>
+                <w:szCs w:val="14"/>
+                <w14:ligatures w14:val="none"/>
+              </w:rPr>
+              <w:t>해제•해지될</w:t>
+            </w:r>
+            <w:proofErr w:type="spellEnd"/>
+            <w:r>
+              <w:rPr>
+                <w:rFonts w:ascii="맑은 고딕" w:eastAsia="맑은 고딕" w:hAnsi="맑은 고딕" w:cs="굴림" w:hint="eastAsia"/>
+                <w:color w:val="000000"/>
+                <w:kern w:val="0"/>
+                <w:sz w:val="14"/>
+                <w:szCs w:val="14"/>
+                <w14:ligatures w14:val="none"/>
+              </w:rPr>
+              <w:t xml:space="preserve"> 경우 계약 </w:t>
+            </w:r>
+            <w:proofErr w:type="spellStart"/>
+            <w:r>
+              <w:rPr>
+                <w:rFonts w:ascii="맑은 고딕" w:eastAsia="맑은 고딕" w:hAnsi="맑은 고딕" w:cs="굴림" w:hint="eastAsia"/>
+                <w:color w:val="000000"/>
+                <w:kern w:val="0"/>
+                <w:sz w:val="14"/>
+                <w:szCs w:val="14"/>
+                <w14:ligatures w14:val="none"/>
+              </w:rPr>
+              <w:t>해제•해지일로부터</w:t>
+            </w:r>
+            <w:proofErr w:type="spellEnd"/>
+            <w:r>
+              <w:rPr>
+                <w:rFonts w:ascii="맑은 고딕" w:eastAsia="맑은 고딕" w:hAnsi="맑은 고딕" w:cs="굴림" w:hint="eastAsia"/>
+                <w:color w:val="000000"/>
+                <w:kern w:val="0"/>
+                <w:sz w:val="14"/>
+                <w:szCs w:val="14"/>
+                <w14:ligatures w14:val="none"/>
+              </w:rPr>
+              <w:t>1개월 이내 각 전기차 충전시설에</w:t>
             </w:r>
           </w:p>
           <w:p>
@@ -2935,7 +3556,31 @@
                 <w14:ligatures w14:val="none"/>
               </w:rPr>
               <w:lastRenderedPageBreak/>
-              <w:t>   * 위약금 산정 방식: 기 투입비용(전기차 충전시설 설치비용) X (잔여 개월/약정 개월) + 철거비용+ 환경부 완속충전시설 보조금</w:t>
+              <w:t xml:space="preserve">   * 위약금 산정 방식: 기 투입비용(전기차 충전시설 설치비용) X (잔여 개월/약정 개월) + 철거비용+ 환경부 </w:t>
+            </w:r>
+            <w:proofErr w:type="spellStart"/>
+            <w:r>
+              <w:rPr>
+                <w:rFonts w:ascii="맑은 고딕" w:eastAsia="맑은 고딕" w:hAnsi="맑은 고딕" w:cs="굴림" w:hint="eastAsia"/>
+                <w:color w:val="000000"/>
+                <w:kern w:val="0"/>
+                <w:sz w:val="14"/>
+                <w:szCs w:val="14"/>
+                <w14:ligatures w14:val="none"/>
+              </w:rPr>
+              <w:t>완속충전시설</w:t>
+            </w:r>
+            <w:proofErr w:type="spellEnd"/>
+            <w:r>
+              <w:rPr>
+                <w:rFonts w:ascii="맑은 고딕" w:eastAsia="맑은 고딕" w:hAnsi="맑은 고딕" w:cs="굴림" w:hint="eastAsia"/>
+                <w:color w:val="000000"/>
+                <w:kern w:val="0"/>
+                <w:sz w:val="14"/>
+                <w:szCs w:val="14"/>
+                <w14:ligatures w14:val="none"/>
+              </w:rPr>
+              <w:t xml:space="preserve"> 보조금</w:t>
             </w:r>
           </w:p>
           <w:p>
@@ -2962,7 +3607,31 @@
                 <w:szCs w:val="14"/>
                 <w14:ligatures w14:val="none"/>
               </w:rPr>
-              <w:t>     (환수율/의무 운영 기간5년)</w:t>
+              <w:t>     (</w:t>
+            </w:r>
+            <w:proofErr w:type="spellStart"/>
+            <w:r>
+              <w:rPr>
+                <w:rFonts w:ascii="맑은 고딕" w:eastAsia="맑은 고딕" w:hAnsi="맑은 고딕" w:cs="굴림" w:hint="eastAsia"/>
+                <w:color w:val="000000"/>
+                <w:kern w:val="0"/>
+                <w:sz w:val="14"/>
+                <w:szCs w:val="14"/>
+                <w14:ligatures w14:val="none"/>
+              </w:rPr>
+              <w:t>환수율</w:t>
+            </w:r>
+            <w:proofErr w:type="spellEnd"/>
+            <w:r>
+              <w:rPr>
+                <w:rFonts w:ascii="맑은 고딕" w:eastAsia="맑은 고딕" w:hAnsi="맑은 고딕" w:cs="굴림" w:hint="eastAsia"/>
+                <w:color w:val="000000"/>
+                <w:kern w:val="0"/>
+                <w:sz w:val="14"/>
+                <w:szCs w:val="14"/>
+                <w14:ligatures w14:val="none"/>
+              </w:rPr>
+              <w:t>/의무 운영 기간5년)</w:t>
             </w:r>
           </w:p>
           <w:p>
@@ -3679,7 +4348,31 @@
                 <w:szCs w:val="17"/>
                 <w14:ligatures w14:val="none"/>
               </w:rPr>
-              <w:t> SK일렉링크 주식회사    </w:t>
+              <w:t> SK</w:t>
+            </w:r>
+            <w:proofErr w:type="spellStart"/>
+            <w:r>
+              <w:rPr>
+                <w:rFonts w:ascii="맑은 고딕" w:eastAsia="맑은 고딕" w:hAnsi="맑은 고딕" w:cs="굴림" w:hint="eastAsia"/>
+                <w:color w:val="000000"/>
+                <w:kern w:val="0"/>
+                <w:sz w:val="17"/>
+                <w:szCs w:val="17"/>
+                <w14:ligatures w14:val="none"/>
+              </w:rPr>
+              <w:t>일렉링크</w:t>
+            </w:r>
+            <w:proofErr w:type="spellEnd"/>
+            <w:r>
+              <w:rPr>
+                <w:rFonts w:ascii="맑은 고딕" w:eastAsia="맑은 고딕" w:hAnsi="맑은 고딕" w:cs="굴림" w:hint="eastAsia"/>
+                <w:color w:val="000000"/>
+                <w:kern w:val="0"/>
+                <w:sz w:val="17"/>
+                <w:szCs w:val="17"/>
+                <w14:ligatures w14:val="none"/>
+              </w:rPr>
+              <w:t xml:space="preserve"> 주식회사    </w:t>
             </w:r>
             <w:r>
               <w:rPr>
@@ -3722,6 +4415,1797 @@
           <w14:ligatures w14:val="none"/>
         </w:rPr>
       </w:pPr>
+    </w:p>
+    <w:p>
+      <w:pPr>
+        <w:widowControl/>
+        <w:wordWrap/>
+        <w:autoSpaceDE/>
+        <w:autoSpaceDN/>
+        <w:rPr>
+          <w:rFonts w:ascii="맑은 고딕" w:eastAsia="맑은 고딕" w:hAnsi="맑은 고딕" w:cs="Times New Roman" w:hint="eastAsia"/>
+          <w:b/>
+          <w:bCs/>
+          <w:sz w:val="24"/>
+          <w:szCs w:val="28"/>
+          <w14:ligatures w14:val="none"/>
+        </w:rPr>
+      </w:pPr>
+      <w:r>
+        <w:rPr>
+          <w:rFonts w:ascii="맑은 고딕" w:eastAsia="맑은 고딕" w:hAnsi="맑은 고딕" w:cs="Times New Roman"/>
+          <w:b/>
+          <w:bCs/>
+          <w:sz w:val="24"/>
+          <w:szCs w:val="28"/>
+          <w14:ligatures w14:val="none"/>
+        </w:rPr>
+        <w:br w:type="page"/>
+      </w:r>
+    </w:p>
+    <w:p>
+      <w:pPr>
+        <w:widowControl/>
+        <w:wordWrap/>
+        <w:autoSpaceDE/>
+        <w:autoSpaceDN/>
+        <w:spacing w:after="0"/>
+        <w:rPr>
+          <w:rFonts w:ascii="맑은 고딕" w:eastAsia="맑은 고딕" w:hAnsi="맑은 고딕" w:cs="굴림"/>
+          <w:color w:val="000000"/>
+          <w:kern w:val="0"/>
+          <w:szCs w:val="22"/>
+          <w14:ligatures w14:val="none"/>
+        </w:rPr>
+      </w:pPr>
+      <w:r>
+        <w:rPr>
+          <w:rFonts w:ascii="맑은 고딕" w:eastAsia="맑은 고딕" w:hAnsi="맑은 고딕" w:cs="굴림" w:hint="eastAsia"/>
+          <w:b/>
+          <w:bCs/>
+          <w:color w:val="000000"/>
+          <w:kern w:val="0"/>
+          <w:sz w:val="17"/>
+          <w:szCs w:val="17"/>
+          <w14:ligatures w14:val="none"/>
+        </w:rPr>
+        <w:lastRenderedPageBreak/>
+        <w:t>[</w:t>
+      </w:r>
+      <w:r>
+        <w:rPr>
+          <w:rFonts w:ascii="맑은 고딕" w:eastAsia="맑은 고딕" w:hAnsi="맑은 고딕" w:cs="굴림" w:hint="eastAsia"/>
+          <w:b/>
+          <w:bCs/>
+          <w:color w:val="000000"/>
+          <w:kern w:val="0"/>
+          <w:sz w:val="17"/>
+          <w:szCs w:val="17"/>
+          <w14:ligatures w14:val="none"/>
+        </w:rPr>
+        <w:t>별첨1. SK</w:t>
+      </w:r>
+      <w:proofErr w:type="spellStart"/>
+      <w:r>
+        <w:rPr>
+          <w:rFonts w:ascii="맑은 고딕" w:eastAsia="맑은 고딕" w:hAnsi="맑은 고딕" w:cs="굴림" w:hint="eastAsia"/>
+          <w:b/>
+          <w:bCs/>
+          <w:color w:val="000000"/>
+          <w:kern w:val="0"/>
+          <w:sz w:val="17"/>
+          <w:szCs w:val="17"/>
+          <w14:ligatures w14:val="none"/>
+        </w:rPr>
+        <w:t>일렉링크</w:t>
+      </w:r>
+      <w:proofErr w:type="spellEnd"/>
+      <w:r>
+        <w:rPr>
+          <w:rFonts w:ascii="맑은 고딕" w:eastAsia="맑은 고딕" w:hAnsi="맑은 고딕" w:cs="굴림" w:hint="eastAsia"/>
+          <w:b/>
+          <w:bCs/>
+          <w:color w:val="000000"/>
+          <w:kern w:val="0"/>
+          <w:sz w:val="17"/>
+          <w:szCs w:val="17"/>
+          <w14:ligatures w14:val="none"/>
+        </w:rPr>
+        <w:t xml:space="preserve"> 충전요금]</w:t>
+      </w:r>
+    </w:p>
+    <w:tbl>
+      <w:tblPr>
+        <w:tblW w:w="0" w:type="auto"/>
+        <w:tblCellMar>
+          <w:left w:w="0" w:type="dxa"/>
+          <w:right w:w="0" w:type="dxa"/>
+        </w:tblCellMar>
+        <w:tblLook w:val="04A0" w:firstRow="1" w:lastRow="0" w:firstColumn="1" w:lastColumn="0" w:noHBand="0" w:noVBand="1"/>
+      </w:tblPr>
+      <w:tblGrid>
+        <w:gridCol w:w="1325"/>
+        <w:gridCol w:w="1485"/>
+        <w:gridCol w:w="2040"/>
+        <w:gridCol w:w="1860"/>
+        <w:gridCol w:w="1665"/>
+      </w:tblGrid>
+      <w:tr>
+        <w:trPr>
+          <w:trHeight w:val="270"/>
+        </w:trPr>
+        <w:tc>
+          <w:tcPr>
+            <w:tcW w:w="1325" w:type="dxa"/>
+            <w:vMerge w:val="restart"/>
+            <w:tcBorders>
+              <w:top w:val="single" w:sz="2" w:space="0" w:color="000000"/>
+              <w:left w:val="single" w:sz="2" w:space="0" w:color="000000"/>
+              <w:bottom w:val="single" w:sz="2" w:space="0" w:color="000000"/>
+              <w:right w:val="single" w:sz="2" w:space="0" w:color="000000"/>
+            </w:tcBorders>
+            <w:shd w:val="clear" w:color="auto" w:fill="FAE2D5"/>
+            <w:tcMar>
+              <w:top w:w="0" w:type="dxa"/>
+              <w:left w:w="105" w:type="dxa"/>
+              <w:bottom w:w="0" w:type="dxa"/>
+              <w:right w:w="105" w:type="dxa"/>
+            </w:tcMar>
+            <w:vAlign w:val="center"/>
+            <w:hideMark/>
+          </w:tcPr>
+          <w:p>
+            <w:pPr>
+              <w:widowControl/>
+              <w:wordWrap/>
+              <w:autoSpaceDE/>
+              <w:autoSpaceDN/>
+              <w:spacing w:after="0"/>
+              <w:jc w:val="center"/>
+              <w:rPr>
+                <w:rFonts w:ascii="맑은 고딕" w:eastAsia="맑은 고딕" w:hAnsi="맑은 고딕" w:cs="굴림"/>
+                <w:color w:val="000000"/>
+                <w:kern w:val="0"/>
+                <w:szCs w:val="22"/>
+                <w14:ligatures w14:val="none"/>
+              </w:rPr>
+            </w:pPr>
+            <w:r>
+              <w:rPr>
+                <w:rFonts w:ascii="맑은 고딕" w:eastAsia="맑은 고딕" w:hAnsi="맑은 고딕" w:cs="굴림" w:hint="eastAsia"/>
+                <w:b/>
+                <w:bCs/>
+                <w:color w:val="000000"/>
+                <w:kern w:val="0"/>
+                <w:sz w:val="16"/>
+                <w:szCs w:val="16"/>
+                <w14:ligatures w14:val="none"/>
+              </w:rPr>
+              <w:t>구분</w:t>
+            </w:r>
+          </w:p>
+        </w:tc>
+        <w:tc>
+          <w:tcPr>
+            <w:tcW w:w="1485" w:type="dxa"/>
+            <w:vMerge w:val="restart"/>
+            <w:tcBorders>
+              <w:top w:val="single" w:sz="2" w:space="0" w:color="000000"/>
+              <w:left w:val="single" w:sz="2" w:space="0" w:color="000000"/>
+              <w:bottom w:val="single" w:sz="2" w:space="0" w:color="000000"/>
+              <w:right w:val="single" w:sz="2" w:space="0" w:color="000000"/>
+            </w:tcBorders>
+            <w:shd w:val="clear" w:color="auto" w:fill="FAE2D5"/>
+            <w:tcMar>
+              <w:top w:w="0" w:type="dxa"/>
+              <w:left w:w="105" w:type="dxa"/>
+              <w:bottom w:w="0" w:type="dxa"/>
+              <w:right w:w="105" w:type="dxa"/>
+            </w:tcMar>
+            <w:vAlign w:val="center"/>
+            <w:hideMark/>
+          </w:tcPr>
+          <w:p>
+            <w:pPr>
+              <w:widowControl/>
+              <w:wordWrap/>
+              <w:autoSpaceDE/>
+              <w:autoSpaceDN/>
+              <w:spacing w:after="0"/>
+              <w:jc w:val="center"/>
+              <w:rPr>
+                <w:rFonts w:ascii="맑은 고딕" w:eastAsia="맑은 고딕" w:hAnsi="맑은 고딕" w:cs="굴림"/>
+                <w:color w:val="000000"/>
+                <w:kern w:val="0"/>
+                <w:szCs w:val="22"/>
+                <w14:ligatures w14:val="none"/>
+              </w:rPr>
+            </w:pPr>
+            <w:r>
+              <w:rPr>
+                <w:rFonts w:ascii="맑은 고딕" w:eastAsia="맑은 고딕" w:hAnsi="맑은 고딕" w:cs="굴림" w:hint="eastAsia"/>
+                <w:b/>
+                <w:bCs/>
+                <w:color w:val="000000"/>
+                <w:kern w:val="0"/>
+                <w:sz w:val="16"/>
+                <w:szCs w:val="16"/>
+                <w14:ligatures w14:val="none"/>
+              </w:rPr>
+              <w:t>계약기간</w:t>
+            </w:r>
+          </w:p>
+        </w:tc>
+        <w:tc>
+          <w:tcPr>
+            <w:tcW w:w="2040" w:type="dxa"/>
+            <w:vMerge w:val="restart"/>
+            <w:tcBorders>
+              <w:top w:val="single" w:sz="2" w:space="0" w:color="000000"/>
+              <w:left w:val="single" w:sz="2" w:space="0" w:color="000000"/>
+              <w:bottom w:val="single" w:sz="2" w:space="0" w:color="000000"/>
+              <w:right w:val="single" w:sz="2" w:space="0" w:color="000000"/>
+            </w:tcBorders>
+            <w:shd w:val="clear" w:color="auto" w:fill="FAE2D5"/>
+            <w:tcMar>
+              <w:top w:w="0" w:type="dxa"/>
+              <w:left w:w="105" w:type="dxa"/>
+              <w:bottom w:w="0" w:type="dxa"/>
+              <w:right w:w="105" w:type="dxa"/>
+            </w:tcMar>
+            <w:vAlign w:val="center"/>
+            <w:hideMark/>
+          </w:tcPr>
+          <w:p>
+            <w:pPr>
+              <w:widowControl/>
+              <w:wordWrap/>
+              <w:autoSpaceDE/>
+              <w:autoSpaceDN/>
+              <w:spacing w:after="0"/>
+              <w:jc w:val="center"/>
+              <w:rPr>
+                <w:rFonts w:ascii="맑은 고딕" w:eastAsia="맑은 고딕" w:hAnsi="맑은 고딕" w:cs="굴림"/>
+                <w:color w:val="000000"/>
+                <w:kern w:val="0"/>
+                <w:szCs w:val="22"/>
+                <w14:ligatures w14:val="none"/>
+              </w:rPr>
+            </w:pPr>
+            <w:r>
+              <w:rPr>
+                <w:rFonts w:ascii="맑은 고딕" w:eastAsia="맑은 고딕" w:hAnsi="맑은 고딕" w:cs="굴림" w:hint="eastAsia"/>
+                <w:b/>
+                <w:bCs/>
+                <w:color w:val="000000"/>
+                <w:kern w:val="0"/>
+                <w:sz w:val="16"/>
+                <w:szCs w:val="16"/>
+                <w14:ligatures w14:val="none"/>
+              </w:rPr>
+              <w:t>충전단가</w:t>
+            </w:r>
+          </w:p>
+        </w:tc>
+        <w:tc>
+          <w:tcPr>
+            <w:tcW w:w="3525" w:type="dxa"/>
+            <w:gridSpan w:val="2"/>
+            <w:tcBorders>
+              <w:top w:val="single" w:sz="2" w:space="0" w:color="000000"/>
+              <w:left w:val="single" w:sz="2" w:space="0" w:color="000000"/>
+              <w:bottom w:val="single" w:sz="2" w:space="0" w:color="000000"/>
+              <w:right w:val="single" w:sz="2" w:space="0" w:color="000000"/>
+            </w:tcBorders>
+            <w:shd w:val="clear" w:color="auto" w:fill="FAE2D5"/>
+            <w:tcMar>
+              <w:top w:w="0" w:type="dxa"/>
+              <w:left w:w="105" w:type="dxa"/>
+              <w:bottom w:w="0" w:type="dxa"/>
+              <w:right w:w="105" w:type="dxa"/>
+            </w:tcMar>
+            <w:vAlign w:val="center"/>
+            <w:hideMark/>
+          </w:tcPr>
+          <w:p>
+            <w:pPr>
+              <w:widowControl/>
+              <w:wordWrap/>
+              <w:autoSpaceDE/>
+              <w:autoSpaceDN/>
+              <w:spacing w:after="0"/>
+              <w:jc w:val="center"/>
+              <w:rPr>
+                <w:rFonts w:ascii="맑은 고딕" w:eastAsia="맑은 고딕" w:hAnsi="맑은 고딕" w:cs="굴림"/>
+                <w:color w:val="000000"/>
+                <w:kern w:val="0"/>
+                <w:szCs w:val="22"/>
+                <w14:ligatures w14:val="none"/>
+              </w:rPr>
+            </w:pPr>
+            <w:r>
+              <w:rPr>
+                <w:rFonts w:ascii="맑은 고딕" w:eastAsia="맑은 고딕" w:hAnsi="맑은 고딕" w:cs="굴림" w:hint="eastAsia"/>
+                <w:b/>
+                <w:bCs/>
+                <w:color w:val="000000"/>
+                <w:kern w:val="0"/>
+                <w:sz w:val="16"/>
+                <w:szCs w:val="16"/>
+                <w14:ligatures w14:val="none"/>
+              </w:rPr>
+              <w:t>프로모션(충전혜택)</w:t>
+            </w:r>
+          </w:p>
+        </w:tc>
+      </w:tr>
+      <w:tr>
+        <w:trPr>
+          <w:trHeight w:val="210"/>
+        </w:trPr>
+        <w:tc>
+          <w:tcPr>
+            <w:tcW w:w="0" w:type="auto"/>
+            <w:vMerge/>
+            <w:tcBorders>
+              <w:top w:val="single" w:sz="2" w:space="0" w:color="000000"/>
+              <w:left w:val="single" w:sz="2" w:space="0" w:color="000000"/>
+              <w:bottom w:val="single" w:sz="2" w:space="0" w:color="000000"/>
+              <w:right w:val="single" w:sz="2" w:space="0" w:color="000000"/>
+            </w:tcBorders>
+            <w:vAlign w:val="center"/>
+            <w:hideMark/>
+          </w:tcPr>
+          <w:p>
+            <w:pPr>
+              <w:widowControl/>
+              <w:wordWrap/>
+              <w:autoSpaceDE/>
+              <w:autoSpaceDN/>
+              <w:spacing w:after="0"/>
+              <w:rPr>
+                <w:rFonts w:ascii="맑은 고딕" w:eastAsia="맑은 고딕" w:hAnsi="맑은 고딕" w:cs="굴림"/>
+                <w:color w:val="000000"/>
+                <w:kern w:val="0"/>
+                <w:szCs w:val="22"/>
+                <w14:ligatures w14:val="none"/>
+              </w:rPr>
+            </w:pPr>
+          </w:p>
+        </w:tc>
+        <w:tc>
+          <w:tcPr>
+            <w:tcW w:w="0" w:type="auto"/>
+            <w:vMerge/>
+            <w:tcBorders>
+              <w:top w:val="single" w:sz="2" w:space="0" w:color="000000"/>
+              <w:left w:val="single" w:sz="2" w:space="0" w:color="000000"/>
+              <w:bottom w:val="single" w:sz="2" w:space="0" w:color="000000"/>
+              <w:right w:val="single" w:sz="2" w:space="0" w:color="000000"/>
+            </w:tcBorders>
+            <w:vAlign w:val="center"/>
+            <w:hideMark/>
+          </w:tcPr>
+          <w:p>
+            <w:pPr>
+              <w:widowControl/>
+              <w:wordWrap/>
+              <w:autoSpaceDE/>
+              <w:autoSpaceDN/>
+              <w:spacing w:after="0"/>
+              <w:rPr>
+                <w:rFonts w:ascii="맑은 고딕" w:eastAsia="맑은 고딕" w:hAnsi="맑은 고딕" w:cs="굴림"/>
+                <w:color w:val="000000"/>
+                <w:kern w:val="0"/>
+                <w:szCs w:val="22"/>
+                <w14:ligatures w14:val="none"/>
+              </w:rPr>
+            </w:pPr>
+          </w:p>
+        </w:tc>
+        <w:tc>
+          <w:tcPr>
+            <w:tcW w:w="0" w:type="auto"/>
+            <w:vMerge/>
+            <w:tcBorders>
+              <w:top w:val="single" w:sz="2" w:space="0" w:color="000000"/>
+              <w:left w:val="single" w:sz="2" w:space="0" w:color="000000"/>
+              <w:bottom w:val="single" w:sz="2" w:space="0" w:color="000000"/>
+              <w:right w:val="single" w:sz="2" w:space="0" w:color="000000"/>
+            </w:tcBorders>
+            <w:vAlign w:val="center"/>
+            <w:hideMark/>
+          </w:tcPr>
+          <w:p>
+            <w:pPr>
+              <w:widowControl/>
+              <w:wordWrap/>
+              <w:autoSpaceDE/>
+              <w:autoSpaceDN/>
+              <w:spacing w:after="0"/>
+              <w:rPr>
+                <w:rFonts w:ascii="맑은 고딕" w:eastAsia="맑은 고딕" w:hAnsi="맑은 고딕" w:cs="굴림"/>
+                <w:color w:val="000000"/>
+                <w:kern w:val="0"/>
+                <w:szCs w:val="22"/>
+                <w14:ligatures w14:val="none"/>
+              </w:rPr>
+            </w:pPr>
+          </w:p>
+        </w:tc>
+        <w:tc>
+          <w:tcPr>
+            <w:tcW w:w="1860" w:type="dxa"/>
+            <w:tcBorders>
+              <w:top w:val="single" w:sz="2" w:space="0" w:color="000000"/>
+              <w:left w:val="single" w:sz="2" w:space="0" w:color="000000"/>
+              <w:bottom w:val="single" w:sz="2" w:space="0" w:color="000000"/>
+              <w:right w:val="single" w:sz="2" w:space="0" w:color="000000"/>
+            </w:tcBorders>
+            <w:shd w:val="clear" w:color="auto" w:fill="FAE2D5"/>
+            <w:tcMar>
+              <w:top w:w="0" w:type="dxa"/>
+              <w:left w:w="105" w:type="dxa"/>
+              <w:bottom w:w="0" w:type="dxa"/>
+              <w:right w:w="105" w:type="dxa"/>
+            </w:tcMar>
+            <w:vAlign w:val="center"/>
+            <w:hideMark/>
+          </w:tcPr>
+          <w:p>
+            <w:pPr>
+              <w:widowControl/>
+              <w:wordWrap/>
+              <w:autoSpaceDE/>
+              <w:autoSpaceDN/>
+              <w:spacing w:after="0"/>
+              <w:jc w:val="center"/>
+              <w:rPr>
+                <w:rFonts w:ascii="맑은 고딕" w:eastAsia="맑은 고딕" w:hAnsi="맑은 고딕" w:cs="굴림"/>
+                <w:color w:val="000000"/>
+                <w:kern w:val="0"/>
+                <w:szCs w:val="22"/>
+                <w14:ligatures w14:val="none"/>
+              </w:rPr>
+            </w:pPr>
+            <w:r>
+              <w:rPr>
+                <w:rFonts w:ascii="맑은 고딕" w:eastAsia="맑은 고딕" w:hAnsi="맑은 고딕" w:cs="굴림" w:hint="eastAsia"/>
+                <w:b/>
+                <w:bCs/>
+                <w:color w:val="000000"/>
+                <w:kern w:val="0"/>
+                <w:sz w:val="16"/>
+                <w:szCs w:val="16"/>
+                <w14:ligatures w14:val="none"/>
+              </w:rPr>
+              <w:t>기간</w:t>
+            </w:r>
+          </w:p>
+        </w:tc>
+        <w:tc>
+          <w:tcPr>
+            <w:tcW w:w="1665" w:type="dxa"/>
+            <w:tcBorders>
+              <w:top w:val="single" w:sz="2" w:space="0" w:color="000000"/>
+              <w:left w:val="single" w:sz="2" w:space="0" w:color="000000"/>
+              <w:bottom w:val="single" w:sz="2" w:space="0" w:color="000000"/>
+              <w:right w:val="single" w:sz="2" w:space="0" w:color="000000"/>
+            </w:tcBorders>
+            <w:shd w:val="clear" w:color="auto" w:fill="FAE2D5"/>
+            <w:tcMar>
+              <w:top w:w="0" w:type="dxa"/>
+              <w:left w:w="105" w:type="dxa"/>
+              <w:bottom w:w="0" w:type="dxa"/>
+              <w:right w:w="105" w:type="dxa"/>
+            </w:tcMar>
+            <w:vAlign w:val="center"/>
+            <w:hideMark/>
+          </w:tcPr>
+          <w:p>
+            <w:pPr>
+              <w:widowControl/>
+              <w:wordWrap/>
+              <w:autoSpaceDE/>
+              <w:autoSpaceDN/>
+              <w:spacing w:after="0"/>
+              <w:jc w:val="center"/>
+              <w:rPr>
+                <w:rFonts w:ascii="맑은 고딕" w:eastAsia="맑은 고딕" w:hAnsi="맑은 고딕" w:cs="굴림"/>
+                <w:color w:val="000000"/>
+                <w:kern w:val="0"/>
+                <w:szCs w:val="22"/>
+                <w14:ligatures w14:val="none"/>
+              </w:rPr>
+            </w:pPr>
+            <w:r>
+              <w:rPr>
+                <w:rFonts w:ascii="맑은 고딕" w:eastAsia="맑은 고딕" w:hAnsi="맑은 고딕" w:cs="굴림" w:hint="eastAsia"/>
+                <w:b/>
+                <w:bCs/>
+                <w:color w:val="000000"/>
+                <w:kern w:val="0"/>
+                <w:sz w:val="16"/>
+                <w:szCs w:val="16"/>
+                <w14:ligatures w14:val="none"/>
+              </w:rPr>
+              <w:t>요금</w:t>
+            </w:r>
+          </w:p>
+        </w:tc>
+      </w:tr>
+      <w:tr>
+        <w:trPr>
+          <w:trHeight w:val="270"/>
+        </w:trPr>
+        <w:tc>
+          <w:tcPr>
+            <w:tcW w:w="1325" w:type="dxa"/>
+            <w:vMerge w:val="restart"/>
+            <w:tcBorders>
+              <w:top w:val="single" w:sz="2" w:space="0" w:color="000000"/>
+              <w:left w:val="single" w:sz="2" w:space="0" w:color="000000"/>
+              <w:bottom w:val="single" w:sz="2" w:space="0" w:color="000000"/>
+              <w:right w:val="single" w:sz="2" w:space="0" w:color="000000"/>
+            </w:tcBorders>
+            <w:tcMar>
+              <w:top w:w="0" w:type="dxa"/>
+              <w:left w:w="105" w:type="dxa"/>
+              <w:bottom w:w="0" w:type="dxa"/>
+              <w:right w:w="105" w:type="dxa"/>
+            </w:tcMar>
+            <w:vAlign w:val="center"/>
+            <w:hideMark/>
+          </w:tcPr>
+          <w:p>
+            <w:pPr>
+              <w:widowControl/>
+              <w:wordWrap/>
+              <w:autoSpaceDE/>
+              <w:autoSpaceDN/>
+              <w:spacing w:after="0"/>
+              <w:jc w:val="center"/>
+              <w:rPr>
+                <w:rFonts w:ascii="맑은 고딕" w:eastAsia="맑은 고딕" w:hAnsi="맑은 고딕" w:cs="굴림" w:hint="eastAsia"/>
+                <w:color w:val="000000"/>
+                <w:kern w:val="0"/>
+                <w:sz w:val="16"/>
+                <w:szCs w:val="16"/>
+                <w14:ligatures w14:val="none"/>
+              </w:rPr>
+            </w:pPr>
+            <w:r>
+              <w:rPr>
+                <w:rFonts w:ascii="맑은 고딕" w:eastAsia="맑은 고딕" w:hAnsi="맑은 고딕" w:cs="굴림" w:hint="eastAsia"/>
+                <w:color w:val="000000"/>
+                <w:kern w:val="0"/>
+                <w:sz w:val="16"/>
+                <w:szCs w:val="16"/>
+                <w14:ligatures w14:val="none"/>
+              </w:rPr>
+              <w:t>공동주택</w:t>
+            </w:r>
+            <w:r>
+              <w:rPr>
+                <w:rFonts w:ascii="맑은 고딕" w:eastAsia="맑은 고딕" w:hAnsi="맑은 고딕" w:cs="굴림" w:hint="eastAsia"/>
+                <w:color w:val="000000"/>
+                <w:kern w:val="0"/>
+                <w:sz w:val="16"/>
+                <w:szCs w:val="16"/>
+                <w14:ligatures w14:val="none"/>
+              </w:rPr>
+              <w:t xml:space="preserve"> 및 주거형 오피스텔</w:t>
+            </w:r>
+          </w:p>
+        </w:tc>
+        <w:tc>
+          <w:tcPr>
+            <w:tcW w:w="1485" w:type="dxa"/>
+            <w:tcBorders>
+              <w:top w:val="single" w:sz="2" w:space="0" w:color="000000"/>
+              <w:left w:val="single" w:sz="2" w:space="0" w:color="000000"/>
+              <w:bottom w:val="single" w:sz="2" w:space="0" w:color="000000"/>
+              <w:right w:val="single" w:sz="2" w:space="0" w:color="000000"/>
+            </w:tcBorders>
+            <w:tcMar>
+              <w:top w:w="0" w:type="dxa"/>
+              <w:left w:w="105" w:type="dxa"/>
+              <w:bottom w:w="0" w:type="dxa"/>
+              <w:right w:w="105" w:type="dxa"/>
+            </w:tcMar>
+            <w:vAlign w:val="center"/>
+            <w:hideMark/>
+          </w:tcPr>
+          <w:p>
+            <w:pPr>
+              <w:widowControl/>
+              <w:wordWrap/>
+              <w:autoSpaceDE/>
+              <w:autoSpaceDN/>
+              <w:spacing w:after="0"/>
+              <w:jc w:val="center"/>
+              <w:rPr>
+                <w:rFonts w:ascii="맑은 고딕" w:eastAsia="맑은 고딕" w:hAnsi="맑은 고딕" w:cs="굴림"/>
+                <w:color w:val="000000"/>
+                <w:kern w:val="0"/>
+                <w:sz w:val="16"/>
+                <w:szCs w:val="16"/>
+                <w14:ligatures w14:val="none"/>
+              </w:rPr>
+            </w:pPr>
+            <w:r>
+              <w:rPr>
+                <w:rFonts w:ascii="맑은 고딕" w:eastAsia="맑은 고딕" w:hAnsi="맑은 고딕" w:cs="굴림" w:hint="eastAsia"/>
+                <w:color w:val="000000"/>
+                <w:kern w:val="0"/>
+                <w:sz w:val="16"/>
+                <w:szCs w:val="16"/>
+                <w14:ligatures w14:val="none"/>
+              </w:rPr>
+              <w:t>7년</w:t>
+            </w:r>
+          </w:p>
+        </w:tc>
+        <w:tc>
+          <w:tcPr>
+            <w:tcW w:w="2040" w:type="dxa"/>
+            <w:vMerge w:val="restart"/>
+            <w:tcBorders>
+              <w:top w:val="single" w:sz="2" w:space="0" w:color="000000"/>
+              <w:left w:val="single" w:sz="2" w:space="0" w:color="000000"/>
+              <w:bottom w:val="single" w:sz="2" w:space="0" w:color="000000"/>
+              <w:right w:val="single" w:sz="2" w:space="0" w:color="000000"/>
+            </w:tcBorders>
+            <w:tcMar>
+              <w:top w:w="0" w:type="dxa"/>
+              <w:left w:w="105" w:type="dxa"/>
+              <w:bottom w:w="0" w:type="dxa"/>
+              <w:right w:w="105" w:type="dxa"/>
+            </w:tcMar>
+            <w:vAlign w:val="center"/>
+            <w:hideMark/>
+          </w:tcPr>
+          <w:p>
+            <w:pPr>
+              <w:widowControl/>
+              <w:wordWrap/>
+              <w:autoSpaceDE/>
+              <w:autoSpaceDN/>
+              <w:spacing w:after="0"/>
+              <w:jc w:val="center"/>
+              <w:rPr>
+                <w:rFonts w:ascii="맑은 고딕" w:eastAsia="맑은 고딕" w:hAnsi="맑은 고딕" w:cs="굴림"/>
+                <w:color w:val="000000"/>
+                <w:kern w:val="0"/>
+                <w:sz w:val="16"/>
+                <w:szCs w:val="16"/>
+                <w14:ligatures w14:val="none"/>
+              </w:rPr>
+            </w:pPr>
+            <w:r>
+              <w:rPr>
+                <w:rFonts w:ascii="맑은 고딕" w:eastAsia="맑은 고딕" w:hAnsi="맑은 고딕" w:cs="굴림" w:hint="eastAsia"/>
+                <w:color w:val="000000"/>
+                <w:kern w:val="0"/>
+                <w:sz w:val="16"/>
+                <w:szCs w:val="16"/>
+                <w14:ligatures w14:val="none"/>
+              </w:rPr>
+              <w:t>SK</w:t>
+            </w:r>
+            <w:proofErr w:type="spellStart"/>
+            <w:r>
+              <w:rPr>
+                <w:rFonts w:ascii="맑은 고딕" w:eastAsia="맑은 고딕" w:hAnsi="맑은 고딕" w:cs="굴림" w:hint="eastAsia"/>
+                <w:color w:val="000000"/>
+                <w:kern w:val="0"/>
+                <w:sz w:val="16"/>
+                <w:szCs w:val="16"/>
+                <w14:ligatures w14:val="none"/>
+              </w:rPr>
+              <w:t>일렉링크</w:t>
+            </w:r>
+            <w:proofErr w:type="spellEnd"/>
+          </w:p>
+          <w:p>
+            <w:pPr>
+              <w:widowControl/>
+              <w:wordWrap/>
+              <w:autoSpaceDE/>
+              <w:autoSpaceDN/>
+              <w:spacing w:after="0"/>
+              <w:jc w:val="center"/>
+              <w:rPr>
+                <w:rFonts w:ascii="맑은 고딕" w:eastAsia="맑은 고딕" w:hAnsi="맑은 고딕" w:cs="굴림"/>
+                <w:color w:val="000000"/>
+                <w:kern w:val="0"/>
+                <w:sz w:val="16"/>
+                <w:szCs w:val="16"/>
+                <w14:ligatures w14:val="none"/>
+              </w:rPr>
+            </w:pPr>
+            <w:r>
+              <w:rPr>
+                <w:rFonts w:ascii="맑은 고딕" w:eastAsia="맑은 고딕" w:hAnsi="맑은 고딕" w:cs="굴림" w:hint="eastAsia"/>
+                <w:color w:val="000000"/>
+                <w:kern w:val="0"/>
+                <w:sz w:val="16"/>
+                <w:szCs w:val="16"/>
+                <w14:ligatures w14:val="none"/>
+              </w:rPr>
+              <w:t>표준단가</w:t>
+            </w:r>
+          </w:p>
+        </w:tc>
+        <w:tc>
+          <w:tcPr>
+            <w:tcW w:w="1860" w:type="dxa"/>
+            <w:tcBorders>
+              <w:top w:val="single" w:sz="2" w:space="0" w:color="000000"/>
+              <w:left w:val="single" w:sz="2" w:space="0" w:color="000000"/>
+              <w:bottom w:val="single" w:sz="2" w:space="0" w:color="000000"/>
+              <w:right w:val="single" w:sz="2" w:space="0" w:color="000000"/>
+            </w:tcBorders>
+            <w:tcMar>
+              <w:top w:w="0" w:type="dxa"/>
+              <w:left w:w="105" w:type="dxa"/>
+              <w:bottom w:w="0" w:type="dxa"/>
+              <w:right w:w="105" w:type="dxa"/>
+            </w:tcMar>
+            <w:vAlign w:val="center"/>
+            <w:hideMark/>
+          </w:tcPr>
+          <w:p>
+            <w:pPr>
+              <w:widowControl/>
+              <w:wordWrap/>
+              <w:autoSpaceDE/>
+              <w:autoSpaceDN/>
+              <w:spacing w:after="0"/>
+              <w:jc w:val="center"/>
+              <w:rPr>
+                <w:rFonts w:ascii="맑은 고딕" w:eastAsia="맑은 고딕" w:hAnsi="맑은 고딕" w:cs="굴림"/>
+                <w:color w:val="000000"/>
+                <w:kern w:val="0"/>
+                <w:sz w:val="16"/>
+                <w:szCs w:val="16"/>
+                <w14:ligatures w14:val="none"/>
+              </w:rPr>
+            </w:pPr>
+            <w:r>
+              <w:rPr>
+                <w:rFonts w:ascii="맑은 고딕" w:eastAsia="맑은 고딕" w:hAnsi="맑은 고딕" w:cs="굴림" w:hint="eastAsia"/>
+                <w:color w:val="000000"/>
+                <w:kern w:val="0"/>
+                <w:sz w:val="16"/>
+                <w:szCs w:val="16"/>
+                <w14:ligatures w14:val="none"/>
+              </w:rPr>
+              <w:t>6개월</w:t>
+            </w:r>
+          </w:p>
+        </w:tc>
+        <w:tc>
+          <w:tcPr>
+            <w:tcW w:w="1665" w:type="dxa"/>
+            <w:tcBorders>
+              <w:top w:val="single" w:sz="2" w:space="0" w:color="000000"/>
+              <w:left w:val="single" w:sz="2" w:space="0" w:color="000000"/>
+              <w:bottom w:val="single" w:sz="2" w:space="0" w:color="000000"/>
+              <w:right w:val="single" w:sz="2" w:space="0" w:color="000000"/>
+            </w:tcBorders>
+            <w:tcMar>
+              <w:top w:w="0" w:type="dxa"/>
+              <w:left w:w="105" w:type="dxa"/>
+              <w:bottom w:w="0" w:type="dxa"/>
+              <w:right w:w="105" w:type="dxa"/>
+            </w:tcMar>
+            <w:vAlign w:val="center"/>
+            <w:hideMark/>
+          </w:tcPr>
+          <w:p>
+            <w:pPr>
+              <w:widowControl/>
+              <w:wordWrap/>
+              <w:autoSpaceDE/>
+              <w:autoSpaceDN/>
+              <w:spacing w:after="0"/>
+              <w:jc w:val="center"/>
+              <w:rPr>
+                <w:rFonts w:ascii="맑은 고딕" w:eastAsia="맑은 고딕" w:hAnsi="맑은 고딕" w:cs="굴림"/>
+                <w:color w:val="000000"/>
+                <w:kern w:val="0"/>
+                <w:sz w:val="16"/>
+                <w:szCs w:val="16"/>
+                <w14:ligatures w14:val="none"/>
+              </w:rPr>
+            </w:pPr>
+            <w:r>
+              <w:rPr>
+                <w:rFonts w:ascii="맑은 고딕" w:eastAsia="맑은 고딕" w:hAnsi="맑은 고딕" w:cs="굴림" w:hint="eastAsia"/>
+                <w:color w:val="000000"/>
+                <w:kern w:val="0"/>
+                <w:sz w:val="16"/>
+                <w:szCs w:val="16"/>
+                <w14:ligatures w14:val="none"/>
+              </w:rPr>
+              <w:t>150원</w:t>
+            </w:r>
+          </w:p>
+        </w:tc>
+      </w:tr>
+      <w:tr>
+        <w:trPr>
+          <w:trHeight w:val="495"/>
+        </w:trPr>
+        <w:tc>
+          <w:tcPr>
+            <w:tcW w:w="0" w:type="auto"/>
+            <w:vMerge/>
+            <w:tcBorders>
+              <w:top w:val="single" w:sz="2" w:space="0" w:color="000000"/>
+              <w:left w:val="single" w:sz="2" w:space="0" w:color="000000"/>
+              <w:bottom w:val="single" w:sz="2" w:space="0" w:color="000000"/>
+              <w:right w:val="single" w:sz="2" w:space="0" w:color="000000"/>
+            </w:tcBorders>
+            <w:vAlign w:val="center"/>
+            <w:hideMark/>
+          </w:tcPr>
+          <w:p>
+            <w:pPr>
+              <w:widowControl/>
+              <w:wordWrap/>
+              <w:autoSpaceDE/>
+              <w:autoSpaceDN/>
+              <w:spacing w:after="0"/>
+              <w:jc w:val="center"/>
+              <w:rPr>
+                <w:rFonts w:ascii="맑은 고딕" w:eastAsia="맑은 고딕" w:hAnsi="맑은 고딕" w:cs="굴림"/>
+                <w:color w:val="000000"/>
+                <w:kern w:val="0"/>
+                <w:sz w:val="16"/>
+                <w:szCs w:val="16"/>
+                <w14:ligatures w14:val="none"/>
+              </w:rPr>
+            </w:pPr>
+          </w:p>
+        </w:tc>
+        <w:tc>
+          <w:tcPr>
+            <w:tcW w:w="1485" w:type="dxa"/>
+            <w:tcBorders>
+              <w:top w:val="single" w:sz="2" w:space="0" w:color="000000"/>
+              <w:left w:val="single" w:sz="2" w:space="0" w:color="000000"/>
+              <w:bottom w:val="single" w:sz="2" w:space="0" w:color="000000"/>
+              <w:right w:val="single" w:sz="2" w:space="0" w:color="000000"/>
+            </w:tcBorders>
+            <w:tcMar>
+              <w:top w:w="0" w:type="dxa"/>
+              <w:left w:w="105" w:type="dxa"/>
+              <w:bottom w:w="0" w:type="dxa"/>
+              <w:right w:w="105" w:type="dxa"/>
+            </w:tcMar>
+            <w:vAlign w:val="center"/>
+            <w:hideMark/>
+          </w:tcPr>
+          <w:p>
+            <w:pPr>
+              <w:widowControl/>
+              <w:wordWrap/>
+              <w:autoSpaceDE/>
+              <w:autoSpaceDN/>
+              <w:spacing w:after="0"/>
+              <w:jc w:val="center"/>
+              <w:rPr>
+                <w:rFonts w:ascii="맑은 고딕" w:eastAsia="맑은 고딕" w:hAnsi="맑은 고딕" w:cs="굴림"/>
+                <w:color w:val="000000"/>
+                <w:kern w:val="0"/>
+                <w:sz w:val="16"/>
+                <w:szCs w:val="16"/>
+                <w14:ligatures w14:val="none"/>
+              </w:rPr>
+            </w:pPr>
+            <w:r>
+              <w:rPr>
+                <w:rFonts w:ascii="맑은 고딕" w:eastAsia="맑은 고딕" w:hAnsi="맑은 고딕" w:cs="굴림" w:hint="eastAsia"/>
+                <w:color w:val="000000"/>
+                <w:kern w:val="0"/>
+                <w:sz w:val="16"/>
+                <w:szCs w:val="16"/>
+                <w14:ligatures w14:val="none"/>
+              </w:rPr>
+              <w:t>10년</w:t>
+            </w:r>
+          </w:p>
+        </w:tc>
+        <w:tc>
+          <w:tcPr>
+            <w:tcW w:w="0" w:type="auto"/>
+            <w:vMerge/>
+            <w:tcBorders>
+              <w:top w:val="single" w:sz="2" w:space="0" w:color="000000"/>
+              <w:left w:val="single" w:sz="2" w:space="0" w:color="000000"/>
+              <w:bottom w:val="single" w:sz="2" w:space="0" w:color="000000"/>
+              <w:right w:val="single" w:sz="2" w:space="0" w:color="000000"/>
+            </w:tcBorders>
+            <w:vAlign w:val="center"/>
+            <w:hideMark/>
+          </w:tcPr>
+          <w:p>
+            <w:pPr>
+              <w:widowControl/>
+              <w:wordWrap/>
+              <w:autoSpaceDE/>
+              <w:autoSpaceDN/>
+              <w:spacing w:after="0"/>
+              <w:jc w:val="center"/>
+              <w:rPr>
+                <w:rFonts w:ascii="맑은 고딕" w:eastAsia="맑은 고딕" w:hAnsi="맑은 고딕" w:cs="굴림"/>
+                <w:color w:val="000000"/>
+                <w:kern w:val="0"/>
+                <w:sz w:val="16"/>
+                <w:szCs w:val="16"/>
+                <w14:ligatures w14:val="none"/>
+              </w:rPr>
+            </w:pPr>
+          </w:p>
+        </w:tc>
+        <w:tc>
+          <w:tcPr>
+            <w:tcW w:w="1860" w:type="dxa"/>
+            <w:tcBorders>
+              <w:top w:val="single" w:sz="2" w:space="0" w:color="000000"/>
+              <w:left w:val="single" w:sz="2" w:space="0" w:color="000000"/>
+              <w:bottom w:val="single" w:sz="2" w:space="0" w:color="000000"/>
+              <w:right w:val="single" w:sz="2" w:space="0" w:color="000000"/>
+            </w:tcBorders>
+            <w:tcMar>
+              <w:top w:w="0" w:type="dxa"/>
+              <w:left w:w="105" w:type="dxa"/>
+              <w:bottom w:w="0" w:type="dxa"/>
+              <w:right w:w="105" w:type="dxa"/>
+            </w:tcMar>
+            <w:vAlign w:val="center"/>
+            <w:hideMark/>
+          </w:tcPr>
+          <w:p>
+            <w:pPr>
+              <w:widowControl/>
+              <w:wordWrap/>
+              <w:autoSpaceDE/>
+              <w:autoSpaceDN/>
+              <w:spacing w:after="0"/>
+              <w:jc w:val="center"/>
+              <w:rPr>
+                <w:rFonts w:ascii="맑은 고딕" w:eastAsia="맑은 고딕" w:hAnsi="맑은 고딕" w:cs="굴림"/>
+                <w:color w:val="000000"/>
+                <w:kern w:val="0"/>
+                <w:sz w:val="16"/>
+                <w:szCs w:val="16"/>
+                <w14:ligatures w14:val="none"/>
+              </w:rPr>
+            </w:pPr>
+            <w:r>
+              <w:rPr>
+                <w:rFonts w:ascii="맑은 고딕" w:eastAsia="맑은 고딕" w:hAnsi="맑은 고딕" w:cs="굴림" w:hint="eastAsia"/>
+                <w:color w:val="000000"/>
+                <w:kern w:val="0"/>
+                <w:sz w:val="16"/>
+                <w:szCs w:val="16"/>
+                <w14:ligatures w14:val="none"/>
+              </w:rPr>
+              <w:t>첫6개월</w:t>
+            </w:r>
+          </w:p>
+          <w:p>
+            <w:pPr>
+              <w:widowControl/>
+              <w:wordWrap/>
+              <w:autoSpaceDE/>
+              <w:autoSpaceDN/>
+              <w:spacing w:after="0"/>
+              <w:jc w:val="center"/>
+              <w:rPr>
+                <w:rFonts w:ascii="맑은 고딕" w:eastAsia="맑은 고딕" w:hAnsi="맑은 고딕" w:cs="굴림"/>
+                <w:color w:val="000000"/>
+                <w:kern w:val="0"/>
+                <w:sz w:val="16"/>
+                <w:szCs w:val="16"/>
+                <w14:ligatures w14:val="none"/>
+              </w:rPr>
+            </w:pPr>
+            <w:r>
+              <w:rPr>
+                <w:rFonts w:ascii="맑은 고딕" w:eastAsia="맑은 고딕" w:hAnsi="맑은 고딕" w:cs="굴림" w:hint="eastAsia"/>
+                <w:color w:val="000000"/>
+                <w:kern w:val="0"/>
+                <w:sz w:val="16"/>
+                <w:szCs w:val="16"/>
+                <w14:ligatures w14:val="none"/>
+              </w:rPr>
+              <w:t>다음6개월</w:t>
+            </w:r>
+          </w:p>
+        </w:tc>
+        <w:tc>
+          <w:tcPr>
+            <w:tcW w:w="1665" w:type="dxa"/>
+            <w:tcBorders>
+              <w:top w:val="single" w:sz="2" w:space="0" w:color="000000"/>
+              <w:left w:val="single" w:sz="2" w:space="0" w:color="000000"/>
+              <w:bottom w:val="single" w:sz="2" w:space="0" w:color="000000"/>
+              <w:right w:val="single" w:sz="2" w:space="0" w:color="000000"/>
+            </w:tcBorders>
+            <w:tcMar>
+              <w:top w:w="0" w:type="dxa"/>
+              <w:left w:w="105" w:type="dxa"/>
+              <w:bottom w:w="0" w:type="dxa"/>
+              <w:right w:w="105" w:type="dxa"/>
+            </w:tcMar>
+            <w:vAlign w:val="center"/>
+            <w:hideMark/>
+          </w:tcPr>
+          <w:p>
+            <w:pPr>
+              <w:widowControl/>
+              <w:wordWrap/>
+              <w:autoSpaceDE/>
+              <w:autoSpaceDN/>
+              <w:spacing w:after="0"/>
+              <w:jc w:val="center"/>
+              <w:rPr>
+                <w:rFonts w:ascii="맑은 고딕" w:eastAsia="맑은 고딕" w:hAnsi="맑은 고딕" w:cs="굴림"/>
+                <w:color w:val="000000"/>
+                <w:kern w:val="0"/>
+                <w:sz w:val="16"/>
+                <w:szCs w:val="16"/>
+                <w14:ligatures w14:val="none"/>
+              </w:rPr>
+            </w:pPr>
+            <w:r>
+              <w:rPr>
+                <w:rFonts w:ascii="맑은 고딕" w:eastAsia="맑은 고딕" w:hAnsi="맑은 고딕" w:cs="굴림" w:hint="eastAsia"/>
+                <w:color w:val="000000"/>
+                <w:kern w:val="0"/>
+                <w:sz w:val="16"/>
+                <w:szCs w:val="16"/>
+                <w14:ligatures w14:val="none"/>
+              </w:rPr>
+              <w:t>150원</w:t>
+            </w:r>
+          </w:p>
+          <w:p>
+            <w:pPr>
+              <w:widowControl/>
+              <w:wordWrap/>
+              <w:autoSpaceDE/>
+              <w:autoSpaceDN/>
+              <w:spacing w:after="0"/>
+              <w:jc w:val="center"/>
+              <w:rPr>
+                <w:rFonts w:ascii="맑은 고딕" w:eastAsia="맑은 고딕" w:hAnsi="맑은 고딕" w:cs="굴림"/>
+                <w:color w:val="000000"/>
+                <w:kern w:val="0"/>
+                <w:sz w:val="16"/>
+                <w:szCs w:val="16"/>
+                <w14:ligatures w14:val="none"/>
+              </w:rPr>
+            </w:pPr>
+            <w:r>
+              <w:rPr>
+                <w:rFonts w:ascii="맑은 고딕" w:eastAsia="맑은 고딕" w:hAnsi="맑은 고딕" w:cs="굴림" w:hint="eastAsia"/>
+                <w:color w:val="000000"/>
+                <w:kern w:val="0"/>
+                <w:sz w:val="16"/>
+                <w:szCs w:val="16"/>
+                <w14:ligatures w14:val="none"/>
+              </w:rPr>
+              <w:t>250원</w:t>
+            </w:r>
+          </w:p>
+        </w:tc>
+      </w:tr>
+      <w:tr>
+        <w:trPr>
+          <w:trHeight w:val="495"/>
+        </w:trPr>
+        <w:tc>
+          <w:tcPr>
+            <w:tcW w:w="0" w:type="auto"/>
+            <w:vMerge w:val="restart"/>
+            <w:tcBorders>
+              <w:top w:val="single" w:sz="2" w:space="0" w:color="000000"/>
+              <w:left w:val="single" w:sz="2" w:space="0" w:color="000000"/>
+              <w:right w:val="single" w:sz="2" w:space="0" w:color="000000"/>
+            </w:tcBorders>
+            <w:vAlign w:val="center"/>
+          </w:tcPr>
+          <w:p>
+            <w:pPr>
+              <w:widowControl/>
+              <w:wordWrap/>
+              <w:autoSpaceDE/>
+              <w:autoSpaceDN/>
+              <w:spacing w:after="0"/>
+              <w:jc w:val="center"/>
+              <w:rPr>
+                <w:rFonts w:ascii="맑은 고딕" w:eastAsia="맑은 고딕" w:hAnsi="맑은 고딕" w:cs="굴림"/>
+                <w:color w:val="000000"/>
+                <w:kern w:val="0"/>
+                <w:sz w:val="16"/>
+                <w:szCs w:val="16"/>
+                <w14:ligatures w14:val="none"/>
+              </w:rPr>
+            </w:pPr>
+            <w:r>
+              <w:rPr>
+                <w:rFonts w:ascii="맑은 고딕" w:eastAsia="맑은 고딕" w:hAnsi="맑은 고딕" w:cs="굴림" w:hint="eastAsia"/>
+                <w:color w:val="000000"/>
+                <w:kern w:val="0"/>
+                <w:sz w:val="16"/>
+                <w:szCs w:val="16"/>
+                <w14:ligatures w14:val="none"/>
+              </w:rPr>
+              <w:t>지식산업센터</w:t>
+            </w:r>
+          </w:p>
+        </w:tc>
+        <w:tc>
+          <w:tcPr>
+            <w:tcW w:w="1485" w:type="dxa"/>
+            <w:tcBorders>
+              <w:top w:val="single" w:sz="2" w:space="0" w:color="000000"/>
+              <w:left w:val="single" w:sz="2" w:space="0" w:color="000000"/>
+              <w:bottom w:val="single" w:sz="2" w:space="0" w:color="000000"/>
+              <w:right w:val="single" w:sz="2" w:space="0" w:color="000000"/>
+            </w:tcBorders>
+            <w:tcMar>
+              <w:top w:w="0" w:type="dxa"/>
+              <w:left w:w="105" w:type="dxa"/>
+              <w:bottom w:w="0" w:type="dxa"/>
+              <w:right w:w="105" w:type="dxa"/>
+            </w:tcMar>
+            <w:vAlign w:val="center"/>
+          </w:tcPr>
+          <w:p>
+            <w:pPr>
+              <w:widowControl/>
+              <w:wordWrap/>
+              <w:autoSpaceDE/>
+              <w:autoSpaceDN/>
+              <w:spacing w:after="0"/>
+              <w:jc w:val="center"/>
+              <w:rPr>
+                <w:rFonts w:ascii="맑은 고딕" w:eastAsia="맑은 고딕" w:hAnsi="맑은 고딕" w:cs="굴림" w:hint="eastAsia"/>
+                <w:color w:val="000000"/>
+                <w:kern w:val="0"/>
+                <w:sz w:val="16"/>
+                <w:szCs w:val="16"/>
+                <w14:ligatures w14:val="none"/>
+              </w:rPr>
+            </w:pPr>
+            <w:r>
+              <w:rPr>
+                <w:rFonts w:ascii="맑은 고딕" w:eastAsia="맑은 고딕" w:hAnsi="맑은 고딕" w:cs="굴림" w:hint="eastAsia"/>
+                <w:color w:val="000000"/>
+                <w:kern w:val="0"/>
+                <w:sz w:val="16"/>
+                <w:szCs w:val="16"/>
+                <w14:ligatures w14:val="none"/>
+              </w:rPr>
+              <w:t>7</w:t>
+            </w:r>
+            <w:r>
+              <w:rPr>
+                <w:rFonts w:ascii="맑은 고딕" w:eastAsia="맑은 고딕" w:hAnsi="맑은 고딕" w:cs="굴림" w:hint="eastAsia"/>
+                <w:color w:val="000000"/>
+                <w:kern w:val="0"/>
+                <w:sz w:val="16"/>
+                <w:szCs w:val="16"/>
+                <w14:ligatures w14:val="none"/>
+              </w:rPr>
+              <w:t>년</w:t>
+            </w:r>
+          </w:p>
+        </w:tc>
+        <w:tc>
+          <w:tcPr>
+            <w:tcW w:w="0" w:type="auto"/>
+            <w:tcBorders>
+              <w:top w:val="single" w:sz="2" w:space="0" w:color="000000"/>
+              <w:left w:val="single" w:sz="2" w:space="0" w:color="000000"/>
+              <w:bottom w:val="single" w:sz="2" w:space="0" w:color="000000"/>
+              <w:right w:val="single" w:sz="2" w:space="0" w:color="000000"/>
+            </w:tcBorders>
+            <w:vAlign w:val="center"/>
+          </w:tcPr>
+          <w:p>
+            <w:pPr>
+              <w:widowControl/>
+              <w:wordWrap/>
+              <w:autoSpaceDE/>
+              <w:autoSpaceDN/>
+              <w:spacing w:after="0"/>
+              <w:jc w:val="center"/>
+              <w:rPr>
+                <w:rFonts w:ascii="맑은 고딕" w:eastAsia="맑은 고딕" w:hAnsi="맑은 고딕" w:cs="굴림"/>
+                <w:color w:val="000000"/>
+                <w:kern w:val="0"/>
+                <w:sz w:val="16"/>
+                <w:szCs w:val="16"/>
+                <w14:ligatures w14:val="none"/>
+              </w:rPr>
+            </w:pPr>
+            <w:r>
+              <w:rPr>
+                <w:rFonts w:ascii="맑은 고딕" w:eastAsia="맑은 고딕" w:hAnsi="맑은 고딕" w:cs="굴림" w:hint="eastAsia"/>
+                <w:color w:val="000000"/>
+                <w:kern w:val="0"/>
+                <w:sz w:val="16"/>
+                <w:szCs w:val="16"/>
+                <w14:ligatures w14:val="none"/>
+              </w:rPr>
+              <w:t>SK</w:t>
+            </w:r>
+            <w:proofErr w:type="spellStart"/>
+            <w:r>
+              <w:rPr>
+                <w:rFonts w:ascii="맑은 고딕" w:eastAsia="맑은 고딕" w:hAnsi="맑은 고딕" w:cs="굴림" w:hint="eastAsia"/>
+                <w:color w:val="000000"/>
+                <w:kern w:val="0"/>
+                <w:sz w:val="16"/>
+                <w:szCs w:val="16"/>
+                <w14:ligatures w14:val="none"/>
+              </w:rPr>
+              <w:t>일렉링크</w:t>
+            </w:r>
+            <w:proofErr w:type="spellEnd"/>
+          </w:p>
+          <w:p>
+            <w:pPr>
+              <w:widowControl/>
+              <w:wordWrap/>
+              <w:autoSpaceDE/>
+              <w:autoSpaceDN/>
+              <w:spacing w:after="0"/>
+              <w:jc w:val="center"/>
+              <w:rPr>
+                <w:rFonts w:ascii="맑은 고딕" w:eastAsia="맑은 고딕" w:hAnsi="맑은 고딕" w:cs="굴림"/>
+                <w:color w:val="000000"/>
+                <w:kern w:val="0"/>
+                <w:sz w:val="16"/>
+                <w:szCs w:val="16"/>
+                <w14:ligatures w14:val="none"/>
+              </w:rPr>
+            </w:pPr>
+            <w:r>
+              <w:rPr>
+                <w:rFonts w:ascii="맑은 고딕" w:eastAsia="맑은 고딕" w:hAnsi="맑은 고딕" w:cs="굴림" w:hint="eastAsia"/>
+                <w:color w:val="000000"/>
+                <w:kern w:val="0"/>
+                <w:sz w:val="16"/>
+                <w:szCs w:val="16"/>
+                <w14:ligatures w14:val="none"/>
+              </w:rPr>
+              <w:t>표준단가</w:t>
+            </w:r>
+          </w:p>
+        </w:tc>
+        <w:tc>
+          <w:tcPr>
+            <w:tcW w:w="1860" w:type="dxa"/>
+            <w:tcBorders>
+              <w:top w:val="single" w:sz="2" w:space="0" w:color="000000"/>
+              <w:left w:val="single" w:sz="2" w:space="0" w:color="000000"/>
+              <w:bottom w:val="single" w:sz="2" w:space="0" w:color="000000"/>
+              <w:right w:val="single" w:sz="2" w:space="0" w:color="000000"/>
+            </w:tcBorders>
+            <w:tcMar>
+              <w:top w:w="0" w:type="dxa"/>
+              <w:left w:w="105" w:type="dxa"/>
+              <w:bottom w:w="0" w:type="dxa"/>
+              <w:right w:w="105" w:type="dxa"/>
+            </w:tcMar>
+            <w:vAlign w:val="center"/>
+          </w:tcPr>
+          <w:p>
+            <w:pPr>
+              <w:widowControl/>
+              <w:wordWrap/>
+              <w:autoSpaceDE/>
+              <w:autoSpaceDN/>
+              <w:spacing w:after="0"/>
+              <w:jc w:val="center"/>
+              <w:rPr>
+                <w:rFonts w:ascii="맑은 고딕" w:eastAsia="맑은 고딕" w:hAnsi="맑은 고딕" w:cs="굴림" w:hint="eastAsia"/>
+                <w:color w:val="000000"/>
+                <w:kern w:val="0"/>
+                <w:sz w:val="16"/>
+                <w:szCs w:val="16"/>
+                <w14:ligatures w14:val="none"/>
+              </w:rPr>
+            </w:pPr>
+            <w:proofErr w:type="spellStart"/>
+            <w:r>
+              <w:rPr>
+                <w:rFonts w:ascii="맑은 고딕" w:eastAsia="맑은 고딕" w:hAnsi="맑은 고딕" w:cs="굴림" w:hint="eastAsia"/>
+                <w:color w:val="000000"/>
+                <w:kern w:val="0"/>
+                <w:sz w:val="16"/>
+                <w:szCs w:val="16"/>
+                <w14:ligatures w14:val="none"/>
+              </w:rPr>
+              <w:t>해당없음</w:t>
+            </w:r>
+            <w:proofErr w:type="spellEnd"/>
+          </w:p>
+        </w:tc>
+        <w:tc>
+          <w:tcPr>
+            <w:tcW w:w="1665" w:type="dxa"/>
+            <w:tcBorders>
+              <w:top w:val="single" w:sz="2" w:space="0" w:color="000000"/>
+              <w:left w:val="single" w:sz="2" w:space="0" w:color="000000"/>
+              <w:bottom w:val="single" w:sz="2" w:space="0" w:color="000000"/>
+              <w:right w:val="single" w:sz="2" w:space="0" w:color="000000"/>
+            </w:tcBorders>
+            <w:tcMar>
+              <w:top w:w="0" w:type="dxa"/>
+              <w:left w:w="105" w:type="dxa"/>
+              <w:bottom w:w="0" w:type="dxa"/>
+              <w:right w:w="105" w:type="dxa"/>
+            </w:tcMar>
+            <w:vAlign w:val="center"/>
+          </w:tcPr>
+          <w:p>
+            <w:pPr>
+              <w:widowControl/>
+              <w:wordWrap/>
+              <w:autoSpaceDE/>
+              <w:autoSpaceDN/>
+              <w:spacing w:after="0"/>
+              <w:jc w:val="center"/>
+              <w:rPr>
+                <w:rFonts w:ascii="맑은 고딕" w:eastAsia="맑은 고딕" w:hAnsi="맑은 고딕" w:cs="굴림" w:hint="eastAsia"/>
+                <w:color w:val="000000"/>
+                <w:kern w:val="0"/>
+                <w:sz w:val="16"/>
+                <w:szCs w:val="16"/>
+                <w14:ligatures w14:val="none"/>
+              </w:rPr>
+            </w:pPr>
+            <w:proofErr w:type="spellStart"/>
+            <w:r>
+              <w:rPr>
+                <w:rFonts w:ascii="맑은 고딕" w:eastAsia="맑은 고딕" w:hAnsi="맑은 고딕" w:cs="굴림" w:hint="eastAsia"/>
+                <w:color w:val="000000"/>
+                <w:kern w:val="0"/>
+                <w:sz w:val="16"/>
+                <w:szCs w:val="16"/>
+                <w14:ligatures w14:val="none"/>
+              </w:rPr>
+              <w:t>해당없음</w:t>
+            </w:r>
+            <w:proofErr w:type="spellEnd"/>
+          </w:p>
+        </w:tc>
+      </w:tr>
+      <w:tr>
+        <w:trPr>
+          <w:trHeight w:val="495"/>
+        </w:trPr>
+        <w:tc>
+          <w:tcPr>
+            <w:tcW w:w="0" w:type="auto"/>
+            <w:vMerge/>
+            <w:tcBorders>
+              <w:left w:val="single" w:sz="2" w:space="0" w:color="000000"/>
+              <w:bottom w:val="single" w:sz="2" w:space="0" w:color="000000"/>
+              <w:right w:val="single" w:sz="2" w:space="0" w:color="000000"/>
+            </w:tcBorders>
+            <w:vAlign w:val="center"/>
+          </w:tcPr>
+          <w:p>
+            <w:pPr>
+              <w:widowControl/>
+              <w:wordWrap/>
+              <w:autoSpaceDE/>
+              <w:autoSpaceDN/>
+              <w:spacing w:after="0"/>
+              <w:jc w:val="center"/>
+              <w:rPr>
+                <w:rFonts w:ascii="맑은 고딕" w:eastAsia="맑은 고딕" w:hAnsi="맑은 고딕" w:cs="굴림" w:hint="eastAsia"/>
+                <w:color w:val="000000"/>
+                <w:kern w:val="0"/>
+                <w:sz w:val="16"/>
+                <w:szCs w:val="16"/>
+                <w14:ligatures w14:val="none"/>
+              </w:rPr>
+            </w:pPr>
+          </w:p>
+        </w:tc>
+        <w:tc>
+          <w:tcPr>
+            <w:tcW w:w="1485" w:type="dxa"/>
+            <w:tcBorders>
+              <w:top w:val="single" w:sz="2" w:space="0" w:color="000000"/>
+              <w:left w:val="single" w:sz="2" w:space="0" w:color="000000"/>
+              <w:bottom w:val="single" w:sz="2" w:space="0" w:color="000000"/>
+              <w:right w:val="single" w:sz="2" w:space="0" w:color="000000"/>
+            </w:tcBorders>
+            <w:tcMar>
+              <w:top w:w="0" w:type="dxa"/>
+              <w:left w:w="105" w:type="dxa"/>
+              <w:bottom w:w="0" w:type="dxa"/>
+              <w:right w:w="105" w:type="dxa"/>
+            </w:tcMar>
+            <w:vAlign w:val="center"/>
+          </w:tcPr>
+          <w:p>
+            <w:pPr>
+              <w:widowControl/>
+              <w:wordWrap/>
+              <w:autoSpaceDE/>
+              <w:autoSpaceDN/>
+              <w:spacing w:after="0"/>
+              <w:jc w:val="center"/>
+              <w:rPr>
+                <w:rFonts w:ascii="맑은 고딕" w:eastAsia="맑은 고딕" w:hAnsi="맑은 고딕" w:cs="굴림" w:hint="eastAsia"/>
+                <w:color w:val="000000"/>
+                <w:kern w:val="0"/>
+                <w:sz w:val="16"/>
+                <w:szCs w:val="16"/>
+                <w14:ligatures w14:val="none"/>
+              </w:rPr>
+            </w:pPr>
+            <w:r>
+              <w:rPr>
+                <w:rFonts w:ascii="맑은 고딕" w:eastAsia="맑은 고딕" w:hAnsi="맑은 고딕" w:cs="굴림" w:hint="eastAsia"/>
+                <w:color w:val="000000"/>
+                <w:kern w:val="0"/>
+                <w:sz w:val="16"/>
+                <w:szCs w:val="16"/>
+                <w14:ligatures w14:val="none"/>
+              </w:rPr>
+              <w:t>10년</w:t>
+            </w:r>
+          </w:p>
+        </w:tc>
+        <w:tc>
+          <w:tcPr>
+            <w:tcW w:w="0" w:type="auto"/>
+            <w:tcBorders>
+              <w:top w:val="single" w:sz="2" w:space="0" w:color="000000"/>
+              <w:left w:val="single" w:sz="2" w:space="0" w:color="000000"/>
+              <w:bottom w:val="single" w:sz="2" w:space="0" w:color="000000"/>
+              <w:right w:val="single" w:sz="2" w:space="0" w:color="000000"/>
+            </w:tcBorders>
+            <w:vAlign w:val="center"/>
+          </w:tcPr>
+          <w:p>
+            <w:pPr>
+              <w:widowControl/>
+              <w:wordWrap/>
+              <w:autoSpaceDE/>
+              <w:autoSpaceDN/>
+              <w:spacing w:after="0"/>
+              <w:jc w:val="center"/>
+              <w:rPr>
+                <w:rFonts w:ascii="맑은 고딕" w:eastAsia="맑은 고딕" w:hAnsi="맑은 고딕" w:cs="굴림"/>
+                <w:color w:val="000000"/>
+                <w:kern w:val="0"/>
+                <w:sz w:val="16"/>
+                <w:szCs w:val="16"/>
+                <w14:ligatures w14:val="none"/>
+              </w:rPr>
+            </w:pPr>
+            <w:r>
+              <w:rPr>
+                <w:rFonts w:ascii="맑은 고딕" w:eastAsia="맑은 고딕" w:hAnsi="맑은 고딕" w:cs="굴림" w:hint="eastAsia"/>
+                <w:color w:val="000000"/>
+                <w:kern w:val="0"/>
+                <w:sz w:val="16"/>
+                <w:szCs w:val="16"/>
+                <w14:ligatures w14:val="none"/>
+              </w:rPr>
+              <w:t>SK</w:t>
+            </w:r>
+            <w:proofErr w:type="spellStart"/>
+            <w:r>
+              <w:rPr>
+                <w:rFonts w:ascii="맑은 고딕" w:eastAsia="맑은 고딕" w:hAnsi="맑은 고딕" w:cs="굴림" w:hint="eastAsia"/>
+                <w:color w:val="000000"/>
+                <w:kern w:val="0"/>
+                <w:sz w:val="16"/>
+                <w:szCs w:val="16"/>
+                <w14:ligatures w14:val="none"/>
+              </w:rPr>
+              <w:t>일렉링크</w:t>
+            </w:r>
+            <w:proofErr w:type="spellEnd"/>
+          </w:p>
+          <w:p>
+            <w:pPr>
+              <w:widowControl/>
+              <w:wordWrap/>
+              <w:autoSpaceDE/>
+              <w:autoSpaceDN/>
+              <w:spacing w:after="0"/>
+              <w:jc w:val="center"/>
+              <w:rPr>
+                <w:rFonts w:ascii="맑은 고딕" w:eastAsia="맑은 고딕" w:hAnsi="맑은 고딕" w:cs="굴림" w:hint="eastAsia"/>
+                <w:color w:val="000000"/>
+                <w:kern w:val="0"/>
+                <w:sz w:val="16"/>
+                <w:szCs w:val="16"/>
+                <w14:ligatures w14:val="none"/>
+              </w:rPr>
+            </w:pPr>
+            <w:r>
+              <w:rPr>
+                <w:rFonts w:ascii="맑은 고딕" w:eastAsia="맑은 고딕" w:hAnsi="맑은 고딕" w:cs="굴림" w:hint="eastAsia"/>
+                <w:color w:val="000000"/>
+                <w:kern w:val="0"/>
+                <w:sz w:val="16"/>
+                <w:szCs w:val="16"/>
+                <w14:ligatures w14:val="none"/>
+              </w:rPr>
+              <w:t>표준단가</w:t>
+            </w:r>
+          </w:p>
+        </w:tc>
+        <w:tc>
+          <w:tcPr>
+            <w:tcW w:w="1860" w:type="dxa"/>
+            <w:tcBorders>
+              <w:top w:val="single" w:sz="2" w:space="0" w:color="000000"/>
+              <w:left w:val="single" w:sz="2" w:space="0" w:color="000000"/>
+              <w:bottom w:val="single" w:sz="2" w:space="0" w:color="000000"/>
+              <w:right w:val="single" w:sz="2" w:space="0" w:color="000000"/>
+            </w:tcBorders>
+            <w:tcMar>
+              <w:top w:w="0" w:type="dxa"/>
+              <w:left w:w="105" w:type="dxa"/>
+              <w:bottom w:w="0" w:type="dxa"/>
+              <w:right w:w="105" w:type="dxa"/>
+            </w:tcMar>
+            <w:vAlign w:val="center"/>
+          </w:tcPr>
+          <w:p>
+            <w:pPr>
+              <w:widowControl/>
+              <w:wordWrap/>
+              <w:autoSpaceDE/>
+              <w:autoSpaceDN/>
+              <w:spacing w:after="0"/>
+              <w:jc w:val="center"/>
+              <w:rPr>
+                <w:rFonts w:ascii="맑은 고딕" w:eastAsia="맑은 고딕" w:hAnsi="맑은 고딕" w:cs="굴림" w:hint="eastAsia"/>
+                <w:color w:val="000000"/>
+                <w:kern w:val="0"/>
+                <w:sz w:val="16"/>
+                <w:szCs w:val="16"/>
+                <w14:ligatures w14:val="none"/>
+              </w:rPr>
+            </w:pPr>
+            <w:r>
+              <w:rPr>
+                <w:rFonts w:ascii="맑은 고딕" w:eastAsia="맑은 고딕" w:hAnsi="맑은 고딕" w:cs="굴림" w:hint="eastAsia"/>
+                <w:color w:val="000000"/>
+                <w:kern w:val="0"/>
+                <w:sz w:val="16"/>
+                <w:szCs w:val="16"/>
+                <w14:ligatures w14:val="none"/>
+              </w:rPr>
+              <w:t>6개월</w:t>
+            </w:r>
+          </w:p>
+        </w:tc>
+        <w:tc>
+          <w:tcPr>
+            <w:tcW w:w="1665" w:type="dxa"/>
+            <w:tcBorders>
+              <w:top w:val="single" w:sz="2" w:space="0" w:color="000000"/>
+              <w:left w:val="single" w:sz="2" w:space="0" w:color="000000"/>
+              <w:bottom w:val="single" w:sz="2" w:space="0" w:color="000000"/>
+              <w:right w:val="single" w:sz="2" w:space="0" w:color="000000"/>
+            </w:tcBorders>
+            <w:tcMar>
+              <w:top w:w="0" w:type="dxa"/>
+              <w:left w:w="105" w:type="dxa"/>
+              <w:bottom w:w="0" w:type="dxa"/>
+              <w:right w:w="105" w:type="dxa"/>
+            </w:tcMar>
+            <w:vAlign w:val="center"/>
+          </w:tcPr>
+          <w:p>
+            <w:pPr>
+              <w:widowControl/>
+              <w:wordWrap/>
+              <w:autoSpaceDE/>
+              <w:autoSpaceDN/>
+              <w:spacing w:after="0"/>
+              <w:jc w:val="center"/>
+              <w:rPr>
+                <w:rFonts w:ascii="맑은 고딕" w:eastAsia="맑은 고딕" w:hAnsi="맑은 고딕" w:cs="굴림" w:hint="eastAsia"/>
+                <w:color w:val="000000"/>
+                <w:kern w:val="0"/>
+                <w:sz w:val="16"/>
+                <w:szCs w:val="16"/>
+                <w14:ligatures w14:val="none"/>
+              </w:rPr>
+            </w:pPr>
+            <w:r>
+              <w:rPr>
+                <w:rFonts w:ascii="맑은 고딕" w:eastAsia="맑은 고딕" w:hAnsi="맑은 고딕" w:cs="굴림" w:hint="eastAsia"/>
+                <w:color w:val="000000"/>
+                <w:kern w:val="0"/>
+                <w:sz w:val="16"/>
+                <w:szCs w:val="16"/>
+                <w14:ligatures w14:val="none"/>
+              </w:rPr>
+              <w:t>150원</w:t>
+            </w:r>
+          </w:p>
+        </w:tc>
+      </w:tr>
+    </w:tbl>
+    <w:p>
+      <w:pPr>
+        <w:widowControl/>
+        <w:wordWrap/>
+        <w:autoSpaceDE/>
+        <w:autoSpaceDN/>
+        <w:spacing w:after="0" w:line="408" w:lineRule="auto"/>
+        <w:rPr>
+          <w:rFonts w:ascii="맑은 고딕" w:eastAsia="맑은 고딕" w:hAnsi="맑은 고딕" w:cs="굴림"/>
+          <w:color w:val="000000"/>
+          <w:kern w:val="0"/>
+          <w:szCs w:val="22"/>
+          <w14:ligatures w14:val="none"/>
+        </w:rPr>
+      </w:pPr>
+      <w:r>
+        <w:rPr>
+          <w:rFonts w:ascii="맑은 고딕" w:eastAsia="맑은 고딕" w:hAnsi="맑은 고딕" w:cs="굴림" w:hint="eastAsia"/>
+          <w:b/>
+          <w:bCs/>
+          <w:color w:val="000000"/>
+          <w:kern w:val="0"/>
+          <w:sz w:val="16"/>
+          <w:szCs w:val="16"/>
+          <w14:ligatures w14:val="none"/>
+        </w:rPr>
+        <w:t>[NOTE]</w:t>
+      </w:r>
+    </w:p>
+    <w:p>
+      <w:pPr>
+        <w:widowControl/>
+        <w:wordWrap/>
+        <w:autoSpaceDE/>
+        <w:autoSpaceDN/>
+        <w:spacing w:after="0" w:line="408" w:lineRule="auto"/>
+        <w:rPr>
+          <w:rFonts w:ascii="맑은 고딕" w:eastAsia="맑은 고딕" w:hAnsi="맑은 고딕" w:cs="굴림"/>
+          <w:color w:val="000000"/>
+          <w:kern w:val="0"/>
+          <w:szCs w:val="22"/>
+          <w14:ligatures w14:val="none"/>
+        </w:rPr>
+      </w:pPr>
+      <w:r>
+        <w:rPr>
+          <w:rFonts w:ascii="맑은 고딕" w:eastAsia="맑은 고딕" w:hAnsi="맑은 고딕" w:cs="굴림" w:hint="eastAsia"/>
+          <w:color w:val="000000"/>
+          <w:kern w:val="0"/>
+          <w:sz w:val="16"/>
+          <w:szCs w:val="16"/>
+          <w14:ligatures w14:val="none"/>
+        </w:rPr>
+        <w:t>1) 프로모션 충전 요금은 서비스 시작일에 적용(SK</w:t>
+      </w:r>
+      <w:proofErr w:type="spellStart"/>
+      <w:r>
+        <w:rPr>
+          <w:rFonts w:ascii="맑은 고딕" w:eastAsia="맑은 고딕" w:hAnsi="맑은 고딕" w:cs="굴림" w:hint="eastAsia"/>
+          <w:color w:val="000000"/>
+          <w:kern w:val="0"/>
+          <w:sz w:val="16"/>
+          <w:szCs w:val="16"/>
+          <w14:ligatures w14:val="none"/>
+        </w:rPr>
+        <w:t>일렉링크</w:t>
+      </w:r>
+      <w:proofErr w:type="spellEnd"/>
+      <w:r>
+        <w:rPr>
+          <w:rFonts w:ascii="맑은 고딕" w:eastAsia="맑은 고딕" w:hAnsi="맑은 고딕" w:cs="굴림" w:hint="eastAsia"/>
+          <w:color w:val="000000"/>
+          <w:kern w:val="0"/>
+          <w:sz w:val="16"/>
+          <w:szCs w:val="16"/>
+          <w14:ligatures w14:val="none"/>
+        </w:rPr>
+        <w:t xml:space="preserve"> 회원 기준)</w:t>
+      </w:r>
+    </w:p>
+    <w:p>
+      <w:pPr>
+        <w:widowControl/>
+        <w:wordWrap/>
+        <w:autoSpaceDE/>
+        <w:autoSpaceDN/>
+        <w:spacing w:after="0" w:line="408" w:lineRule="auto"/>
+        <w:rPr>
+          <w:rFonts w:ascii="맑은 고딕" w:eastAsia="맑은 고딕" w:hAnsi="맑은 고딕" w:cs="굴림"/>
+          <w:color w:val="000000"/>
+          <w:kern w:val="0"/>
+          <w:szCs w:val="22"/>
+          <w14:ligatures w14:val="none"/>
+        </w:rPr>
+      </w:pPr>
+      <w:r>
+        <w:rPr>
+          <w:rFonts w:ascii="맑은 고딕" w:eastAsia="맑은 고딕" w:hAnsi="맑은 고딕" w:cs="굴림" w:hint="eastAsia"/>
+          <w:color w:val="000000"/>
+          <w:kern w:val="0"/>
+          <w:sz w:val="16"/>
+          <w:szCs w:val="16"/>
+          <w14:ligatures w14:val="none"/>
+        </w:rPr>
+        <w:t>2) 프로모션 종료 후 충전단가는SK</w:t>
+      </w:r>
+      <w:proofErr w:type="spellStart"/>
+      <w:r>
+        <w:rPr>
+          <w:rFonts w:ascii="맑은 고딕" w:eastAsia="맑은 고딕" w:hAnsi="맑은 고딕" w:cs="굴림" w:hint="eastAsia"/>
+          <w:color w:val="000000"/>
+          <w:kern w:val="0"/>
+          <w:sz w:val="16"/>
+          <w:szCs w:val="16"/>
+          <w14:ligatures w14:val="none"/>
+        </w:rPr>
+        <w:t>일렉링크</w:t>
+      </w:r>
+      <w:proofErr w:type="spellEnd"/>
+      <w:r>
+        <w:rPr>
+          <w:rFonts w:ascii="맑은 고딕" w:eastAsia="맑은 고딕" w:hAnsi="맑은 고딕" w:cs="굴림" w:hint="eastAsia"/>
+          <w:color w:val="000000"/>
+          <w:kern w:val="0"/>
+          <w:sz w:val="16"/>
+          <w:szCs w:val="16"/>
+          <w14:ligatures w14:val="none"/>
+        </w:rPr>
+        <w:t xml:space="preserve"> 표준단가 적용</w:t>
+      </w:r>
+    </w:p>
+    <w:p>
+      <w:pPr>
+        <w:widowControl/>
+        <w:wordWrap/>
+        <w:autoSpaceDE/>
+        <w:autoSpaceDN/>
+        <w:spacing w:after="0" w:line="408" w:lineRule="auto"/>
+        <w:rPr>
+          <w:rFonts w:ascii="맑은 고딕" w:eastAsia="맑은 고딕" w:hAnsi="맑은 고딕" w:cs="굴림"/>
+          <w:color w:val="000000"/>
+          <w:kern w:val="0"/>
+          <w:szCs w:val="22"/>
+          <w14:ligatures w14:val="none"/>
+        </w:rPr>
+      </w:pPr>
+      <w:r>
+        <w:rPr>
+          <w:rFonts w:ascii="맑은 고딕" w:eastAsia="맑은 고딕" w:hAnsi="맑은 고딕" w:cs="굴림" w:hint="eastAsia"/>
+          <w:kern w:val="0"/>
+          <w:sz w:val="16"/>
+          <w:szCs w:val="16"/>
+          <w14:ligatures w14:val="none"/>
+        </w:rPr>
+        <w:t>3) 표준 충전단가는 한전 단가 인상/환경부 충전요금 인상/물가인상에 따라 변동</w:t>
+      </w:r>
       <w:r>
         <w:rPr>
           <w:rFonts w:ascii="맑은 고딕" w:eastAsia="맑은 고딕" w:hAnsi="맑은 고딕" w:cs="Times New Roman"/>
@@ -3786,7 +6270,31 @@
           <w:szCs w:val="32"/>
           <w:u w:val="single"/>
         </w:rPr>
-        <w:t>전기자동차 완속충전시설 설치 신청서</w:t>
+        <w:t xml:space="preserve">전기자동차 </w:t>
+      </w:r>
+      <w:proofErr w:type="spellStart"/>
+      <w:r>
+        <w:rPr>
+          <w:rFonts w:hint="eastAsia"/>
+          <w:b/>
+          <w:bCs/>
+          <w:sz w:val="32"/>
+          <w:szCs w:val="32"/>
+          <w:u w:val="single"/>
+        </w:rPr>
+        <w:t>완속충전시설</w:t>
+      </w:r>
+      <w:proofErr w:type="spellEnd"/>
+      <w:r>
+        <w:rPr>
+          <w:rFonts w:hint="eastAsia"/>
+          <w:b/>
+          <w:bCs/>
+          <w:sz w:val="32"/>
+          <w:szCs w:val="32"/>
+          <w:u w:val="single"/>
+        </w:rPr>
+        <w:t xml:space="preserve"> 설치 신청서</w:t>
       </w:r>
     </w:p>
     <w:tbl>
@@ -3806,11 +6314,8 @@
         <w:gridCol w:w="1554"/>
         <w:gridCol w:w="1555"/>
         <w:gridCol w:w="1847"/>
-        <w:gridCol w:w="602"/>
-        <w:gridCol w:w="1041"/>
-        <w:gridCol w:w="61"/>
-        <w:gridCol w:w="1347"/>
-        <w:gridCol w:w="520"/>
+        <w:gridCol w:w="1704"/>
+        <w:gridCol w:w="1867"/>
         <w:gridCol w:w="1929"/>
       </w:tblGrid>
       <w:tr>
@@ -3845,7 +6350,7 @@
         <w:tc>
           <w:tcPr>
             <w:tcW w:w="5096" w:type="dxa"/>
-            <w:gridSpan w:val="5"/>
+            <w:gridSpan w:val="3"/>
             <w:vAlign w:val="center"/>
           </w:tcPr>
           <w:p>
@@ -3896,7 +6401,6 @@
         <w:tc>
           <w:tcPr>
             <w:tcW w:w="1863" w:type="dxa"/>
-            <w:gridSpan w:val="2"/>
             <w:vAlign w:val="center"/>
           </w:tcPr>
           <w:p>
@@ -3913,8 +6417,18 @@
                 <w:sz w:val="18"/>
                 <w:szCs w:val="18"/>
               </w:rPr>
-              <w:t>보유 주차면수</w:t>
-            </w:r>
+              <w:t xml:space="preserve">보유 </w:t>
+            </w:r>
+            <w:proofErr w:type="spellStart"/>
+            <w:r>
+              <w:rPr>
+                <w:rFonts w:hint="eastAsia"/>
+                <w:sz w:val="18"/>
+                <w:szCs w:val="18"/>
+              </w:rPr>
+              <w:t>주차면수</w:t>
+            </w:r>
+            <w:proofErr w:type="spellEnd"/>
           </w:p>
         </w:tc>
         <w:bookmarkStart w:id="2" w:name="Parkinglot"/>
@@ -4019,7 +6533,7 @@
         <w:tc>
           <w:tcPr>
             <w:tcW w:w="8884" w:type="dxa"/>
-            <w:gridSpan w:val="8"/>
+            <w:gridSpan w:val="5"/>
             <w:vAlign w:val="center"/>
           </w:tcPr>
           <w:p>
@@ -4221,7 +6735,7 @@
         <w:tc>
           <w:tcPr>
             <w:tcW w:w="8884" w:type="dxa"/>
-            <w:gridSpan w:val="8"/>
+            <w:gridSpan w:val="5"/>
             <w:vAlign w:val="center"/>
           </w:tcPr>
           <w:p>
@@ -4548,7 +7062,6 @@
             <w:tc>
               <w:tcPr>
                 <w:tcW w:w="1701" w:type="dxa"/>
-                <w:gridSpan w:val="3"/>
                 <w:vAlign w:val="center"/>
               </w:tcPr>
               <w:p>
@@ -4581,7 +7094,6 @@
         <w:tc>
           <w:tcPr>
             <w:tcW w:w="1863" w:type="dxa"/>
-            <w:gridSpan w:val="2"/>
             <w:vAlign w:val="center"/>
           </w:tcPr>
           <w:p>
@@ -4713,6 +7225,7 @@
               </w:rPr>
               <w:t>SK</w:t>
             </w:r>
+            <w:proofErr w:type="spellStart"/>
             <w:r>
               <w:rPr>
                 <w:rFonts w:hint="eastAsia"/>
@@ -4721,6 +7234,7 @@
               </w:rPr>
               <w:t>일렉링크</w:t>
             </w:r>
+            <w:proofErr w:type="spellEnd"/>
           </w:p>
         </w:tc>
         <w:tc>
@@ -4750,7 +7264,6 @@
         <w:tc>
           <w:tcPr>
             <w:tcW w:w="1701" w:type="dxa"/>
-            <w:gridSpan w:val="3"/>
             <w:vAlign w:val="center"/>
           </w:tcPr>
           <w:p>
@@ -4774,7 +7287,6 @@
         <w:tc>
           <w:tcPr>
             <w:tcW w:w="1863" w:type="dxa"/>
-            <w:gridSpan w:val="2"/>
             <w:vAlign w:val="center"/>
           </w:tcPr>
           <w:p>
@@ -4903,7 +7415,6 @@
             <w:tc>
               <w:tcPr>
                 <w:tcW w:w="1701" w:type="dxa"/>
-                <w:gridSpan w:val="3"/>
                 <w:vAlign w:val="center"/>
               </w:tcPr>
               <w:p>
@@ -4970,7 +7481,6 @@
             <w:tc>
               <w:tcPr>
                 <w:tcW w:w="1863" w:type="dxa"/>
-                <w:gridSpan w:val="2"/>
                 <w:vAlign w:val="center"/>
               </w:tcPr>
               <w:p>
@@ -5127,7 +7637,6 @@
         <w:tc>
           <w:tcPr>
             <w:tcW w:w="1701" w:type="dxa"/>
-            <w:gridSpan w:val="3"/>
             <w:vAlign w:val="center"/>
           </w:tcPr>
           <w:p>
@@ -5144,14 +7653,14 @@
                 <w:sz w:val="18"/>
                 <w:szCs w:val="18"/>
               </w:rPr>
-              <w:t xml:space="preserve">활동내용</w:t>
+              <w:t>활동내용</w:t>
             </w:r>
           </w:p>
         </w:tc>
         <w:tc>
           <w:tcPr>
             <w:tcW w:w="1863" w:type="dxa"/>
-            <w:gridSpan w:val="3"/>
+            <w:gridSpan w:val="2"/>
             <w:vAlign w:val="center"/>
           </w:tcPr>
           <w:p>
@@ -5167,21 +7676,6 @@
                 <w:u w:val="single"/>
               </w:rPr>
             </w:pPr>
-            <w:r>
-              <w:rPr>
-                <w:rStyle w:val="ad"/>
-                <w:rFonts w:hint="eastAsia"/>
-                <w:b/>
-                <w:bCs/>
-                <w:i/>
-                <w:iCs/>
-                <w:color w:val="A6A6A6" w:themeColor="background1" w:themeShade="A6"/>
-                <w:sz w:val="18"/>
-                <w:szCs w:val="18"/>
-                <w:u w:val="single"/>
-              </w:rPr>
-              <w:t xml:space="preserve"/>
-            </w:r>
           </w:p>
         </w:tc>
       </w:tr>
@@ -5224,7 +7718,7 @@
         <w:tc>
           <w:tcPr>
             <w:tcW w:w="7332" w:type="dxa"/>
-            <w:gridSpan w:val="7"/>
+            <w:gridSpan w:val="4"/>
             <w:vAlign w:val="center"/>
           </w:tcPr>
           <w:p>
@@ -5270,12 +7764,21 @@
                 <w:szCs w:val="18"/>
               </w:rPr>
             </w:pPr>
-            <w:r>
-              <w:rPr>
-                <w:sz w:val="18"/>
-                <w:szCs w:val="18"/>
-              </w:rPr>
-              <w:t>가능하오니 사업수행기관에 필히 확인 후 진행하여 주시기 바랍니다.</w:t>
+            <w:proofErr w:type="spellStart"/>
+            <w:r>
+              <w:rPr>
+                <w:sz w:val="18"/>
+                <w:szCs w:val="18"/>
+              </w:rPr>
+              <w:t>가능하오니</w:t>
+            </w:r>
+            <w:proofErr w:type="spellEnd"/>
+            <w:r>
+              <w:rPr>
+                <w:sz w:val="18"/>
+                <w:szCs w:val="18"/>
+              </w:rPr>
+              <w:t xml:space="preserve"> 사업수행기관에 필히 확인 후 진행하여 주시기 바랍니다.</w:t>
             </w:r>
           </w:p>
         </w:tc>
@@ -5310,7 +7813,7 @@
         <w:tc>
           <w:tcPr>
             <w:tcW w:w="6959" w:type="dxa"/>
-            <w:gridSpan w:val="7"/>
+            <w:gridSpan w:val="4"/>
             <w:vAlign w:val="center"/>
           </w:tcPr>
           <w:p>
@@ -5403,7 +7906,7 @@
         <w:tc>
           <w:tcPr>
             <w:tcW w:w="6959" w:type="dxa"/>
-            <w:gridSpan w:val="7"/>
+            <w:gridSpan w:val="4"/>
             <w:vAlign w:val="center"/>
           </w:tcPr>
           <w:p>
@@ -5445,7 +7948,23 @@
                 <w:sz w:val="18"/>
                 <w:szCs w:val="18"/>
               </w:rPr>
-              <w:t>『지방세법』,에 따라 충전시설 설치 시에 취득세, 재산세를 납부하여야 함</w:t>
+              <w:t>『지방세법』,</w:t>
+            </w:r>
+            <w:proofErr w:type="spellStart"/>
+            <w:r>
+              <w:rPr>
+                <w:sz w:val="18"/>
+                <w:szCs w:val="18"/>
+              </w:rPr>
+              <w:t>에</w:t>
+            </w:r>
+            <w:proofErr w:type="spellEnd"/>
+            <w:r>
+              <w:rPr>
+                <w:sz w:val="18"/>
+                <w:szCs w:val="18"/>
+              </w:rPr>
+              <w:t xml:space="preserve"> 따라 충전시설 설치 시에 취득세, 재산세를 납부하여야 함</w:t>
             </w:r>
           </w:p>
         </w:tc>
@@ -5543,7 +8062,7 @@
         <w:tc>
           <w:tcPr>
             <w:tcW w:w="6959" w:type="dxa"/>
-            <w:gridSpan w:val="7"/>
+            <w:gridSpan w:val="4"/>
             <w:vAlign w:val="center"/>
           </w:tcPr>
           <w:p>
@@ -5588,7 +8107,23 @@
                 <w:sz w:val="18"/>
                 <w:szCs w:val="18"/>
               </w:rPr>
-              <w:t>무공해차 통합누리집에 위치, 상태정보 표시</w:t>
+              <w:t xml:space="preserve">무공해차 </w:t>
+            </w:r>
+            <w:proofErr w:type="spellStart"/>
+            <w:r>
+              <w:rPr>
+                <w:sz w:val="18"/>
+                <w:szCs w:val="18"/>
+              </w:rPr>
+              <w:t>통합누리집에</w:t>
+            </w:r>
+            <w:proofErr w:type="spellEnd"/>
+            <w:r>
+              <w:rPr>
+                <w:sz w:val="18"/>
+                <w:szCs w:val="18"/>
+              </w:rPr>
+              <w:t xml:space="preserve"> 위치, 상태정보 표시</w:t>
             </w:r>
           </w:p>
           <w:p>
@@ -5610,7 +8145,23 @@
                 <w:sz w:val="18"/>
                 <w:szCs w:val="18"/>
               </w:rPr>
-              <w:t xml:space="preserve">외부인의 출입을 제한하더라도 무공해차 통합누리집에 충전시설 위치, </w:t>
+              <w:t xml:space="preserve">외부인의 출입을 제한하더라도 무공해차 </w:t>
+            </w:r>
+            <w:proofErr w:type="spellStart"/>
+            <w:r>
+              <w:rPr>
+                <w:sz w:val="18"/>
+                <w:szCs w:val="18"/>
+              </w:rPr>
+              <w:t>통합누리집에</w:t>
+            </w:r>
+            <w:proofErr w:type="spellEnd"/>
+            <w:r>
+              <w:rPr>
+                <w:sz w:val="18"/>
+                <w:szCs w:val="18"/>
+              </w:rPr>
+              <w:t xml:space="preserve"> 충전시설 위치, </w:t>
             </w:r>
             <w:r>
               <w:rPr>
@@ -5721,7 +8272,7 @@
         <w:tc>
           <w:tcPr>
             <w:tcW w:w="1924" w:type="dxa"/>
-            <w:gridSpan w:val="4"/>
+            <w:gridSpan w:val="2"/>
             <w:vAlign w:val="center"/>
           </w:tcPr>
           <w:p>
@@ -5739,14 +8290,14 @@
                 <w:sz w:val="18"/>
                 <w:szCs w:val="18"/>
               </w:rPr>
-              <w:t xml:space="preserve">7kW 이상 ~ 11kW 미만</w:t>
+              <w:t>7kW 이상 ~ 11kW 미만</w:t>
             </w:r>
           </w:p>
         </w:tc>
         <w:tc>
           <w:tcPr>
             <w:tcW w:w="1924" w:type="dxa"/>
-            <w:gridSpan w:val="3"/>
+            <w:gridSpan w:val="2"/>
             <w:vAlign w:val="center"/>
           </w:tcPr>
           <w:p>
@@ -5849,7 +8400,7 @@
         <w:tc>
           <w:tcPr>
             <w:tcW w:w="1924" w:type="dxa"/>
-            <w:gridSpan w:val="4"/>
+            <w:gridSpan w:val="2"/>
             <w:vAlign w:val="center"/>
           </w:tcPr>
           <w:p>
@@ -5867,14 +8418,14 @@
                 <w:sz w:val="18"/>
                 <w:szCs w:val="18"/>
               </w:rPr>
-              <w:t xml:space="preserve">11kW 이상 ~ 30kW 미만</w:t>
-            </w:r>
-          </w:p>
-        </w:tc>
-        <w:tc>
-          <w:tcPr>
-            <w:gridSpan w:val="3"/>
+              <w:t>11kW 이상 ~ 30kW 미만</w:t>
+            </w:r>
+          </w:p>
+        </w:tc>
+        <w:tc>
+          <w:tcPr>
             <w:tcW w:w="1925" w:type="dxa"/>
+            <w:gridSpan w:val="2"/>
             <w:vAlign w:val="center"/>
           </w:tcPr>
           <w:p>
@@ -5932,7 +8483,7 @@
         <w:tc>
           <w:tcPr>
             <w:tcW w:w="1924" w:type="dxa"/>
-            <w:gridSpan w:val="4"/>
+            <w:gridSpan w:val="2"/>
             <w:vAlign w:val="center"/>
           </w:tcPr>
           <w:p>
@@ -5950,14 +8501,14 @@
                 <w:sz w:val="18"/>
                 <w:szCs w:val="18"/>
               </w:rPr>
-              <w:t xml:space="preserve">전력분배형</w:t>
+              <w:t>전력분배형</w:t>
             </w:r>
           </w:p>
         </w:tc>
         <w:tc>
           <w:tcPr>
             <w:tcW w:w="2444" w:type="dxa"/>
-            <w:gridSpan w:val="3"/>
+            <w:gridSpan w:val="2"/>
             <w:vAlign w:val="center"/>
           </w:tcPr>
           <w:p>
@@ -6025,7 +8576,7 @@
         <w:tc>
           <w:tcPr>
             <w:tcW w:w="7332" w:type="dxa"/>
-            <w:gridSpan w:val="7"/>
+            <w:gridSpan w:val="4"/>
             <w:vAlign w:val="center"/>
           </w:tcPr>
           <w:p>
@@ -6116,7 +8667,7 @@
         <w:tc>
           <w:tcPr>
             <w:tcW w:w="7332" w:type="dxa"/>
-            <w:gridSpan w:val="7"/>
+            <w:gridSpan w:val="4"/>
             <w:vAlign w:val="center"/>
           </w:tcPr>
           <w:p>
@@ -6137,7 +8688,7 @@
         <w:tc>
           <w:tcPr>
             <w:tcW w:w="10436" w:type="dxa"/>
-            <w:gridSpan w:val="9"/>
+            <w:gridSpan w:val="6"/>
           </w:tcPr>
           <w:p>
             <w:pPr>
@@ -6161,7 +8712,21 @@
               <w:rPr>
                 <w:sz w:val="24"/>
               </w:rPr>
-              <w:t>2026년도 전기차 공용 완속충전시설 설치 보조사업과 관련하여 신청서에 기입한 사항이 틀림</w:t>
+              <w:t xml:space="preserve">2026년도 전기차 공용 </w:t>
+            </w:r>
+            <w:proofErr w:type="spellStart"/>
+            <w:r>
+              <w:rPr>
+                <w:sz w:val="24"/>
+              </w:rPr>
+              <w:t>완속충전시설</w:t>
+            </w:r>
+            <w:proofErr w:type="spellEnd"/>
+            <w:r>
+              <w:rPr>
+                <w:sz w:val="24"/>
+              </w:rPr>
+              <w:t xml:space="preserve"> 설치 보조사업과 관련하여 신청서에 기입한 사항이 틀림</w:t>
             </w:r>
             <w:r>
               <w:rPr>
@@ -6243,8 +8808,8 @@
                 </w:r>
               </w:sdtContent>
             </w:sdt>
-            <w:bookmarkStart w:id="10" w:name="ContMonth4"/>
-            <w:bookmarkEnd w:id="10"/>
+            <w:bookmarkStart w:id="9" w:name="ContMonth4"/>
+            <w:bookmarkEnd w:id="9"/>
             <w:r>
               <w:rPr>
                 <w:sz w:val="24"/>
@@ -6294,8 +8859,8 @@
                 </w:r>
               </w:sdtContent>
             </w:sdt>
-            <w:bookmarkStart w:id="11" w:name="ContDay4"/>
-            <w:bookmarkEnd w:id="11"/>
+            <w:bookmarkStart w:id="10" w:name="ContDay4"/>
+            <w:bookmarkEnd w:id="10"/>
             <w:r>
               <w:rPr>
                 <w:sz w:val="24"/>
@@ -6332,8 +8897,8 @@
               </w:rPr>
               <w:t xml:space="preserve">: </w:t>
             </w:r>
-            <w:bookmarkStart w:id="12" w:name="CustName5"/>
-            <w:bookmarkEnd w:id="12"/>
+            <w:bookmarkStart w:id="11" w:name="CustName5"/>
+            <w:bookmarkEnd w:id="11"/>
             <w:sdt>
               <w:sdtPr>
                 <w:rPr>
@@ -6551,7 +9116,29 @@
           <w:sz w:val="24"/>
           <w14:ligatures w14:val="none"/>
         </w:rPr>
-        <w:t>전기차 충전기 설치공사 관련하여 에스케이일렉링크 주식회사가</w:t>
+        <w:t xml:space="preserve">전기차 충전기 설치공사 관련하여 </w:t>
+      </w:r>
+      <w:proofErr w:type="spellStart"/>
+      <w:r>
+        <w:rPr>
+          <w:rFonts w:asciiTheme="majorEastAsia" w:eastAsiaTheme="majorEastAsia" w:hAnsiTheme="majorEastAsia" w:cs="함초롬바탕" w:hint="eastAsia"/>
+          <w:color w:val="000000"/>
+          <w:kern w:val="0"/>
+          <w:sz w:val="24"/>
+          <w14:ligatures w14:val="none"/>
+        </w:rPr>
+        <w:t>에스케이일렉링크</w:t>
+      </w:r>
+      <w:proofErr w:type="spellEnd"/>
+      <w:r>
+        <w:rPr>
+          <w:rFonts w:asciiTheme="majorEastAsia" w:eastAsiaTheme="majorEastAsia" w:hAnsiTheme="majorEastAsia" w:cs="함초롬바탕" w:hint="eastAsia"/>
+          <w:color w:val="000000"/>
+          <w:kern w:val="0"/>
+          <w:sz w:val="24"/>
+          <w14:ligatures w14:val="none"/>
+        </w:rPr>
+        <w:t xml:space="preserve"> 주식회사가</w:t>
       </w:r>
     </w:p>
     <w:p>
@@ -7457,7 +10044,7 @@
           <w14:ligatures w14:val="none"/>
         </w:rPr>
         <w:drawing>
-          <wp:inline distT="0" distB="0" distL="0" distR="0" wp14:anchorId="62DD3FC8" wp14:editId="48736DF2">
+          <wp:inline distT="0" distB="0" distL="0" distR="0" wp14:anchorId="62DD3FC8" wp14:editId="0EF9EADA">
             <wp:extent cx="1477107" cy="596469"/>
             <wp:effectExtent l="0" t="0" r="0" b="635"/>
             <wp:docPr id="388606673" name="그림 1"/>
@@ -7524,6 +10111,7 @@
           <w14:ligatures w14:val="none"/>
         </w:rPr>
       </w:pPr>
+      <w:proofErr w:type="spellStart"/>
       <w:r>
         <w:rPr>
           <w:rFonts w:ascii="KoPub돋움체 Bold,한컴돋움" w:eastAsia="KoPub돋움체 Bold,한컴돋움" w:hAnsi="KoPub돋움체 Bold,한컴돋움" w:cs="KoPub돋움체 Bold,한컴돋움" w:hint="eastAsia"/>
@@ -7533,7 +10121,19 @@
           <w:sz w:val="24"/>
           <w14:ligatures w14:val="none"/>
         </w:rPr>
-        <w:t>에스케이일렉링크 주식회사</w:t>
+        <w:t>에스케이일렉링크</w:t>
+      </w:r>
+      <w:proofErr w:type="spellEnd"/>
+      <w:r>
+        <w:rPr>
+          <w:rFonts w:ascii="KoPub돋움체 Bold,한컴돋움" w:eastAsia="KoPub돋움체 Bold,한컴돋움" w:hAnsi="KoPub돋움체 Bold,한컴돋움" w:cs="KoPub돋움체 Bold,한컴돋움" w:hint="eastAsia"/>
+          <w:color w:val="000000"/>
+          <w:spacing w:val="-2"/>
+          <w:kern w:val="0"/>
+          <w:sz w:val="24"/>
+          <w14:ligatures w14:val="none"/>
+        </w:rPr>
+        <w:t xml:space="preserve"> 주식회사</w:t>
       </w:r>
     </w:p>
     <w:p>
@@ -7609,7 +10209,17 @@
                 <w:bCs/>
                 <w:szCs w:val="22"/>
               </w:rPr>
-              <w:t xml:space="preserve"> 수집</w:t>
+              <w:t xml:space="preserve"> </w:t>
+            </w:r>
+            <w:proofErr w:type="spellStart"/>
+            <w:r>
+              <w:rPr>
+                <w:rFonts w:hAnsiTheme="minorEastAsia"/>
+                <w:b/>
+                <w:bCs/>
+                <w:szCs w:val="22"/>
+              </w:rPr>
+              <w:t>수집</w:t>
             </w:r>
             <w:r>
               <w:rPr>
@@ -7629,6 +10239,7 @@
               </w:rPr>
               <w:t>이용</w:t>
             </w:r>
+            <w:proofErr w:type="spellEnd"/>
             <w:r>
               <w:rPr>
                 <w:rFonts w:hAnsiTheme="minorEastAsia"/>
@@ -7664,7 +10275,52 @@
                 <w:sz w:val="18"/>
                 <w:szCs w:val="18"/>
               </w:rPr>
-              <w:t>충전인프라 설치 지원과 관련하여 「개인정보보호법」제15조(개인정보의 수집ㆍ이용) 및 제22조에 따라 귀하의 개인정보를 아래와 같이 수집</w:t>
+              <w:t>충전인프라 설치 지원과 관련하여 「</w:t>
+            </w:r>
+            <w:proofErr w:type="spellStart"/>
+            <w:r>
+              <w:rPr>
+                <w:rFonts w:hAnsiTheme="minorEastAsia"/>
+                <w:sz w:val="18"/>
+                <w:szCs w:val="18"/>
+              </w:rPr>
+              <w:t>개인정보보호법」제</w:t>
+            </w:r>
+            <w:proofErr w:type="spellEnd"/>
+            <w:r>
+              <w:rPr>
+                <w:rFonts w:hAnsiTheme="minorEastAsia"/>
+                <w:sz w:val="18"/>
+                <w:szCs w:val="18"/>
+              </w:rPr>
+              <w:t xml:space="preserve">15조(개인정보의 </w:t>
+            </w:r>
+            <w:proofErr w:type="spellStart"/>
+            <w:r>
+              <w:rPr>
+                <w:rFonts w:hAnsiTheme="minorEastAsia"/>
+                <w:sz w:val="18"/>
+                <w:szCs w:val="18"/>
+              </w:rPr>
+              <w:t>수집ㆍ이용</w:t>
+            </w:r>
+            <w:proofErr w:type="spellEnd"/>
+            <w:r>
+              <w:rPr>
+                <w:rFonts w:hAnsiTheme="minorEastAsia"/>
+                <w:sz w:val="18"/>
+                <w:szCs w:val="18"/>
+              </w:rPr>
+              <w:t xml:space="preserve">) 및 제22조에 따라 귀하의 개인정보를 아래와 같이 </w:t>
+            </w:r>
+            <w:proofErr w:type="spellStart"/>
+            <w:r>
+              <w:rPr>
+                <w:rFonts w:hAnsiTheme="minorEastAsia"/>
+                <w:sz w:val="18"/>
+                <w:szCs w:val="18"/>
+              </w:rPr>
+              <w:t>수집</w:t>
             </w:r>
             <w:r>
               <w:rPr>
@@ -7682,6 +10338,7 @@
               </w:rPr>
               <w:t>이용</w:t>
             </w:r>
+            <w:proofErr w:type="spellEnd"/>
             <w:r>
               <w:rPr>
                 <w:rFonts w:hAnsiTheme="minorEastAsia"/>
@@ -7706,7 +10363,25 @@
                 <w:sz w:val="18"/>
                 <w:szCs w:val="18"/>
               </w:rPr>
-              <w:t>다음의 사항에 대해 충분히 읽어보신 후, 동의 여부를 체크, 서명하여 주시기 바랍니다.</w:t>
+              <w:t xml:space="preserve">다음의 사항에 대해 충분히 </w:t>
+            </w:r>
+            <w:proofErr w:type="spellStart"/>
+            <w:r>
+              <w:rPr>
+                <w:rFonts w:hAnsiTheme="minorEastAsia"/>
+                <w:sz w:val="18"/>
+                <w:szCs w:val="18"/>
+              </w:rPr>
+              <w:t>읽어보신</w:t>
+            </w:r>
+            <w:proofErr w:type="spellEnd"/>
+            <w:r>
+              <w:rPr>
+                <w:rFonts w:hAnsiTheme="minorEastAsia"/>
+                <w:sz w:val="18"/>
+                <w:szCs w:val="18"/>
+              </w:rPr>
+              <w:t xml:space="preserve"> 후, 동의 여부를 체크, 서명하여 주시기 바랍니다.</w:t>
             </w:r>
           </w:p>
           <w:p>
@@ -7793,7 +10468,18 @@
                 <w:sz w:val="18"/>
                 <w:szCs w:val="18"/>
               </w:rPr>
-              <w:t>[수집</w:t>
+              <w:t>[</w:t>
+            </w:r>
+            <w:proofErr w:type="spellStart"/>
+            <w:r>
+              <w:rPr>
+                <w:rFonts w:hAnsiTheme="minorEastAsia"/>
+                <w:b/>
+                <w:bCs/>
+                <w:sz w:val="18"/>
+                <w:szCs w:val="18"/>
+              </w:rPr>
+              <w:t>수집</w:t>
             </w:r>
             <w:r>
               <w:rPr>
@@ -7815,6 +10501,7 @@
               </w:rPr>
               <w:t>이용하려는</w:t>
             </w:r>
+            <w:proofErr w:type="spellEnd"/>
             <w:r>
               <w:rPr>
                 <w:rFonts w:hAnsiTheme="minorEastAsia"/>
@@ -7879,7 +10566,18 @@
                 <w:sz w:val="18"/>
                 <w:szCs w:val="18"/>
               </w:rPr>
-              <w:t>[개인정보의 수집</w:t>
+              <w:t xml:space="preserve">[개인정보의 </w:t>
+            </w:r>
+            <w:proofErr w:type="spellStart"/>
+            <w:r>
+              <w:rPr>
+                <w:rFonts w:hAnsiTheme="minorEastAsia"/>
+                <w:b/>
+                <w:bCs/>
+                <w:sz w:val="18"/>
+                <w:szCs w:val="18"/>
+              </w:rPr>
+              <w:t>수집</w:t>
             </w:r>
             <w:r>
               <w:rPr>
@@ -7901,6 +10599,7 @@
               </w:rPr>
               <w:t>이용</w:t>
             </w:r>
+            <w:proofErr w:type="spellEnd"/>
             <w:r>
               <w:rPr>
                 <w:rFonts w:hAnsiTheme="minorEastAsia"/>
@@ -8230,6 +10929,7 @@
               </w:rPr>
               <w:t xml:space="preserve"> SK</w:t>
             </w:r>
+            <w:proofErr w:type="spellStart"/>
             <w:r>
               <w:rPr>
                 <w:rFonts w:hAnsiTheme="minorEastAsia" w:hint="eastAsia"/>
@@ -8238,6 +10938,7 @@
               </w:rPr>
               <w:t>일렉링크</w:t>
             </w:r>
+            <w:proofErr w:type="spellEnd"/>
             <w:r>
               <w:rPr>
                 <w:rFonts w:hAnsiTheme="minorEastAsia"/>
@@ -8532,7 +11233,16 @@
                 <w:sz w:val="18"/>
                 <w:szCs w:val="18"/>
               </w:rPr>
-              <w:t>본인은 본 “개인정보의 수집</w:t>
+              <w:t xml:space="preserve">본인은 본 “개인정보의 </w:t>
+            </w:r>
+            <w:proofErr w:type="spellStart"/>
+            <w:r>
+              <w:rPr>
+                <w:rFonts w:hAnsiTheme="minorEastAsia"/>
+                <w:sz w:val="18"/>
+                <w:szCs w:val="18"/>
+              </w:rPr>
+              <w:t>수집</w:t>
             </w:r>
             <w:r>
               <w:rPr>
@@ -8550,6 +11260,7 @@
               </w:rPr>
               <w:t>이용</w:t>
             </w:r>
+            <w:proofErr w:type="spellEnd"/>
             <w:r>
               <w:rPr>
                 <w:rFonts w:hAnsiTheme="minorEastAsia"/>
@@ -8596,8 +11307,8 @@
               </w:rPr>
               <w:t xml:space="preserve">2026년 </w:t>
             </w:r>
-            <w:bookmarkStart w:id="13" w:name="ContMonth5"/>
-            <w:bookmarkEnd w:id="13"/>
+            <w:bookmarkStart w:id="12" w:name="ContMonth5"/>
+            <w:bookmarkEnd w:id="12"/>
             <w:sdt>
               <w:sdtPr>
                 <w:rPr>
@@ -8651,8 +11362,8 @@
               </w:rPr>
               <w:t xml:space="preserve">월 </w:t>
             </w:r>
-            <w:bookmarkStart w:id="14" w:name="ContDay5"/>
-            <w:bookmarkEnd w:id="14"/>
+            <w:bookmarkStart w:id="13" w:name="ContDay5"/>
+            <w:bookmarkEnd w:id="13"/>
             <w:sdt>
               <w:sdtPr>
                 <w:rPr>
@@ -8744,8 +11455,8 @@
               </w:rPr>
               <w:t xml:space="preserve">신 청 자 : </w:t>
             </w:r>
-            <w:bookmarkStart w:id="15" w:name="CustName7"/>
-            <w:bookmarkEnd w:id="15"/>
+            <w:bookmarkStart w:id="14" w:name="CustName7"/>
+            <w:bookmarkEnd w:id="14"/>
             <w:sdt>
               <w:sdtPr>
                 <w:rPr>
@@ -8895,15 +11606,15 @@
         <w:tblLook w:val="04A0" w:firstRow="1" w:lastRow="0" w:firstColumn="1" w:lastColumn="0" w:noHBand="0" w:noVBand="1"/>
       </w:tblPr>
       <w:tblGrid>
-        <w:gridCol w:w="279"/>
-        <w:gridCol w:w="1639"/>
+        <w:gridCol w:w="278"/>
         <w:gridCol w:w="1638"/>
         <w:gridCol w:w="1638"/>
-        <w:gridCol w:w="816"/>
-        <w:gridCol w:w="822"/>
+        <w:gridCol w:w="1643"/>
+        <w:gridCol w:w="812"/>
+        <w:gridCol w:w="827"/>
         <w:gridCol w:w="1638"/>
         <w:gridCol w:w="1638"/>
-        <w:gridCol w:w="328"/>
+        <w:gridCol w:w="324"/>
       </w:tblGrid>
       <w:tr>
         <w:trPr>
@@ -8964,8 +11675,8 @@
             </w:r>
           </w:p>
         </w:tc>
-        <w:bookmarkStart w:id="16" w:name="CustName6"/>
-        <w:bookmarkEnd w:id="16"/>
+        <w:bookmarkStart w:id="15" w:name="CustName6"/>
+        <w:bookmarkEnd w:id="15"/>
         <w:tc>
           <w:tcPr>
             <w:tcW w:w="1570" w:type="pct"/>
@@ -9032,8 +11743,8 @@
             </w:r>
           </w:p>
         </w:tc>
-        <w:bookmarkStart w:id="17" w:name="CustTel3" w:displacedByCustomXml="next"/>
-        <w:bookmarkEnd w:id="17" w:displacedByCustomXml="next"/>
+        <w:bookmarkStart w:id="16" w:name="CustTel3" w:displacedByCustomXml="next"/>
+        <w:bookmarkEnd w:id="16" w:displacedByCustomXml="next"/>
         <w:sdt>
           <w:sdtPr>
             <w:rPr>
@@ -9116,8 +11827,8 @@
             </w:r>
           </w:p>
         </w:tc>
-        <w:bookmarkStart w:id="18" w:name="CustAddr3" w:displacedByCustomXml="next"/>
-        <w:bookmarkEnd w:id="18" w:displacedByCustomXml="next"/>
+        <w:bookmarkStart w:id="17" w:name="CustAddr3" w:displacedByCustomXml="next"/>
+        <w:bookmarkEnd w:id="17" w:displacedByCustomXml="next"/>
         <w:sdt>
           <w:sdtPr>
             <w:rPr>
@@ -9252,14 +11963,32 @@
             <w:pPr>
               <w:jc w:val="center"/>
               <w:rPr>
+                <w:rFonts w:asciiTheme="majorHAnsi" w:eastAsiaTheme="majorHAnsi" w:hAnsiTheme="majorHAnsi"/>
+              </w:rPr>
+            </w:pPr>
+            <w:r>
+              <w:rPr>
                 <w:rFonts w:asciiTheme="majorHAnsi" w:eastAsiaTheme="majorHAnsi" w:hAnsiTheme="majorHAnsi" w:hint="eastAsia"/>
               </w:rPr>
-            </w:pPr>
+              <w:t xml:space="preserve">7kW </w:t>
+            </w:r>
             <w:r>
               <w:rPr>
                 <w:rFonts w:asciiTheme="majorHAnsi" w:eastAsiaTheme="majorHAnsi" w:hAnsiTheme="majorHAnsi" w:hint="eastAsia"/>
               </w:rPr>
-              <w:t>7kW 이상 ~ 11kW 미만</w:t>
+              <w:t>이상</w:t>
+            </w:r>
+            <w:r>
+              <w:rPr>
+                <w:rFonts w:asciiTheme="majorHAnsi" w:eastAsiaTheme="majorHAnsi" w:hAnsiTheme="majorHAnsi" w:hint="eastAsia"/>
+              </w:rPr>
+              <w:t xml:space="preserve"> ~ 11kW </w:t>
+            </w:r>
+            <w:r>
+              <w:rPr>
+                <w:rFonts w:asciiTheme="majorHAnsi" w:eastAsiaTheme="majorHAnsi" w:hAnsiTheme="majorHAnsi" w:hint="eastAsia"/>
+              </w:rPr>
+              <w:t>미만</w:t>
             </w:r>
           </w:p>
         </w:tc>
@@ -9297,9 +12026,6 @@
                   <w:rFonts w:hint="eastAsia"/>
                 </w:rPr>
                 <w:id w:val="-1335375053"/>
-                <w:placeholder>
-                  <w:docPart w:val="1CAD5D37B74AA74D9D39C4ED7B27E881"/>
-                </w:placeholder>
                 <w:showingPlcHdr/>
                 <w:text/>
               </w:sdtPr>
@@ -9341,7 +12067,13 @@
               <w:rPr>
                 <w:rFonts w:asciiTheme="majorHAnsi" w:eastAsiaTheme="majorHAnsi" w:hAnsiTheme="majorHAnsi"/>
               </w:rPr>
-              <w:t>)기</w:t>
+              <w:t>)</w:t>
+            </w:r>
+            <w:r>
+              <w:rPr>
+                <w:rFonts w:asciiTheme="majorHAnsi" w:eastAsiaTheme="majorHAnsi" w:hAnsiTheme="majorHAnsi"/>
+              </w:rPr>
+              <w:t>기</w:t>
             </w:r>
           </w:p>
         </w:tc>
@@ -9362,14 +12094,32 @@
             <w:pPr>
               <w:jc w:val="center"/>
               <w:rPr>
+                <w:rFonts w:asciiTheme="majorHAnsi" w:eastAsiaTheme="majorHAnsi" w:hAnsiTheme="majorHAnsi"/>
+              </w:rPr>
+            </w:pPr>
+            <w:r>
+              <w:rPr>
                 <w:rFonts w:asciiTheme="majorHAnsi" w:eastAsiaTheme="majorHAnsi" w:hAnsiTheme="majorHAnsi" w:hint="eastAsia"/>
               </w:rPr>
-            </w:pPr>
+              <w:t xml:space="preserve">11kW </w:t>
+            </w:r>
             <w:r>
               <w:rPr>
                 <w:rFonts w:asciiTheme="majorHAnsi" w:eastAsiaTheme="majorHAnsi" w:hAnsiTheme="majorHAnsi" w:hint="eastAsia"/>
               </w:rPr>
-              <w:t>11kW 이상 ~ 30kW 미만</w:t>
+              <w:t>이상</w:t>
+            </w:r>
+            <w:r>
+              <w:rPr>
+                <w:rFonts w:asciiTheme="majorHAnsi" w:eastAsiaTheme="majorHAnsi" w:hAnsiTheme="majorHAnsi" w:hint="eastAsia"/>
+              </w:rPr>
+              <w:t xml:space="preserve"> ~ 30kW </w:t>
+            </w:r>
+            <w:r>
+              <w:rPr>
+                <w:rFonts w:asciiTheme="majorHAnsi" w:eastAsiaTheme="majorHAnsi" w:hAnsiTheme="majorHAnsi" w:hint="eastAsia"/>
+              </w:rPr>
+              <w:t>미만</w:t>
             </w:r>
           </w:p>
         </w:tc>
@@ -9407,9 +12157,6 @@
                   <w:rFonts w:hint="eastAsia"/>
                 </w:rPr>
                 <w:id w:val="313466420"/>
-                <w:placeholder>
-                  <w:docPart w:val="ED93C1928DBA2B4AB78D22611A942B6D"/>
-                </w:placeholder>
                 <w:showingPlcHdr/>
                 <w:text/>
               </w:sdtPr>
@@ -9451,7 +12198,13 @@
               <w:rPr>
                 <w:rFonts w:asciiTheme="majorHAnsi" w:eastAsiaTheme="majorHAnsi" w:hAnsiTheme="majorHAnsi"/>
               </w:rPr>
-              <w:t>)기</w:t>
+              <w:t>)</w:t>
+            </w:r>
+            <w:r>
+              <w:rPr>
+                <w:rFonts w:asciiTheme="majorHAnsi" w:eastAsiaTheme="majorHAnsi" w:hAnsiTheme="majorHAnsi"/>
+              </w:rPr>
+              <w:t>기</w:t>
             </w:r>
           </w:p>
         </w:tc>
@@ -9472,14 +12225,26 @@
             <w:pPr>
               <w:jc w:val="center"/>
               <w:rPr>
+                <w:rFonts w:asciiTheme="majorHAnsi" w:eastAsiaTheme="majorHAnsi" w:hAnsiTheme="majorHAnsi"/>
+              </w:rPr>
+            </w:pPr>
+            <w:r>
+              <w:rPr>
                 <w:rFonts w:asciiTheme="majorHAnsi" w:eastAsiaTheme="majorHAnsi" w:hAnsiTheme="majorHAnsi" w:hint="eastAsia"/>
               </w:rPr>
-            </w:pPr>
+              <w:t>전력분배형</w:t>
+            </w:r>
             <w:r>
               <w:rPr>
                 <w:rFonts w:asciiTheme="majorHAnsi" w:eastAsiaTheme="majorHAnsi" w:hAnsiTheme="majorHAnsi" w:hint="eastAsia"/>
               </w:rPr>
-              <w:t>전력분배형 충전기</w:t>
+              <w:t xml:space="preserve"> </w:t>
+            </w:r>
+            <w:r>
+              <w:rPr>
+                <w:rFonts w:asciiTheme="majorHAnsi" w:eastAsiaTheme="majorHAnsi" w:hAnsiTheme="majorHAnsi" w:hint="eastAsia"/>
+              </w:rPr>
+              <w:t>충전기</w:t>
             </w:r>
           </w:p>
         </w:tc>
@@ -9495,14 +12260,44 @@
             <w:pPr>
               <w:jc w:val="center"/>
               <w:rPr>
-                <w:rFonts w:asciiTheme="majorHAnsi" w:eastAsiaTheme="majorHAnsi" w:hAnsiTheme="majorHAnsi" w:hint="eastAsia"/>
-              </w:rPr>
-            </w:pPr>
-            <w:r>
-              <w:rPr>
                 <w:rFonts w:asciiTheme="majorHAnsi" w:eastAsiaTheme="majorHAnsi" w:hAnsiTheme="majorHAnsi"/>
               </w:rPr>
-              <w:t>(    )kW  (    )기  케이블 (    )개</w:t>
+            </w:pPr>
+            <w:r>
+              <w:rPr>
+                <w:rFonts w:asciiTheme="majorHAnsi" w:eastAsiaTheme="majorHAnsi" w:hAnsiTheme="majorHAnsi"/>
+              </w:rPr>
+              <w:t>(    )kW  (    )</w:t>
+            </w:r>
+            <w:r>
+              <w:rPr>
+                <w:rFonts w:asciiTheme="majorHAnsi" w:eastAsiaTheme="majorHAnsi" w:hAnsiTheme="majorHAnsi"/>
+              </w:rPr>
+              <w:t>기</w:t>
+            </w:r>
+            <w:r>
+              <w:rPr>
+                <w:rFonts w:asciiTheme="majorHAnsi" w:eastAsiaTheme="majorHAnsi" w:hAnsiTheme="majorHAnsi"/>
+              </w:rPr>
+              <w:t xml:space="preserve">  </w:t>
+            </w:r>
+            <w:r>
+              <w:rPr>
+                <w:rFonts w:asciiTheme="majorHAnsi" w:eastAsiaTheme="majorHAnsi" w:hAnsiTheme="majorHAnsi"/>
+              </w:rPr>
+              <w:t>케이블</w:t>
+            </w:r>
+            <w:r>
+              <w:rPr>
+                <w:rFonts w:asciiTheme="majorHAnsi" w:eastAsiaTheme="majorHAnsi" w:hAnsiTheme="majorHAnsi"/>
+              </w:rPr>
+              <w:t xml:space="preserve"> (    )</w:t>
+            </w:r>
+            <w:r>
+              <w:rPr>
+                <w:rFonts w:asciiTheme="majorHAnsi" w:eastAsiaTheme="majorHAnsi" w:hAnsiTheme="majorHAnsi"/>
+              </w:rPr>
+              <w:t>개</w:t>
             </w:r>
           </w:p>
         </w:tc>
@@ -9563,8 +12358,8 @@
             </w:r>
           </w:p>
         </w:tc>
-        <w:bookmarkStart w:id="19" w:name="Parkinglot2"/>
-        <w:bookmarkEnd w:id="19"/>
+        <w:bookmarkStart w:id="18" w:name="Parkinglot2"/>
+        <w:bookmarkEnd w:id="18"/>
         <w:tc>
           <w:tcPr>
             <w:tcW w:w="785" w:type="pct"/>
@@ -9860,8 +12655,8 @@
               </w:rPr>
               <w:t xml:space="preserve"> 기타 ( </w:t>
             </w:r>
-            <w:bookmarkStart w:id="20" w:name="Type33txt"/>
-            <w:bookmarkEnd w:id="20"/>
+            <w:bookmarkStart w:id="19" w:name="Type33txt"/>
+            <w:bookmarkEnd w:id="19"/>
             <w:sdt>
               <w:sdtPr>
                 <w:rPr>
@@ -9984,8 +12779,8 @@
             </w:r>
           </w:p>
         </w:tc>
-        <w:bookmarkStart w:id="21" w:name="InstallAddr3" w:displacedByCustomXml="next"/>
-        <w:bookmarkEnd w:id="21" w:displacedByCustomXml="next"/>
+        <w:bookmarkStart w:id="20" w:name="InstallAddr3" w:displacedByCustomXml="next"/>
+        <w:bookmarkEnd w:id="20" w:displacedByCustomXml="next"/>
         <w:sdt>
           <w:sdtPr>
             <w:rPr>
@@ -10071,7 +12866,21 @@
               <w:rPr>
                 <w:rFonts w:asciiTheme="majorHAnsi" w:eastAsiaTheme="majorHAnsi" w:hAnsiTheme="majorHAnsi" w:hint="eastAsia"/>
               </w:rPr>
-              <w:t>설치환경(확인 후 해당란에 체크)</w:t>
+              <w:t xml:space="preserve">설치환경(확인 후 </w:t>
+            </w:r>
+            <w:proofErr w:type="spellStart"/>
+            <w:r>
+              <w:rPr>
+                <w:rFonts w:asciiTheme="majorHAnsi" w:eastAsiaTheme="majorHAnsi" w:hAnsiTheme="majorHAnsi" w:hint="eastAsia"/>
+              </w:rPr>
+              <w:t>해당란에</w:t>
+            </w:r>
+            <w:proofErr w:type="spellEnd"/>
+            <w:r>
+              <w:rPr>
+                <w:rFonts w:asciiTheme="majorHAnsi" w:eastAsiaTheme="majorHAnsi" w:hAnsiTheme="majorHAnsi" w:hint="eastAsia"/>
+              </w:rPr>
+              <w:t xml:space="preserve"> 체크)</w:t>
             </w:r>
           </w:p>
         </w:tc>
@@ -10155,12 +12964,14 @@
                 <w:rFonts w:asciiTheme="majorHAnsi" w:eastAsiaTheme="majorHAnsi" w:hAnsiTheme="majorHAnsi"/>
               </w:rPr>
             </w:pPr>
+            <w:proofErr w:type="spellStart"/>
             <w:r>
               <w:rPr>
                 <w:rFonts w:asciiTheme="majorHAnsi" w:eastAsiaTheme="majorHAnsi" w:hAnsiTheme="majorHAnsi" w:hint="eastAsia"/>
               </w:rPr>
               <w:t>소유주과의관계</w:t>
             </w:r>
+            <w:proofErr w:type="spellEnd"/>
           </w:p>
         </w:tc>
         <w:tc>
@@ -10174,12 +12985,14 @@
                 <w:rFonts w:asciiTheme="majorHAnsi" w:eastAsiaTheme="majorHAnsi" w:hAnsiTheme="majorHAnsi"/>
               </w:rPr>
             </w:pPr>
+            <w:proofErr w:type="spellStart"/>
             <w:r>
               <w:rPr>
                 <w:rFonts w:asciiTheme="majorHAnsi" w:eastAsiaTheme="majorHAnsi" w:hAnsiTheme="majorHAnsi" w:hint="eastAsia"/>
               </w:rPr>
               <w:t>전력인입</w:t>
             </w:r>
+            <w:proofErr w:type="spellEnd"/>
           </w:p>
         </w:tc>
         <w:tc>
@@ -10460,12 +13273,14 @@
                 </w:r>
               </w:sdtContent>
             </w:sdt>
+            <w:proofErr w:type="spellStart"/>
             <w:r>
               <w:rPr>
                 <w:rFonts w:asciiTheme="majorHAnsi" w:eastAsiaTheme="majorHAnsi" w:hAnsiTheme="majorHAnsi" w:hint="eastAsia"/>
               </w:rPr>
               <w:t>벽부형</w:t>
             </w:r>
+            <w:proofErr w:type="spellEnd"/>
           </w:p>
         </w:tc>
         <w:tc>
@@ -10692,12 +13507,14 @@
                 </w:r>
               </w:sdtContent>
             </w:sdt>
+            <w:proofErr w:type="spellStart"/>
             <w:r>
               <w:rPr>
                 <w:rFonts w:asciiTheme="majorHAnsi" w:eastAsiaTheme="majorHAnsi" w:hAnsiTheme="majorHAnsi" w:hint="eastAsia"/>
               </w:rPr>
               <w:t>한전불입</w:t>
             </w:r>
+            <w:proofErr w:type="spellEnd"/>
           </w:p>
         </w:tc>
         <w:tc>
@@ -11512,11 +14329,19 @@
                 <w:rFonts w:asciiTheme="majorHAnsi" w:eastAsiaTheme="majorHAnsi" w:hAnsiTheme="majorHAnsi"/>
               </w:rPr>
             </w:pPr>
+            <w:proofErr w:type="spellStart"/>
             <w:r>
               <w:rPr>
                 <w:rFonts w:asciiTheme="majorHAnsi" w:eastAsiaTheme="majorHAnsi" w:hAnsiTheme="majorHAnsi" w:hint="eastAsia"/>
               </w:rPr>
-              <w:t>고압시 변압기 용량 확인</w:t>
+              <w:t>고압시</w:t>
+            </w:r>
+            <w:proofErr w:type="spellEnd"/>
+            <w:r>
+              <w:rPr>
+                <w:rFonts w:asciiTheme="majorHAnsi" w:eastAsiaTheme="majorHAnsi" w:hAnsiTheme="majorHAnsi" w:hint="eastAsia"/>
+              </w:rPr>
+              <w:t xml:space="preserve"> 변압기 용량 확인</w:t>
             </w:r>
           </w:p>
         </w:tc>
@@ -11740,14 +14565,6 @@
               </w:rPr>
               <w:t>6. 중복설치 여부</w:t>
             </w:r>
-            <w:r>
-              <w:rPr>
-                <w:rFonts w:asciiTheme="majorHAnsi" w:eastAsiaTheme="majorHAnsi" w:hAnsiTheme="majorHAnsi"/>
-                <w:b/>
-                <w:bCs/>
-              </w:rPr>
-              <w:t/>
-            </w:r>
           </w:p>
         </w:tc>
       </w:tr>
@@ -11780,11 +14597,19 @@
             <w:pPr>
               <w:jc w:val="center"/>
             </w:pPr>
+            <w:proofErr w:type="spellStart"/>
             <w:r>
               <w:rPr>
                 <w:rFonts w:hint="eastAsia"/>
               </w:rPr>
-              <w:t>운영중 또는</w:t>
+              <w:t>운영중</w:t>
+            </w:r>
+            <w:proofErr w:type="spellEnd"/>
+            <w:r>
+              <w:rPr>
+                <w:rFonts w:hint="eastAsia"/>
+              </w:rPr>
+              <w:t xml:space="preserve"> 또는</w:t>
             </w:r>
           </w:p>
           <w:p>
@@ -11904,8 +14729,8 @@
               </w:rPr>
               <w:t xml:space="preserve"> </w:t>
             </w:r>
-            <w:bookmarkStart w:id="22" w:name="FastQty"/>
-            <w:bookmarkEnd w:id="22"/>
+            <w:bookmarkStart w:id="21" w:name="FastQty"/>
+            <w:bookmarkEnd w:id="21"/>
             <w:r>
               <w:rPr>
                 <w:rFonts w:asciiTheme="majorHAnsi" w:eastAsiaTheme="majorHAnsi" w:hAnsiTheme="majorHAnsi"/>
@@ -11963,11 +14788,19 @@
                 </w:r>
               </w:sdtContent>
             </w:sdt>
+            <w:proofErr w:type="spellStart"/>
             <w:r>
               <w:rPr>
                 <w:rFonts w:asciiTheme="majorHAnsi" w:eastAsiaTheme="majorHAnsi" w:hAnsiTheme="majorHAnsi" w:hint="eastAsia"/>
               </w:rPr>
-              <w:t>완속충전기(</w:t>
+              <w:t>완속충전기</w:t>
+            </w:r>
+            <w:proofErr w:type="spellEnd"/>
+            <w:r>
+              <w:rPr>
+                <w:rFonts w:asciiTheme="majorHAnsi" w:eastAsiaTheme="majorHAnsi" w:hAnsiTheme="majorHAnsi" w:hint="eastAsia"/>
+              </w:rPr>
+              <w:t>(</w:t>
             </w:r>
             <w:r>
               <w:rPr>
@@ -12025,8 +14858,8 @@
               </w:rPr>
               <w:t xml:space="preserve"> </w:t>
             </w:r>
-            <w:bookmarkStart w:id="23" w:name="SlowQty"/>
-            <w:bookmarkEnd w:id="23"/>
+            <w:bookmarkStart w:id="22" w:name="SlowQty"/>
+            <w:bookmarkEnd w:id="22"/>
             <w:r>
               <w:rPr>
                 <w:rFonts w:asciiTheme="majorHAnsi" w:eastAsiaTheme="majorHAnsi" w:hAnsiTheme="majorHAnsi"/>
@@ -12245,11 +15078,19 @@
                 </w:r>
               </w:sdtContent>
             </w:sdt>
+            <w:proofErr w:type="spellStart"/>
             <w:r>
               <w:rPr>
                 <w:rFonts w:asciiTheme="majorHAnsi" w:eastAsiaTheme="majorHAnsi" w:hAnsiTheme="majorHAnsi" w:hint="eastAsia"/>
               </w:rPr>
-              <w:t>과금형콘센트(</w:t>
+              <w:t>과금형콘센트</w:t>
+            </w:r>
+            <w:proofErr w:type="spellEnd"/>
+            <w:r>
+              <w:rPr>
+                <w:rFonts w:asciiTheme="majorHAnsi" w:eastAsiaTheme="majorHAnsi" w:hAnsiTheme="majorHAnsi" w:hint="eastAsia"/>
+              </w:rPr>
+              <w:t>(</w:t>
             </w:r>
             <w:r>
               <w:rPr>
@@ -12307,8 +15148,8 @@
               </w:rPr>
               <w:t xml:space="preserve"> </w:t>
             </w:r>
-            <w:bookmarkStart w:id="24" w:name="PlugQty"/>
-            <w:bookmarkEnd w:id="24"/>
+            <w:bookmarkStart w:id="23" w:name="PlugQty"/>
+            <w:bookmarkEnd w:id="23"/>
             <w:r>
               <w:rPr>
                 <w:rFonts w:asciiTheme="majorHAnsi" w:eastAsiaTheme="majorHAnsi" w:hAnsiTheme="majorHAnsi"/>
@@ -12568,8 +15409,8 @@
             </w:r>
           </w:p>
         </w:tc>
-        <w:bookmarkStart w:id="25" w:name="SurveyComp"/>
-        <w:bookmarkEnd w:id="25"/>
+        <w:bookmarkStart w:id="24" w:name="SurveyComp"/>
+        <w:bookmarkEnd w:id="24"/>
         <w:tc>
           <w:tcPr>
             <w:tcW w:w="1570" w:type="pct"/>
@@ -12645,8 +15486,8 @@
             </w:r>
           </w:p>
         </w:tc>
-        <w:bookmarkStart w:id="26" w:name="SurveyTel"/>
-        <w:bookmarkEnd w:id="26"/>
+        <w:bookmarkStart w:id="25" w:name="SurveyTel"/>
+        <w:bookmarkEnd w:id="25"/>
         <w:tc>
           <w:tcPr>
             <w:tcW w:w="1570" w:type="pct"/>
@@ -12779,7 +15620,7 @@
             </w:r>
           </w:p>
         </w:tc>
-        <w:bookmarkStart w:id="27" w:name="SurveyName"/>
+        <w:bookmarkStart w:id="26" w:name="SurveyName"/>
         <w:tc>
           <w:tcPr>
             <w:tcW w:w="1570" w:type="pct"/>
@@ -12835,7 +15676,7 @@
             <w:r>
               <w:t xml:space="preserve"> (인)</w:t>
             </w:r>
-            <w:bookmarkEnd w:id="27"/>
+            <w:bookmarkEnd w:id="26"/>
           </w:p>
         </w:tc>
         <w:tc>
@@ -12858,8 +15699,8 @@
             </w:r>
           </w:p>
         </w:tc>
-        <w:bookmarkStart w:id="28" w:name="SurveyDate"/>
-        <w:bookmarkEnd w:id="28"/>
+        <w:bookmarkStart w:id="27" w:name="SurveyDate"/>
+        <w:bookmarkEnd w:id="27"/>
         <w:tc>
           <w:tcPr>
             <w:tcW w:w="1570" w:type="pct"/>
@@ -12973,7 +15814,7 @@
         <w:spacing w:line="300" w:lineRule="auto"/>
         <w:jc w:val="both"/>
         <w:rPr>
-          <w:rFonts w:ascii="맑은 고딕" w:eastAsia="맑은 고딕" w:hAnsi="맑은 고딕" w:cs="Times New Roman" w:hint="eastAsia"/>
+          <w:rFonts w:ascii="맑은 고딕" w:eastAsia="맑은 고딕" w:hAnsi="맑은 고딕" w:cs="Times New Roman"/>
           <w:b/>
           <w:bCs/>
           <w:sz w:val="24"/>
@@ -16593,44 +19434,6 @@
     </w:docPart>
     <w:docPart>
       <w:docPartPr>
-        <w:name w:val="D9B70E6420DE274D830E76B5B89ED1B1"/>
-        <w:category>
-          <w:name w:val="일반"/>
-          <w:gallery w:val="placeholder"/>
-        </w:category>
-        <w:types>
-          <w:type w:val="bbPlcHdr"/>
-        </w:types>
-        <w:behaviors>
-          <w:behavior w:val="content"/>
-        </w:behaviors>
-        <w:guid w:val="{7EE83726-6BE8-B141-9E8B-2E2C70E6ABD2}"/>
-      </w:docPartPr>
-      <w:docPartBody>
-        <w:p>
-          <w:pPr>
-            <w:pStyle w:val="D9B70E6420DE274D830E76B5B89ED1B1"/>
-          </w:pPr>
-          <w:r>
-            <w:rPr>
-              <w:rStyle w:val="a3"/>
-              <w:rFonts w:hint="eastAsia"/>
-              <w:b/>
-              <w:bCs/>
-              <w:i/>
-              <w:iCs/>
-              <w:color w:val="A6A6A6" w:themeColor="background1" w:themeShade="A6"/>
-              <w:sz w:val="20"/>
-              <w:szCs w:val="20"/>
-              <w:u w:val="single"/>
-            </w:rPr>
-            <w:t xml:space="preserve">OO </w:t>
-          </w:r>
-        </w:p>
-      </w:docPartBody>
-    </w:docPart>
-    <w:docPart>
-      <w:docPartPr>
         <w:name w:val="9C46EF1C2E9579469100A2AF716DC051"/>
         <w:category>
           <w:name w:val="일반"/>
@@ -17366,12 +20169,14 @@
   </w:compat>
   <w:rsids>
     <w:rsidRoot w:val="00DB3B88"/>
+    <w:rsid w:val="00406467"/>
     <w:rsid w:val="007608B3"/>
     <w:rsid w:val="00986A8F"/>
     <w:rsid w:val="009D18C7"/>
     <w:rsid w:val="00B142A2"/>
     <w:rsid w:val="00CF3F5C"/>
     <w:rsid w:val="00D10C4E"/>
+    <w:rsid w:val="00D3455F"/>
     <w:rsid w:val="00DB3B88"/>
   </w:rsids>
   <m:mathPr>

</xml_diff>

<commit_message>
SK 충전기 종류를 CEC-3161AR · BAS1007.D1.1 순으로 교체
CEC-2333HR1 → CEC-3161AR 로 바뀌고 표기 순서도 CEC가 먼저 온다.
기본 체크(■)는 BAS1007.D1.1 그대로 유지.

  ■ BAS1007.D1.1(스마트완속충전기),      □ CEC-3161AR(스마트완속충전기),
  □ CEC-2333HR1(스마트완속충전기)    →   ■ BAS1007.D1.1(스마트완속충전기)

- 일반 · 투자 두 템플릿 모두 적용. 충전기 종류는 조항이 아니라 상단 계약
  정보 표이고 두 계약 형태가 같은 기기 라인업을 쓴다. 투자형만 단종 모델을
  들고 있으면 잠재 오류가 되므로 함께 바꿨다
- 이 체크박스는 코드가 채우지 않고 템플릿에 고정되어 있다
  (lib/schema-sk.ts:46 「BAS1007.D1.1(항상 체크)은 템플릿에서 ■로 영구 수정됨」)
  이므로 스키마 · 폼 변경은 필요 없다
- 두 단락의 첫 런만 맞바꿨다. 두 런의 rPr이 동일함을 먼저 확인해 서식
  드리프트가 없도록 했다

검증: 두 파일 모두 document.xml만 변경, 치환 역산으로 원본과 바이트 동일,
zip 무결성 · 전 XML 파싱 통과, ■/□ 개수 불변(일반 10/5 · 투자 6/3),
CEC-2333HR1 잔존 0.

Co-Authored-By: Claude Opus 5 (1M context) <noreply@anthropic.com>
</commit_message>
<xml_diff>
--- a/public/sk/template.docx
+++ b/public/sk/template.docx
@@ -1572,7 +1572,7 @@
                 <w:szCs w:val="17"/>
                 <w14:ligatures w14:val="none"/>
               </w:rPr>
-              <w:t>■ BAS1007.D1.1(</w:t>
+              <w:t>□ CEC-3161AR(</w:t>
             </w:r>
             <w:proofErr w:type="spellStart"/>
             <w:r>
@@ -1624,7 +1624,7 @@
                 <w:szCs w:val="17"/>
                 <w14:ligatures w14:val="none"/>
               </w:rPr>
-              <w:t>□ CEC-2333HR1(</w:t>
+              <w:t>■ BAS1007.D1.1(</w:t>
             </w:r>
             <w:proofErr w:type="spellStart"/>
             <w:r>

</xml_diff>